<commit_message>
load the previous commit files into docs/
</commit_message>
<xml_diff>
--- a/docs/Omid Reza Heidari.docx
+++ b/docs/Omid Reza Heidari.docx
@@ -250,7 +250,7 @@
           <w:sz w:val="20"/>
           <w:szCs w:val="20"/>
         </w:rPr>
-        <w:t xml:space="preserve">Transferred </w:t>
+        <w:t xml:space="preserve">Transfer </w:t>
       </w:r>
       <w:r>
         <w:rPr>
@@ -458,21 +458,94 @@
       <w:r>
         <w:rPr>
           <w:rFonts w:ascii="Roboto" w:hAnsi="Roboto"/>
+          <w:b/>
+          <w:bCs/>
+          <w:sz w:val="24"/>
+          <w:szCs w:val="24"/>
+        </w:rPr>
+        <w:tab/>
+      </w:r>
+      <w:r>
+        <w:rPr>
+          <w:rFonts w:ascii="Roboto" w:hAnsi="Roboto"/>
+        </w:rPr>
+        <w:t>Faculty of Computer,</w:t>
+      </w:r>
+      <w:r>
+        <w:rPr>
+          <w:rFonts w:ascii="Roboto" w:hAnsi="Roboto"/>
+        </w:rPr>
+        <w:t xml:space="preserve"> </w:t>
+      </w:r>
+      <w:r>
+        <w:rPr>
+          <w:rFonts w:ascii="Roboto" w:hAnsi="Roboto"/>
+        </w:rPr>
+        <w:t>University</w:t>
+      </w:r>
+      <w:r>
+        <w:rPr>
+          <w:rFonts w:ascii="Roboto" w:hAnsi="Roboto"/>
+        </w:rPr>
+        <w:t xml:space="preserve"> of Zanjan</w:t>
+      </w:r>
+      <w:r>
+        <w:rPr>
+          <w:rFonts w:ascii="Roboto" w:hAnsi="Roboto"/>
+        </w:rPr>
+        <w:t>,</w:t>
+      </w:r>
+      <w:r>
+        <w:rPr>
+          <w:rFonts w:ascii="Roboto" w:hAnsi="Roboto"/>
+        </w:rPr>
+        <w:t xml:space="preserve"> </w:t>
+      </w:r>
+      <w:r>
+        <w:rPr>
+          <w:rFonts w:ascii="Roboto" w:hAnsi="Roboto"/>
+        </w:rPr>
+        <w:t>Zanjan,</w:t>
+      </w:r>
+      <w:r>
+        <w:rPr>
+          <w:rFonts w:ascii="Roboto" w:hAnsi="Roboto"/>
+        </w:rPr>
+        <w:t xml:space="preserve"> </w:t>
+      </w:r>
+      <w:r>
+        <w:rPr>
+          <w:rFonts w:ascii="Roboto" w:hAnsi="Roboto"/>
+        </w:rPr>
+        <w:t>Iran</w:t>
+      </w:r>
+    </w:p>
+    <w:p>
+      <w:pPr>
+        <w:spacing w:line="240" w:lineRule="auto"/>
+        <w:ind w:left="720"/>
+        <w:rPr>
+          <w:rFonts w:ascii="Roboto" w:hAnsi="Roboto"/>
+        </w:rPr>
+      </w:pPr>
+      <w:r>
+        <w:rPr>
+          <w:rFonts w:ascii="Roboto" w:hAnsi="Roboto"/>
           <w:noProof/>
           <w:color w:val="BFBFBF" w:themeColor="background1" w:themeShade="BF"/>
         </w:rPr>
         <mc:AlternateContent>
           <mc:Choice Requires="wps">
             <w:drawing>
-              <wp:anchor distT="0" distB="0" distL="114300" distR="114300" simplePos="0" relativeHeight="251659264" behindDoc="0" locked="0" layoutInCell="1" allowOverlap="1" wp14:anchorId="1CB9887D" wp14:editId="44F08529">
+              <wp:anchor distT="0" distB="0" distL="114300" distR="114300" simplePos="0" relativeHeight="251659264" behindDoc="0" locked="0" layoutInCell="1" allowOverlap="1" wp14:anchorId="1CB9887D" wp14:editId="6111018F">
                 <wp:simplePos x="0" y="0"/>
                 <wp:positionH relativeFrom="column">
                   <wp:posOffset>-342900</wp:posOffset>
                 </wp:positionH>
                 <wp:positionV relativeFrom="paragraph">
-                  <wp:posOffset>309392</wp:posOffset>
+                  <wp:posOffset>88265</wp:posOffset>
                 </wp:positionV>
-                <wp:extent cx="6638365" cy="0"/>
+                <wp:extent cx="6638290" cy="0"/>
                 <wp:effectExtent l="0" t="0" r="0" b="0"/>
                 <wp:wrapNone/>
                 <wp:docPr id="1" name="Straight Connector 1"/>
@@ -484,7 +557,7 @@
                       <wps:spPr>
                         <a:xfrm flipV="1">
                           <a:off x="0" y="0"/>
-                          <a:ext cx="6638365" cy="0"/>
+                          <a:ext cx="6638290" cy="0"/>
                         </a:xfrm>
                         <a:prstGeom prst="line">
                           <a:avLst/>
@@ -519,86 +592,13 @@
           </mc:Choice>
           <mc:Fallback>
             <w:pict>
-              <v:line w14:anchorId="28898DA1" id="Straight Connector 1" o:spid="_x0000_s1026" style="position:absolute;flip:y;z-index:251659264;visibility:visible;mso-wrap-style:square;mso-width-percent:0;mso-height-percent:0;mso-wrap-distance-left:9pt;mso-wrap-distance-top:0;mso-wrap-distance-right:9pt;mso-wrap-distance-bottom:0;mso-position-horizontal:absolute;mso-position-horizontal-relative:text;mso-position-vertical:absolute;mso-position-vertical-relative:text;mso-width-percent:0;mso-height-percent:0;mso-width-relative:margin;mso-height-relative:margin" from="-27pt,24.35pt" to="495.7pt,24.35pt" o:gfxdata="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" strokecolor="black [3200]" strokeweight=".5pt">
+              <v:line w14:anchorId="0725443C" id="Straight Connector 1" o:spid="_x0000_s1026" style="position:absolute;flip:y;z-index:251659264;visibility:visible;mso-wrap-style:square;mso-width-percent:0;mso-height-percent:0;mso-wrap-distance-left:9pt;mso-wrap-distance-top:0;mso-wrap-distance-right:9pt;mso-wrap-distance-bottom:0;mso-position-horizontal:absolute;mso-position-horizontal-relative:text;mso-position-vertical:absolute;mso-position-vertical-relative:text;mso-width-percent:0;mso-height-percent:0;mso-width-relative:margin;mso-height-relative:margin" from="-27pt,6.95pt" to="495.7pt,6.95pt" o:gfxdata="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" strokecolor="black [3200]" strokeweight=".5pt">
                 <v:stroke joinstyle="miter"/>
               </v:line>
             </w:pict>
           </mc:Fallback>
         </mc:AlternateContent>
       </w:r>
-      <w:r>
-        <w:rPr>
-          <w:rFonts w:ascii="Roboto" w:hAnsi="Roboto"/>
-          <w:b/>
-          <w:bCs/>
-          <w:sz w:val="24"/>
-          <w:szCs w:val="24"/>
-        </w:rPr>
-        <w:tab/>
-      </w:r>
-      <w:r>
-        <w:rPr>
-          <w:rFonts w:ascii="Roboto" w:hAnsi="Roboto"/>
-        </w:rPr>
-        <w:t>Faculty of Computer,</w:t>
-      </w:r>
-      <w:r>
-        <w:rPr>
-          <w:rFonts w:ascii="Roboto" w:hAnsi="Roboto"/>
-        </w:rPr>
-        <w:t xml:space="preserve"> </w:t>
-      </w:r>
-      <w:r>
-        <w:rPr>
-          <w:rFonts w:ascii="Roboto" w:hAnsi="Roboto"/>
-        </w:rPr>
-        <w:t>University</w:t>
-      </w:r>
-      <w:r>
-        <w:rPr>
-          <w:rFonts w:ascii="Roboto" w:hAnsi="Roboto"/>
-        </w:rPr>
-        <w:t xml:space="preserve"> of Zanjan</w:t>
-      </w:r>
-      <w:r>
-        <w:rPr>
-          <w:rFonts w:ascii="Roboto" w:hAnsi="Roboto"/>
-        </w:rPr>
-        <w:t>,</w:t>
-      </w:r>
-      <w:r>
-        <w:rPr>
-          <w:rFonts w:ascii="Roboto" w:hAnsi="Roboto"/>
-        </w:rPr>
-        <w:t xml:space="preserve"> </w:t>
-      </w:r>
-      <w:r>
-        <w:rPr>
-          <w:rFonts w:ascii="Roboto" w:hAnsi="Roboto"/>
-        </w:rPr>
-        <w:t>Zanjan,</w:t>
-      </w:r>
-      <w:r>
-        <w:rPr>
-          <w:rFonts w:ascii="Roboto" w:hAnsi="Roboto"/>
-        </w:rPr>
-        <w:t xml:space="preserve"> </w:t>
-      </w:r>
-      <w:r>
-        <w:rPr>
-          <w:rFonts w:ascii="Roboto" w:hAnsi="Roboto"/>
-        </w:rPr>
-        <w:t>Iran</w:t>
-      </w:r>
-    </w:p>
-    <w:p>
-      <w:pPr>
-        <w:spacing w:line="240" w:lineRule="auto"/>
-        <w:ind w:left="720"/>
-        <w:rPr>
-          <w:rFonts w:ascii="Roboto" w:hAnsi="Roboto"/>
-        </w:rPr>
-      </w:pPr>
     </w:p>
     <w:p>
       <w:pPr>
@@ -619,6 +619,192 @@
           <w:szCs w:val="28"/>
         </w:rPr>
         <w:t>RESEARCH INTERESTS</w:t>
+      </w:r>
+    </w:p>
+    <w:p>
+      <w:pPr>
+        <w:rPr>
+          <w:rFonts w:ascii="Roboto" w:hAnsi="Roboto"/>
+        </w:rPr>
+      </w:pPr>
+      <w:r>
+        <w:rPr>
+          <w:rFonts w:ascii="Roboto" w:hAnsi="Roboto"/>
+        </w:rPr>
+        <w:t>D</w:t>
+      </w:r>
+      <w:r>
+        <w:rPr>
+          <w:rFonts w:ascii="Roboto" w:hAnsi="Roboto"/>
+        </w:rPr>
+        <w:t xml:space="preserve">ata </w:t>
+      </w:r>
+      <w:r>
+        <w:rPr>
+          <w:rFonts w:ascii="Roboto" w:hAnsi="Roboto"/>
+          <w:lang w:bidi="fa-IR"/>
+        </w:rPr>
+        <w:t>A</w:t>
+      </w:r>
+      <w:r>
+        <w:rPr>
+          <w:rFonts w:ascii="Roboto" w:hAnsi="Roboto"/>
+          <w:lang w:bidi="fa-IR"/>
+        </w:rPr>
+        <w:t>nalysis</w:t>
+      </w:r>
+      <w:r>
+        <w:rPr>
+          <w:noProof/>
+        </w:rPr>
+        <w:t xml:space="preserve"> </w:t>
+      </w:r>
+      <w:r>
+        <w:rPr>
+          <w:rFonts w:ascii="Roboto" w:hAnsi="Roboto"/>
+          <w:b/>
+          <w:bCs/>
+          <w:lang w:bidi="fa-IR"/>
+        </w:rPr>
+        <w:t>•</w:t>
+      </w:r>
+      <w:r>
+        <w:rPr>
+          <w:rFonts w:ascii="Roboto" w:hAnsi="Roboto"/>
+          <w:b/>
+          <w:bCs/>
+        </w:rPr>
+        <w:t xml:space="preserve"> </w:t>
+      </w:r>
+      <w:r>
+        <w:rPr>
+          <w:rFonts w:ascii="Roboto" w:hAnsi="Roboto"/>
+        </w:rPr>
+        <w:t>Data Science</w:t>
+      </w:r>
+      <w:r>
+        <w:rPr>
+          <w:noProof/>
+        </w:rPr>
+        <w:t xml:space="preserve"> </w:t>
+      </w:r>
+      <w:r>
+        <w:rPr>
+          <w:rFonts w:ascii="Roboto" w:hAnsi="Roboto"/>
+          <w:b/>
+          <w:bCs/>
+          <w:lang w:bidi="fa-IR"/>
+        </w:rPr>
+        <w:t>•</w:t>
+      </w:r>
+      <w:r>
+        <w:rPr>
+          <w:rFonts w:ascii="Roboto" w:hAnsi="Roboto"/>
+          <w:b/>
+          <w:bCs/>
+        </w:rPr>
+        <w:t xml:space="preserve"> </w:t>
+      </w:r>
+      <w:r>
+        <w:rPr>
+          <w:rFonts w:ascii="Roboto" w:hAnsi="Roboto"/>
+        </w:rPr>
+        <w:t>M</w:t>
+      </w:r>
+      <w:r>
+        <w:rPr>
+          <w:rFonts w:ascii="Roboto" w:hAnsi="Roboto"/>
+        </w:rPr>
+        <w:t>achine</w:t>
+      </w:r>
+      <w:r>
+        <w:rPr>
+          <w:rFonts w:ascii="Roboto" w:hAnsi="Roboto"/>
+          <w:b/>
+          <w:bCs/>
+        </w:rPr>
+        <w:t xml:space="preserve"> </w:t>
+      </w:r>
+      <w:r>
+        <w:rPr>
+          <w:rFonts w:ascii="Roboto" w:hAnsi="Roboto"/>
+        </w:rPr>
+        <w:t>L</w:t>
+      </w:r>
+      <w:r>
+        <w:rPr>
+          <w:rFonts w:ascii="Roboto" w:hAnsi="Roboto"/>
+        </w:rPr>
+        <w:t>earning</w:t>
+      </w:r>
+      <w:r>
+        <w:rPr>
+          <w:rFonts w:ascii="Roboto" w:hAnsi="Roboto"/>
+          <w:color w:val="4B4C4E"/>
+        </w:rPr>
+        <w:t xml:space="preserve"> </w:t>
+      </w:r>
+      <w:r>
+        <w:rPr>
+          <w:rFonts w:ascii="Roboto" w:hAnsi="Roboto"/>
+          <w:b/>
+          <w:bCs/>
+        </w:rPr>
+        <w:t xml:space="preserve">• </w:t>
+      </w:r>
+      <w:r>
+        <w:rPr>
+          <w:rFonts w:ascii="Roboto" w:hAnsi="Roboto"/>
+        </w:rPr>
+        <w:t>S</w:t>
+      </w:r>
+      <w:r>
+        <w:rPr>
+          <w:rFonts w:ascii="Roboto" w:hAnsi="Roboto"/>
+        </w:rPr>
+        <w:t>ignal</w:t>
+      </w:r>
+      <w:r>
+        <w:rPr>
+          <w:rFonts w:ascii="Roboto" w:hAnsi="Roboto"/>
+          <w:b/>
+          <w:bCs/>
+        </w:rPr>
+        <w:t xml:space="preserve"> </w:t>
+      </w:r>
+      <w:r>
+        <w:rPr>
+          <w:rFonts w:ascii="Roboto" w:hAnsi="Roboto"/>
+        </w:rPr>
+        <w:t>P</w:t>
+      </w:r>
+      <w:r>
+        <w:rPr>
+          <w:rFonts w:ascii="Roboto" w:hAnsi="Roboto"/>
+        </w:rPr>
+        <w:t>rocessing</w:t>
+      </w:r>
+      <w:r>
+        <w:rPr>
+          <w:rFonts w:ascii="Roboto" w:hAnsi="Roboto"/>
+          <w:b/>
+          <w:bCs/>
+        </w:rPr>
+        <w:t xml:space="preserve"> </w:t>
+      </w:r>
+      <w:r>
+        <w:rPr>
+          <w:rFonts w:ascii="Roboto" w:hAnsi="Roboto"/>
+          <w:b/>
+          <w:bCs/>
+        </w:rPr>
+        <w:t xml:space="preserve">• </w:t>
+      </w:r>
+      <w:r>
+        <w:rPr>
+          <w:rFonts w:ascii="Roboto" w:hAnsi="Roboto"/>
+        </w:rPr>
+        <w:t>Deep Learning</w:t>
       </w:r>
     </w:p>
     <w:p>
@@ -634,13 +820,13 @@
         <mc:AlternateContent>
           <mc:Choice Requires="wps">
             <w:drawing>
-              <wp:anchor distT="0" distB="0" distL="114300" distR="114300" simplePos="0" relativeHeight="251683840" behindDoc="0" locked="0" layoutInCell="1" allowOverlap="1" wp14:anchorId="1182AED8" wp14:editId="7E4CF501">
+              <wp:anchor distT="0" distB="0" distL="114300" distR="114300" simplePos="0" relativeHeight="251683840" behindDoc="0" locked="0" layoutInCell="1" allowOverlap="1" wp14:anchorId="1182AED8" wp14:editId="4B2CEB62">
                 <wp:simplePos x="0" y="0"/>
                 <wp:positionH relativeFrom="column">
                   <wp:posOffset>-342900</wp:posOffset>
                 </wp:positionH>
                 <wp:positionV relativeFrom="paragraph">
-                  <wp:posOffset>327660</wp:posOffset>
+                  <wp:posOffset>156787</wp:posOffset>
                 </wp:positionV>
                 <wp:extent cx="6638290" cy="0"/>
                 <wp:effectExtent l="0" t="0" r="0" b="0"/>
@@ -689,203 +875,22 @@
           </mc:Choice>
           <mc:Fallback>
             <w:pict>
-              <v:line w14:anchorId="641E391D" id="Straight Connector 3" o:spid="_x0000_s1026" style="position:absolute;flip:y;z-index:251683840;visibility:visible;mso-wrap-style:square;mso-width-percent:0;mso-height-percent:0;mso-wrap-distance-left:9pt;mso-wrap-distance-top:0;mso-wrap-distance-right:9pt;mso-wrap-distance-bottom:0;mso-position-horizontal:absolute;mso-position-horizontal-relative:text;mso-position-vertical:absolute;mso-position-vertical-relative:text;mso-width-percent:0;mso-height-percent:0;mso-width-relative:margin;mso-height-relative:margin" from="-27pt,25.8pt" to="495.7pt,25.8pt" o:gfxdata="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" strokecolor="black [3200]" strokeweight=".5pt">
+              <v:line w14:anchorId="205611C0" id="Straight Connector 3" o:spid="_x0000_s1026" style="position:absolute;flip:y;z-index:251683840;visibility:visible;mso-wrap-style:square;mso-width-percent:0;mso-height-percent:0;mso-wrap-distance-left:9pt;mso-wrap-distance-top:0;mso-wrap-distance-right:9pt;mso-wrap-distance-bottom:0;mso-position-horizontal:absolute;mso-position-horizontal-relative:text;mso-position-vertical:absolute;mso-position-vertical-relative:text;mso-width-percent:0;mso-height-percent:0;mso-width-relative:margin;mso-height-relative:margin" from="-27pt,12.35pt" to="495.7pt,12.35pt" o:gfxdata="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" strokecolor="black [3200]" strokeweight=".5pt">
                 <v:stroke joinstyle="miter"/>
               </v:line>
             </w:pict>
           </mc:Fallback>
         </mc:AlternateContent>
       </w:r>
-      <w:r>
-        <w:rPr>
-          <w:rFonts w:ascii="Roboto" w:hAnsi="Roboto"/>
-        </w:rPr>
-        <w:t>D</w:t>
-      </w:r>
-      <w:r>
-        <w:rPr>
-          <w:rFonts w:ascii="Roboto" w:hAnsi="Roboto"/>
-        </w:rPr>
-        <w:t xml:space="preserve">ata </w:t>
-      </w:r>
-      <w:r>
-        <w:rPr>
-          <w:rFonts w:ascii="Roboto" w:hAnsi="Roboto"/>
-          <w:lang w:bidi="fa-IR"/>
-        </w:rPr>
-        <w:t>A</w:t>
-      </w:r>
-      <w:r>
-        <w:rPr>
-          <w:rFonts w:ascii="Roboto" w:hAnsi="Roboto"/>
-          <w:lang w:bidi="fa-IR"/>
-        </w:rPr>
-        <w:t>nalysis</w:t>
-      </w:r>
-      <w:r>
-        <w:rPr>
-          <w:noProof/>
-        </w:rPr>
-        <w:t xml:space="preserve"> </w:t>
-      </w:r>
-      <w:r>
-        <w:rPr>
-          <w:rFonts w:ascii="Roboto" w:hAnsi="Roboto"/>
-          <w:b/>
-          <w:bCs/>
-          <w:lang w:bidi="fa-IR"/>
-        </w:rPr>
-        <w:t>•</w:t>
-      </w:r>
-      <w:r>
-        <w:rPr>
-          <w:rFonts w:ascii="Roboto" w:hAnsi="Roboto"/>
-          <w:b/>
-          <w:bCs/>
-        </w:rPr>
-        <w:t xml:space="preserve"> </w:t>
-      </w:r>
-      <w:r>
-        <w:rPr>
-          <w:rFonts w:ascii="Roboto" w:hAnsi="Roboto"/>
-        </w:rPr>
-        <w:t>Data Science</w:t>
-      </w:r>
-      <w:r>
-        <w:rPr>
-          <w:noProof/>
-        </w:rPr>
-        <w:t xml:space="preserve"> </w:t>
-      </w:r>
-      <w:r>
-        <w:rPr>
-          <w:rFonts w:ascii="Roboto" w:hAnsi="Roboto"/>
-          <w:b/>
-          <w:bCs/>
-          <w:lang w:bidi="fa-IR"/>
-        </w:rPr>
-        <w:t>•</w:t>
-      </w:r>
-      <w:r>
-        <w:rPr>
-          <w:rFonts w:ascii="Roboto" w:hAnsi="Roboto"/>
-          <w:b/>
-          <w:bCs/>
-        </w:rPr>
-        <w:t xml:space="preserve"> </w:t>
-      </w:r>
-      <w:r>
-        <w:rPr>
-          <w:rFonts w:ascii="Roboto" w:hAnsi="Roboto"/>
-        </w:rPr>
-        <w:t>M</w:t>
-      </w:r>
-      <w:r>
-        <w:rPr>
-          <w:rFonts w:ascii="Roboto" w:hAnsi="Roboto"/>
-        </w:rPr>
-        <w:t>achine</w:t>
-      </w:r>
-      <w:r>
-        <w:rPr>
-          <w:rFonts w:ascii="Roboto" w:hAnsi="Roboto"/>
-          <w:b/>
-          <w:bCs/>
-        </w:rPr>
-        <w:t xml:space="preserve"> </w:t>
-      </w:r>
-      <w:r>
-        <w:rPr>
-          <w:rFonts w:ascii="Roboto" w:hAnsi="Roboto"/>
-        </w:rPr>
-        <w:t>L</w:t>
-      </w:r>
-      <w:r>
-        <w:rPr>
-          <w:rFonts w:ascii="Roboto" w:hAnsi="Roboto"/>
-        </w:rPr>
-        <w:t>earning</w:t>
-      </w:r>
-      <w:r>
-        <w:rPr>
-          <w:rFonts w:ascii="Roboto" w:hAnsi="Roboto"/>
-          <w:color w:val="4B4C4E"/>
-        </w:rPr>
-        <w:t xml:space="preserve"> </w:t>
-      </w:r>
-      <w:r>
-        <w:rPr>
-          <w:rFonts w:ascii="Roboto" w:hAnsi="Roboto"/>
-          <w:b/>
-          <w:bCs/>
-        </w:rPr>
-        <w:t xml:space="preserve">• </w:t>
-      </w:r>
-      <w:r>
-        <w:rPr>
-          <w:rFonts w:ascii="Roboto" w:hAnsi="Roboto"/>
-        </w:rPr>
-        <w:t>S</w:t>
-      </w:r>
-      <w:r>
-        <w:rPr>
-          <w:rFonts w:ascii="Roboto" w:hAnsi="Roboto"/>
-        </w:rPr>
-        <w:t>ignal</w:t>
-      </w:r>
-      <w:r>
-        <w:rPr>
-          <w:rFonts w:ascii="Roboto" w:hAnsi="Roboto"/>
-          <w:b/>
-          <w:bCs/>
-        </w:rPr>
-        <w:t xml:space="preserve"> </w:t>
-      </w:r>
-      <w:r>
-        <w:rPr>
-          <w:rFonts w:ascii="Roboto" w:hAnsi="Roboto"/>
-        </w:rPr>
-        <w:t>P</w:t>
-      </w:r>
-      <w:r>
-        <w:rPr>
-          <w:rFonts w:ascii="Roboto" w:hAnsi="Roboto"/>
-        </w:rPr>
-        <w:t>rocessing</w:t>
-      </w:r>
-      <w:r>
-        <w:rPr>
-          <w:rFonts w:ascii="Roboto" w:hAnsi="Roboto"/>
-          <w:b/>
-          <w:bCs/>
-        </w:rPr>
-        <w:t xml:space="preserve"> </w:t>
-      </w:r>
-      <w:r>
-        <w:rPr>
-          <w:rFonts w:ascii="Roboto" w:hAnsi="Roboto"/>
-          <w:b/>
-          <w:bCs/>
-        </w:rPr>
-        <w:t xml:space="preserve">• </w:t>
-      </w:r>
-      <w:r>
-        <w:rPr>
-          <w:rFonts w:ascii="Roboto" w:hAnsi="Roboto"/>
-        </w:rPr>
-        <w:t>D</w:t>
-      </w:r>
-      <w:r>
-        <w:rPr>
-          <w:rFonts w:ascii="Roboto" w:hAnsi="Roboto"/>
-        </w:rPr>
-        <w:t>atabase</w:t>
-      </w:r>
-    </w:p>
-    <w:p>
-      <w:pPr>
-        <w:rPr>
-          <w:rFonts w:ascii="Roboto" w:hAnsi="Roboto"/>
+    </w:p>
+    <w:p>
+      <w:pPr>
+        <w:rPr>
+          <w:rFonts w:ascii="Roboto" w:hAnsi="Roboto"/>
+          <w:b/>
+          <w:bCs/>
+          <w:sz w:val="28"/>
+          <w:szCs w:val="28"/>
         </w:rPr>
       </w:pPr>
     </w:p>
@@ -1072,24 +1077,82 @@
           <w:b/>
           <w:bCs/>
         </w:rPr>
-        <w:t>Method</w:t>
-      </w:r>
-      <w:proofErr w:type="gramStart"/>
-      <w:r>
-        <w:rPr>
-          <w:rFonts w:ascii="Roboto" w:hAnsi="Roboto"/>
-          <w:b/>
-          <w:bCs/>
-        </w:rPr>
-        <w:t xml:space="preserve">: </w:t>
-      </w:r>
-      <w:r>
-        <w:rPr>
-          <w:rFonts w:ascii="Roboto" w:hAnsi="Roboto"/>
-        </w:rPr>
-        <w:t>?</w:t>
-      </w:r>
-      <w:proofErr w:type="gramEnd"/>
+        <w:t xml:space="preserve">Method: </w:t>
+      </w:r>
+      <w:r>
+        <w:rPr>
+          <w:rFonts w:ascii="Roboto" w:hAnsi="Roboto"/>
+        </w:rPr>
+        <w:t>FFT,</w:t>
+      </w:r>
+      <w:r>
+        <w:rPr>
+          <w:rFonts w:ascii="Roboto" w:hAnsi="Roboto"/>
+          <w:b/>
+          <w:bCs/>
+        </w:rPr>
+        <w:t xml:space="preserve"> </w:t>
+      </w:r>
+      <w:r>
+        <w:rPr>
+          <w:rFonts w:ascii="Roboto" w:hAnsi="Roboto"/>
+        </w:rPr>
+        <w:t>HPF</w:t>
+      </w:r>
+    </w:p>
+    <w:p>
+      <w:pPr>
+        <w:rPr>
+          <w:rFonts w:ascii="Roboto" w:hAnsi="Roboto"/>
+          <w:lang w:bidi="fa-IR"/>
+        </w:rPr>
+      </w:pPr>
+      <w:r>
+        <w:rPr>
+          <w:rFonts w:ascii="Roboto" w:hAnsi="Roboto"/>
+          <w:lang w:bidi="fa-IR"/>
+        </w:rPr>
+        <w:t>Jun 2022</w:t>
+      </w:r>
+      <w:r>
+        <w:rPr>
+          <w:rFonts w:ascii="Roboto" w:hAnsi="Roboto"/>
+          <w:lang w:bidi="fa-IR"/>
+        </w:rPr>
+        <w:t>-Present</w:t>
+      </w:r>
+      <w:r>
+        <w:rPr>
+          <w:rFonts w:ascii="Roboto" w:hAnsi="Roboto"/>
+          <w:lang w:bidi="fa-IR"/>
+        </w:rPr>
+        <w:tab/>
+      </w:r>
+      <w:r>
+        <w:rPr>
+          <w:rFonts w:ascii="Roboto" w:hAnsi="Roboto"/>
+          <w:b/>
+          <w:bCs/>
+          <w:lang w:bidi="fa-IR"/>
+        </w:rPr>
+        <w:t>Data Research Analyst</w:t>
+      </w:r>
+      <w:r>
+        <w:rPr>
+          <w:rFonts w:ascii="Roboto" w:hAnsi="Roboto"/>
+          <w:b/>
+          <w:bCs/>
+          <w:lang w:bidi="fa-IR"/>
+        </w:rPr>
+        <w:t xml:space="preserve">, </w:t>
+      </w:r>
+      <w:r>
+        <w:rPr>
+          <w:rFonts w:ascii="Roboto" w:hAnsi="Roboto"/>
+          <w:lang w:bidi="fa-IR"/>
+        </w:rPr>
+        <w:t>Zanjan University of Medical Science</w:t>
+      </w:r>
     </w:p>
     <w:p>
       <w:pPr>
@@ -1102,93 +1165,43 @@
           <w:rFonts w:ascii="Roboto" w:hAnsi="Roboto"/>
           <w:b/>
           <w:bCs/>
-        </w:rPr>
-      </w:pPr>
-      <w:r>
-        <w:rPr>
-          <w:rFonts w:ascii="Roboto" w:hAnsi="Roboto"/>
-          <w:b/>
-          <w:bCs/>
-        </w:rPr>
-        <w:t>Description</w:t>
-      </w:r>
-      <w:proofErr w:type="gramStart"/>
-      <w:r>
-        <w:rPr>
-          <w:rFonts w:ascii="Roboto" w:hAnsi="Roboto"/>
-          <w:b/>
-          <w:bCs/>
-        </w:rPr>
-        <w:t>:</w:t>
-      </w:r>
-      <w:r>
-        <w:rPr>
-          <w:rFonts w:ascii="Roboto" w:hAnsi="Roboto"/>
-          <w:b/>
-          <w:bCs/>
-        </w:rPr>
-        <w:t xml:space="preserve"> </w:t>
-      </w:r>
-      <w:r>
-        <w:rPr>
-          <w:rFonts w:ascii="Roboto" w:hAnsi="Roboto"/>
-        </w:rPr>
-        <w:t>?</w:t>
-      </w:r>
-      <w:proofErr w:type="gramEnd"/>
-    </w:p>
-    <w:p>
-      <w:pPr>
-        <w:rPr>
-          <w:rFonts w:ascii="Roboto" w:hAnsi="Roboto"/>
-          <w:lang w:bidi="fa-IR"/>
-        </w:rPr>
-      </w:pPr>
-      <w:r>
-        <w:rPr>
-          <w:rFonts w:ascii="Roboto" w:hAnsi="Roboto"/>
-          <w:lang w:bidi="fa-IR"/>
-        </w:rPr>
-        <w:t>Jun 2022</w:t>
-      </w:r>
-      <w:r>
-        <w:rPr>
-          <w:rFonts w:ascii="Roboto" w:hAnsi="Roboto"/>
-          <w:lang w:bidi="fa-IR"/>
-        </w:rPr>
-        <w:t>-Present</w:t>
-      </w:r>
-      <w:r>
-        <w:rPr>
-          <w:rFonts w:ascii="Roboto" w:hAnsi="Roboto"/>
-          <w:lang w:bidi="fa-IR"/>
-        </w:rPr>
-        <w:tab/>
-      </w:r>
-      <w:r>
-        <w:rPr>
-          <w:rFonts w:ascii="Roboto" w:hAnsi="Roboto"/>
-          <w:b/>
-          <w:bCs/>
-          <w:lang w:bidi="fa-IR"/>
-        </w:rPr>
-        <w:t>Data Research Analyst</w:t>
-      </w:r>
-      <w:r>
-        <w:rPr>
-          <w:rFonts w:ascii="Roboto" w:hAnsi="Roboto"/>
-          <w:b/>
-          <w:bCs/>
-          <w:lang w:bidi="fa-IR"/>
-        </w:rPr>
-        <w:t xml:space="preserve">, </w:t>
-      </w:r>
-      <w:r>
-        <w:rPr>
-          <w:rFonts w:ascii="Roboto" w:hAnsi="Roboto"/>
-          <w:lang w:bidi="fa-IR"/>
-        </w:rPr>
-        <w:t>Zanjan University of Medical Science</w:t>
+          <w:sz w:val="28"/>
+          <w:szCs w:val="28"/>
+        </w:rPr>
+      </w:pPr>
+      <w:r>
+        <w:rPr>
+          <w:rFonts w:ascii="Roboto" w:hAnsi="Roboto"/>
+          <w:b/>
+          <w:bCs/>
+        </w:rPr>
+        <w:t>Research Title</w:t>
+      </w:r>
+      <w:r>
+        <w:rPr>
+          <w:rFonts w:ascii="Roboto" w:hAnsi="Roboto"/>
+          <w:b/>
+          <w:bCs/>
+        </w:rPr>
+        <w:t xml:space="preserve">: </w:t>
+      </w:r>
+      <w:r>
+        <w:rPr>
+          <w:rFonts w:ascii="Roboto" w:hAnsi="Roboto"/>
+        </w:rPr>
+        <w:t xml:space="preserve">Effectiveness of </w:t>
+      </w:r>
+      <w:r>
+        <w:rPr>
+          <w:rFonts w:ascii="Roboto" w:hAnsi="Roboto"/>
+        </w:rPr>
+        <w:t>transcranial direct</w:t>
+      </w:r>
+      <w:r>
+        <w:rPr>
+          <w:rFonts w:ascii="Roboto" w:hAnsi="Roboto"/>
+        </w:rPr>
+        <w:t xml:space="preserve"> current stimulation on neurocognition in patients with type 1 bipolar disorder</w:t>
       </w:r>
     </w:p>
     <w:p>
@@ -1212,33 +1225,14 @@
           <w:b/>
           <w:bCs/>
         </w:rPr>
-        <w:t>Research Title</w:t>
-      </w:r>
-      <w:r>
-        <w:rPr>
-          <w:rFonts w:ascii="Roboto" w:hAnsi="Roboto"/>
-          <w:b/>
-          <w:bCs/>
-        </w:rPr>
-        <w:t xml:space="preserve">: </w:t>
-      </w:r>
-      <w:r>
-        <w:rPr>
-          <w:rFonts w:ascii="Roboto" w:hAnsi="Roboto"/>
-        </w:rPr>
-        <w:t xml:space="preserve">Effectiveness of </w:t>
-      </w:r>
-      <w:r>
-        <w:rPr>
-          <w:rFonts w:ascii="Roboto" w:hAnsi="Roboto"/>
-        </w:rPr>
-        <w:t>transcranial direct</w:t>
-      </w:r>
-      <w:r>
-        <w:rPr>
-          <w:rFonts w:ascii="Roboto" w:hAnsi="Roboto"/>
-        </w:rPr>
-        <w:t xml:space="preserve"> current stimulation on neurocognition in patients with type 1 bipolar disorder</w:t>
+        <w:t xml:space="preserve">Task: </w:t>
+      </w:r>
+      <w:r>
+        <w:rPr>
+          <w:rFonts w:ascii="Roboto" w:hAnsi="Roboto"/>
+          <w:lang w:bidi="fa-IR"/>
+        </w:rPr>
+        <w:t>Fetch, Pre-Process, and Analyze Data</w:t>
       </w:r>
     </w:p>
     <w:p>
@@ -1262,101 +1256,14 @@
           <w:b/>
           <w:bCs/>
         </w:rPr>
-        <w:t xml:space="preserve">Task: </w:t>
-      </w:r>
-      <w:r>
-        <w:rPr>
-          <w:rFonts w:ascii="Roboto" w:hAnsi="Roboto"/>
-          <w:lang w:bidi="fa-IR"/>
-        </w:rPr>
-        <w:t>Fetch, Pre-Process, and Analyze Data</w:t>
-      </w:r>
-    </w:p>
-    <w:p>
-      <w:pPr>
-        <w:pStyle w:val="ListParagraph"/>
-        <w:numPr>
-          <w:ilvl w:val="0"/>
-          <w:numId w:val="1"/>
-        </w:numPr>
-        <w:rPr>
-          <w:rFonts w:ascii="Roboto" w:hAnsi="Roboto"/>
-          <w:b/>
-          <w:bCs/>
-          <w:sz w:val="28"/>
-          <w:szCs w:val="28"/>
-        </w:rPr>
-      </w:pPr>
-      <w:r>
-        <w:rPr>
-          <w:rFonts w:ascii="Roboto" w:hAnsi="Roboto"/>
-          <w:b/>
-          <w:bCs/>
-        </w:rPr>
-        <w:t>Method</w:t>
-      </w:r>
-      <w:proofErr w:type="gramStart"/>
-      <w:r>
-        <w:rPr>
-          <w:rFonts w:ascii="Roboto" w:hAnsi="Roboto"/>
-          <w:b/>
-          <w:bCs/>
-        </w:rPr>
-        <w:t xml:space="preserve">: </w:t>
-      </w:r>
-      <w:r>
-        <w:rPr>
-          <w:rFonts w:ascii="Roboto" w:hAnsi="Roboto"/>
-        </w:rPr>
-        <w:t>?</w:t>
-      </w:r>
-      <w:proofErr w:type="gramEnd"/>
-    </w:p>
-    <w:p>
-      <w:pPr>
-        <w:pStyle w:val="ListParagraph"/>
-        <w:numPr>
-          <w:ilvl w:val="0"/>
-          <w:numId w:val="1"/>
-        </w:numPr>
-        <w:rPr>
-          <w:rFonts w:ascii="Roboto" w:hAnsi="Roboto"/>
-          <w:b/>
-          <w:bCs/>
-        </w:rPr>
-      </w:pPr>
-      <w:r>
-        <w:rPr>
-          <w:rFonts w:ascii="Roboto" w:hAnsi="Roboto"/>
-          <w:b/>
-          <w:bCs/>
-        </w:rPr>
-        <w:t>Description</w:t>
-      </w:r>
-      <w:proofErr w:type="gramStart"/>
-      <w:r>
-        <w:rPr>
-          <w:rFonts w:ascii="Roboto" w:hAnsi="Roboto"/>
-          <w:b/>
-          <w:bCs/>
-        </w:rPr>
-        <w:t>:</w:t>
-      </w:r>
-      <w:r>
-        <w:rPr>
-          <w:rFonts w:ascii="Roboto" w:hAnsi="Roboto"/>
-          <w:b/>
-          <w:bCs/>
-        </w:rPr>
-        <w:t xml:space="preserve"> </w:t>
-      </w:r>
-      <w:r>
-        <w:rPr>
-          <w:rFonts w:ascii="Roboto" w:hAnsi="Roboto"/>
-        </w:rPr>
-        <w:t>?</w:t>
-      </w:r>
-      <w:proofErr w:type="gramEnd"/>
+        <w:t xml:space="preserve">Method: </w:t>
+      </w:r>
+      <w:r>
+        <w:rPr>
+          <w:rFonts w:ascii="Roboto" w:hAnsi="Roboto"/>
+        </w:rPr>
+        <w:t>ERP</w:t>
+      </w:r>
     </w:p>
     <w:p>
       <w:pPr>

</xml_diff>

<commit_message>
Fix GPA and link some titles
</commit_message>
<xml_diff>
--- a/docs/Omid Reza Heidari.docx
+++ b/docs/Omid Reza Heidari.docx
@@ -370,7 +370,15 @@
           <w:sz w:val="20"/>
           <w:szCs w:val="20"/>
         </w:rPr>
-        <w:t>71</w:t>
+        <w:t>7</w:t>
+      </w:r>
+      <w:r>
+        <w:rPr>
+          <w:rFonts w:ascii="Roboto" w:hAnsi="Roboto"/>
+          <w:sz w:val="20"/>
+          <w:szCs w:val="20"/>
+        </w:rPr>
+        <w:t>4</w:t>
       </w:r>
       <w:r>
         <w:rPr>

</xml_diff>

<commit_message>
Update date of IELTS
</commit_message>
<xml_diff>
--- a/docs/Omid Reza Heidari.docx
+++ b/docs/Omid Reza Heidari.docx
@@ -3543,7 +3543,7 @@
           <w:rFonts w:ascii="Roboto" w:hAnsi="Roboto"/>
           <w:lang w:bidi="fa-IR"/>
         </w:rPr>
-        <w:t>3</w:t>
+        <w:t>5</w:t>
       </w:r>
       <w:r>
         <w:rPr>
@@ -3551,7 +3551,7 @@
           <w:vertAlign w:val="superscript"/>
           <w:lang w:bidi="fa-IR"/>
         </w:rPr>
-        <w:t>rd</w:t>
+        <w:t>th</w:t>
       </w:r>
       <w:r>
         <w:rPr>

</xml_diff>

<commit_message>
Add a new experience
Add a new experience which provides information about my current position as a teacher assistant
</commit_message>
<xml_diff>
--- a/docs/Omid Reza Heidari.docx
+++ b/docs/Omid Reza Heidari.docx
@@ -169,7 +169,31 @@
         <w:rPr>
           <w:rFonts w:ascii="Roboto" w:hAnsi="Roboto"/>
         </w:rPr>
-        <w:t>2020-2022</w:t>
+        <w:t>2020</w:t>
+      </w:r>
+      <w:r>
+        <w:rPr>
+          <w:rFonts w:ascii="Roboto" w:hAnsi="Roboto"/>
+        </w:rPr>
+        <w:t xml:space="preserve"> </w:t>
+      </w:r>
+      <w:r>
+        <w:rPr>
+          <w:rFonts w:ascii="Roboto" w:hAnsi="Roboto"/>
+        </w:rPr>
+        <w:t>-</w:t>
+      </w:r>
+      <w:r>
+        <w:rPr>
+          <w:rFonts w:ascii="Roboto" w:hAnsi="Roboto"/>
+        </w:rPr>
+        <w:t xml:space="preserve"> </w:t>
+      </w:r>
+      <w:r>
+        <w:rPr>
+          <w:rFonts w:ascii="Roboto" w:hAnsi="Roboto"/>
+        </w:rPr>
+        <w:t>2022</w:t>
       </w:r>
       <w:r>
         <w:rPr>
@@ -436,7 +460,31 @@
         <w:rPr>
           <w:rFonts w:ascii="Roboto" w:hAnsi="Roboto"/>
         </w:rPr>
-        <w:t>2017-2019</w:t>
+        <w:t>2017</w:t>
+      </w:r>
+      <w:r>
+        <w:rPr>
+          <w:rFonts w:ascii="Roboto" w:hAnsi="Roboto"/>
+        </w:rPr>
+        <w:t xml:space="preserve"> </w:t>
+      </w:r>
+      <w:r>
+        <w:rPr>
+          <w:rFonts w:ascii="Roboto" w:hAnsi="Roboto"/>
+        </w:rPr>
+        <w:t>-</w:t>
+      </w:r>
+      <w:r>
+        <w:rPr>
+          <w:rFonts w:ascii="Roboto" w:hAnsi="Roboto"/>
+        </w:rPr>
+        <w:t xml:space="preserve"> </w:t>
+      </w:r>
+      <w:r>
+        <w:rPr>
+          <w:rFonts w:ascii="Roboto" w:hAnsi="Roboto"/>
+        </w:rPr>
+        <w:t>2019</w:t>
       </w:r>
       <w:r>
         <w:rPr>
@@ -828,13 +876,13 @@
         <mc:AlternateContent>
           <mc:Choice Requires="wps">
             <w:drawing>
-              <wp:anchor distT="0" distB="0" distL="114300" distR="114300" simplePos="0" relativeHeight="251683840" behindDoc="0" locked="0" layoutInCell="1" allowOverlap="1" wp14:anchorId="1182AED8" wp14:editId="4B2CEB62">
+              <wp:anchor distT="0" distB="0" distL="114300" distR="114300" simplePos="0" relativeHeight="251683840" behindDoc="0" locked="0" layoutInCell="1" allowOverlap="1" wp14:anchorId="1182AED8" wp14:editId="5FC90BD0">
                 <wp:simplePos x="0" y="0"/>
                 <wp:positionH relativeFrom="column">
                   <wp:posOffset>-342900</wp:posOffset>
                 </wp:positionH>
                 <wp:positionV relativeFrom="paragraph">
-                  <wp:posOffset>156787</wp:posOffset>
+                  <wp:posOffset>100647</wp:posOffset>
                 </wp:positionV>
                 <wp:extent cx="6638290" cy="0"/>
                 <wp:effectExtent l="0" t="0" r="0" b="0"/>
@@ -883,7 +931,7 @@
           </mc:Choice>
           <mc:Fallback>
             <w:pict>
-              <v:line w14:anchorId="205611C0" id="Straight Connector 3" o:spid="_x0000_s1026" style="position:absolute;flip:y;z-index:251683840;visibility:visible;mso-wrap-style:square;mso-width-percent:0;mso-height-percent:0;mso-wrap-distance-left:9pt;mso-wrap-distance-top:0;mso-wrap-distance-right:9pt;mso-wrap-distance-bottom:0;mso-position-horizontal:absolute;mso-position-horizontal-relative:text;mso-position-vertical:absolute;mso-position-vertical-relative:text;mso-width-percent:0;mso-height-percent:0;mso-width-relative:margin;mso-height-relative:margin" from="-27pt,12.35pt" to="495.7pt,12.35pt" o:gfxdata="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" strokecolor="black [3200]" strokeweight=".5pt">
+              <v:line w14:anchorId="38C7AEA4" id="Straight Connector 3" o:spid="_x0000_s1026" style="position:absolute;flip:y;z-index:251683840;visibility:visible;mso-wrap-style:square;mso-width-percent:0;mso-height-percent:0;mso-wrap-distance-left:9pt;mso-wrap-distance-top:0;mso-wrap-distance-right:9pt;mso-wrap-distance-bottom:0;mso-position-horizontal:absolute;mso-position-horizontal-relative:text;mso-position-vertical:absolute;mso-position-vertical-relative:text;mso-width-percent:0;mso-height-percent:0;mso-width-relative:margin;mso-height-relative:margin" from="-27pt,7.9pt" to="495.7pt,7.9pt" o:gfxdata="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" strokecolor="black [3200]" strokeweight=".5pt">
                 <v:stroke joinstyle="miter"/>
               </v:line>
             </w:pict>
@@ -901,9 +949,7 @@
           <w:szCs w:val="28"/>
         </w:rPr>
       </w:pPr>
-    </w:p>
-    <w:p>
-      <w:pPr>
+      <w:r>
         <w:rPr>
           <w:rFonts w:ascii="Roboto" w:hAnsi="Roboto"/>
           <w:b/>
@@ -911,15 +957,6 @@
           <w:sz w:val="28"/>
           <w:szCs w:val="28"/>
         </w:rPr>
-      </w:pPr>
-      <w:r>
-        <w:rPr>
-          <w:rFonts w:ascii="Roboto" w:hAnsi="Roboto"/>
-          <w:b/>
-          <w:bCs/>
-          <w:sz w:val="28"/>
-          <w:szCs w:val="28"/>
-        </w:rPr>
         <w:t>RESEARCH EXPERIENCE</w:t>
       </w:r>
     </w:p>
@@ -942,7 +979,42 @@
           <w:rFonts w:ascii="Roboto" w:hAnsi="Roboto"/>
           <w:lang w:bidi="fa-IR"/>
         </w:rPr>
-        <w:t>-Present</w:t>
+        <w:t xml:space="preserve"> </w:t>
+      </w:r>
+      <w:r>
+        <w:rPr>
+          <w:rFonts w:ascii="Roboto" w:hAnsi="Roboto"/>
+          <w:lang w:bidi="fa-IR"/>
+        </w:rPr>
+        <w:t>-</w:t>
+      </w:r>
+      <w:r>
+        <w:rPr>
+          <w:rFonts w:ascii="Roboto" w:hAnsi="Roboto"/>
+          <w:lang w:bidi="fa-IR"/>
+        </w:rPr>
+        <w:t xml:space="preserve"> </w:t>
+      </w:r>
+      <w:r>
+        <w:rPr>
+          <w:rFonts w:ascii="Roboto" w:hAnsi="Roboto"/>
+          <w:lang w:bidi="fa-IR"/>
+        </w:rPr>
+        <w:t>Sep</w:t>
+      </w:r>
+      <w:r>
+        <w:rPr>
+          <w:rFonts w:ascii="Roboto" w:hAnsi="Roboto"/>
+          <w:lang w:bidi="fa-IR"/>
+        </w:rPr>
+        <w:t xml:space="preserve"> </w:t>
+      </w:r>
+      <w:r>
+        <w:rPr>
+          <w:rFonts w:ascii="Roboto" w:hAnsi="Roboto"/>
+          <w:lang w:bidi="fa-IR"/>
+        </w:rPr>
+        <w:t>2022</w:t>
       </w:r>
       <w:r>
         <w:rPr>
@@ -1123,24 +1195,162 @@
     </w:p>
     <w:p>
       <w:pPr>
-        <w:rPr>
-          <w:rFonts w:ascii="Roboto" w:hAnsi="Roboto"/>
-          <w:lang w:bidi="fa-IR"/>
-        </w:rPr>
-      </w:pPr>
-      <w:r>
-        <w:rPr>
-          <w:rFonts w:ascii="Roboto" w:hAnsi="Roboto"/>
-          <w:lang w:bidi="fa-IR"/>
-        </w:rPr>
-        <w:t>Jun 2022</w:t>
-      </w:r>
-      <w:r>
-        <w:rPr>
-          <w:rFonts w:ascii="Roboto" w:hAnsi="Roboto"/>
-          <w:lang w:bidi="fa-IR"/>
-        </w:rPr>
-        <w:t>-Present</w:t>
+        <w:spacing w:line="276" w:lineRule="auto"/>
+        <w:rPr>
+          <w:rFonts w:ascii="Roboto" w:hAnsi="Roboto"/>
+          <w:b/>
+          <w:bCs/>
+          <w:sz w:val="28"/>
+          <w:szCs w:val="28"/>
+        </w:rPr>
+      </w:pPr>
+      <w:r>
+        <w:rPr>
+          <w:noProof/>
+        </w:rPr>
+        <mc:AlternateContent>
+          <mc:Choice Requires="wps">
+            <w:drawing>
+              <wp:anchor distT="0" distB="0" distL="114300" distR="114300" simplePos="0" relativeHeight="251685888" behindDoc="0" locked="0" layoutInCell="1" allowOverlap="1" wp14:anchorId="4C2F8F90" wp14:editId="40D36D0F">
+                <wp:simplePos x="0" y="0"/>
+                <wp:positionH relativeFrom="column">
+                  <wp:posOffset>-341630</wp:posOffset>
+                </wp:positionH>
+                <wp:positionV relativeFrom="paragraph">
+                  <wp:posOffset>150177</wp:posOffset>
+                </wp:positionV>
+                <wp:extent cx="6638290" cy="0"/>
+                <wp:effectExtent l="0" t="0" r="0" b="0"/>
+                <wp:wrapNone/>
+                <wp:docPr id="9" name="Straight Connector 9"/>
+                <wp:cNvGraphicFramePr/>
+                <a:graphic xmlns:a="http://schemas.openxmlformats.org/drawingml/2006/main">
+                  <a:graphicData uri="http://schemas.microsoft.com/office/word/2010/wordprocessingShape">
+                    <wps:wsp>
+                      <wps:cNvCnPr/>
+                      <wps:spPr>
+                        <a:xfrm flipV="1">
+                          <a:off x="0" y="0"/>
+                          <a:ext cx="6638290" cy="0"/>
+                        </a:xfrm>
+                        <a:prstGeom prst="line">
+                          <a:avLst/>
+                        </a:prstGeom>
+                      </wps:spPr>
+                      <wps:style>
+                        <a:lnRef idx="1">
+                          <a:schemeClr val="dk1"/>
+                        </a:lnRef>
+                        <a:fillRef idx="0">
+                          <a:schemeClr val="dk1"/>
+                        </a:fillRef>
+                        <a:effectRef idx="0">
+                          <a:schemeClr val="dk1"/>
+                        </a:effectRef>
+                        <a:fontRef idx="minor">
+                          <a:schemeClr val="tx1"/>
+                        </a:fontRef>
+                      </wps:style>
+                      <wps:bodyPr/>
+                    </wps:wsp>
+                  </a:graphicData>
+                </a:graphic>
+                <wp14:sizeRelH relativeFrom="margin">
+                  <wp14:pctWidth>0</wp14:pctWidth>
+                </wp14:sizeRelH>
+                <wp14:sizeRelV relativeFrom="margin">
+                  <wp14:pctHeight>0</wp14:pctHeight>
+                </wp14:sizeRelV>
+              </wp:anchor>
+            </w:drawing>
+          </mc:Choice>
+          <mc:Fallback>
+            <w:pict>
+              <v:line w14:anchorId="1E0451AA" id="Straight Connector 9" o:spid="_x0000_s1026" style="position:absolute;flip:y;z-index:251685888;visibility:visible;mso-wrap-style:square;mso-width-percent:0;mso-height-percent:0;mso-wrap-distance-left:9pt;mso-wrap-distance-top:0;mso-wrap-distance-right:9pt;mso-wrap-distance-bottom:0;mso-position-horizontal:absolute;mso-position-horizontal-relative:text;mso-position-vertical:absolute;mso-position-vertical-relative:text;mso-width-percent:0;mso-height-percent:0;mso-width-relative:margin;mso-height-relative:margin" from="-26.9pt,11.8pt" to="495.8pt,11.8pt" o:gfxdata="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" strokecolor="black [3200]" strokeweight=".5pt">
+                <v:stroke joinstyle="miter"/>
+              </v:line>
+            </w:pict>
+          </mc:Fallback>
+        </mc:AlternateContent>
+      </w:r>
+    </w:p>
+    <w:p>
+      <w:pPr>
+        <w:spacing w:line="276" w:lineRule="auto"/>
+        <w:rPr>
+          <w:rFonts w:ascii="Roboto" w:hAnsi="Roboto"/>
+          <w:b/>
+          <w:bCs/>
+          <w:sz w:val="28"/>
+          <w:szCs w:val="28"/>
+        </w:rPr>
+      </w:pPr>
+      <w:r>
+        <w:rPr>
+          <w:rFonts w:ascii="Roboto" w:hAnsi="Roboto"/>
+          <w:b/>
+          <w:bCs/>
+          <w:sz w:val="28"/>
+          <w:szCs w:val="28"/>
+        </w:rPr>
+        <w:t>TEACHING EXPERIENCE</w:t>
+      </w:r>
+    </w:p>
+    <w:p>
+      <w:pPr>
+        <w:spacing w:line="276" w:lineRule="auto"/>
+        <w:rPr>
+          <w:rFonts w:ascii="Roboto" w:hAnsi="Roboto"/>
+        </w:rPr>
+      </w:pPr>
+      <w:r>
+        <w:rPr>
+          <w:rFonts w:ascii="Roboto" w:hAnsi="Roboto"/>
+          <w:lang w:bidi="fa-IR"/>
+        </w:rPr>
+        <w:t xml:space="preserve">Sep </w:t>
+      </w:r>
+      <w:r>
+        <w:rPr>
+          <w:rFonts w:ascii="Roboto" w:hAnsi="Roboto"/>
+          <w:lang w:bidi="fa-IR"/>
+        </w:rPr>
+        <w:t>202</w:t>
+      </w:r>
+      <w:r>
+        <w:rPr>
+          <w:rFonts w:ascii="Roboto" w:hAnsi="Roboto"/>
+          <w:lang w:bidi="fa-IR"/>
+        </w:rPr>
+        <w:t>2</w:t>
+      </w:r>
+      <w:r>
+        <w:rPr>
+          <w:rFonts w:ascii="Roboto" w:hAnsi="Roboto"/>
+          <w:lang w:bidi="fa-IR"/>
+        </w:rPr>
+        <w:t xml:space="preserve"> </w:t>
+      </w:r>
+      <w:r>
+        <w:rPr>
+          <w:rFonts w:ascii="Roboto" w:hAnsi="Roboto"/>
+          <w:lang w:bidi="fa-IR"/>
+        </w:rPr>
+        <w:t>-</w:t>
+      </w:r>
+      <w:r>
+        <w:rPr>
+          <w:rFonts w:ascii="Roboto" w:hAnsi="Roboto"/>
+          <w:lang w:bidi="fa-IR"/>
+        </w:rPr>
+        <w:t xml:space="preserve"> </w:t>
+      </w:r>
+      <w:r>
+        <w:rPr>
+          <w:rFonts w:ascii="Roboto" w:hAnsi="Roboto"/>
+          <w:lang w:bidi="fa-IR"/>
+        </w:rPr>
+        <w:t>Present</w:t>
       </w:r>
       <w:r>
         <w:rPr>
@@ -1154,25 +1364,36 @@
           <w:rFonts w:ascii="Roboto" w:hAnsi="Roboto"/>
           <w:b/>
           <w:bCs/>
-          <w:lang w:bidi="fa-IR"/>
-        </w:rPr>
-        <w:t>Data Research Analyst</w:t>
-      </w:r>
-      <w:r>
-        <w:rPr>
-          <w:rFonts w:ascii="Roboto" w:hAnsi="Roboto"/>
-          <w:b/>
-          <w:bCs/>
-          <w:lang w:bidi="fa-IR"/>
+        </w:rPr>
+        <w:t>Teaching Assistant,</w:t>
+      </w:r>
+      <w:r>
+        <w:rPr>
+          <w:rFonts w:ascii="Roboto" w:hAnsi="Roboto"/>
+          <w:b/>
+          <w:bCs/>
+          <w:sz w:val="24"/>
+          <w:szCs w:val="24"/>
+        </w:rPr>
+        <w:t xml:space="preserve"> </w:t>
+      </w:r>
+      <w:r>
+        <w:rPr>
+          <w:rFonts w:ascii="Roboto" w:hAnsi="Roboto"/>
+        </w:rPr>
+        <w:t>Machin Learning</w:t>
+      </w:r>
+      <w:r>
+        <w:rPr>
+          <w:rFonts w:ascii="Roboto" w:hAnsi="Roboto"/>
         </w:rPr>
         <w:t xml:space="preserve">, </w:t>
       </w:r>
       <w:r>
         <w:rPr>
           <w:rFonts w:ascii="Roboto" w:hAnsi="Roboto"/>
-          <w:lang w:bidi="fa-IR"/>
-        </w:rPr>
-        <w:t>Zanjan University of Medical Science</w:t>
+        </w:rPr>
+        <w:t>Sharif University of Technology</w:t>
       </w:r>
     </w:p>
     <w:p>
@@ -1182,47 +1403,22 @@
           <w:ilvl w:val="0"/>
           <w:numId w:val="1"/>
         </w:numPr>
-        <w:rPr>
-          <w:rFonts w:ascii="Roboto" w:hAnsi="Roboto"/>
-          <w:b/>
-          <w:bCs/>
-          <w:sz w:val="28"/>
-          <w:szCs w:val="28"/>
-        </w:rPr>
-      </w:pPr>
-      <w:r>
-        <w:rPr>
-          <w:rFonts w:ascii="Roboto" w:hAnsi="Roboto"/>
-          <w:b/>
-          <w:bCs/>
-        </w:rPr>
-        <w:t>Research Title</w:t>
-      </w:r>
-      <w:r>
-        <w:rPr>
-          <w:rFonts w:ascii="Roboto" w:hAnsi="Roboto"/>
-          <w:b/>
-          <w:bCs/>
-        </w:rPr>
-        <w:t xml:space="preserve">: </w:t>
-      </w:r>
-      <w:r>
-        <w:rPr>
-          <w:rFonts w:ascii="Roboto" w:hAnsi="Roboto"/>
-        </w:rPr>
-        <w:t xml:space="preserve">Effectiveness of </w:t>
-      </w:r>
-      <w:r>
-        <w:rPr>
-          <w:rFonts w:ascii="Roboto" w:hAnsi="Roboto"/>
-        </w:rPr>
-        <w:t>transcranial direct</w:t>
-      </w:r>
-      <w:r>
-        <w:rPr>
-          <w:rFonts w:ascii="Roboto" w:hAnsi="Roboto"/>
-        </w:rPr>
-        <w:t xml:space="preserve"> current stimulation on neurocognition in patients with type 1 bipolar disorder</w:t>
+        <w:spacing w:line="276" w:lineRule="auto"/>
+        <w:rPr>
+          <w:rFonts w:ascii="Roboto" w:hAnsi="Roboto"/>
+        </w:rPr>
+      </w:pPr>
+      <w:r>
+        <w:rPr>
+          <w:rFonts w:ascii="Roboto" w:hAnsi="Roboto"/>
+        </w:rPr>
+        <w:t>Provide course materials, such as Jupyter Notebooks, slides, and quizzes</w:t>
+      </w:r>
+      <w:r>
+        <w:rPr>
+          <w:rFonts w:ascii="Roboto" w:hAnsi="Roboto"/>
+        </w:rPr>
+        <w:t xml:space="preserve"> </w:t>
       </w:r>
     </w:p>
     <w:p>
@@ -1232,28 +1428,22 @@
           <w:ilvl w:val="0"/>
           <w:numId w:val="1"/>
         </w:numPr>
-        <w:rPr>
-          <w:rFonts w:ascii="Roboto" w:hAnsi="Roboto"/>
-          <w:b/>
-          <w:bCs/>
-          <w:sz w:val="28"/>
-          <w:szCs w:val="28"/>
-        </w:rPr>
-      </w:pPr>
-      <w:r>
-        <w:rPr>
-          <w:rFonts w:ascii="Roboto" w:hAnsi="Roboto"/>
-          <w:b/>
-          <w:bCs/>
-        </w:rPr>
-        <w:t xml:space="preserve">Task: </w:t>
-      </w:r>
-      <w:r>
-        <w:rPr>
-          <w:rFonts w:ascii="Roboto" w:hAnsi="Roboto"/>
-          <w:lang w:bidi="fa-IR"/>
-        </w:rPr>
-        <w:t>Fetch, Pre-Process, and Analyze Data</w:t>
+        <w:spacing w:line="276" w:lineRule="auto"/>
+        <w:rPr>
+          <w:rFonts w:ascii="Roboto" w:hAnsi="Roboto" w:cs="Arial"/>
+          <w:color w:val="000000"/>
+          <w:sz w:val="24"/>
+          <w:szCs w:val="24"/>
+        </w:rPr>
+      </w:pPr>
+      <w:r>
+        <w:rPr>
+          <w:rFonts w:ascii="Roboto" w:hAnsi="Roboto" w:cs="Arial"/>
+          <w:color w:val="000000"/>
+          <w:sz w:val="24"/>
+          <w:szCs w:val="24"/>
+        </w:rPr>
+        <w:t>Prepare two types of homework, namely theoretical homework, and practical homework</w:t>
       </w:r>
     </w:p>
     <w:p>
@@ -1263,86 +1453,68 @@
           <w:ilvl w:val="0"/>
           <w:numId w:val="1"/>
         </w:numPr>
-        <w:rPr>
-          <w:rFonts w:ascii="Roboto" w:hAnsi="Roboto"/>
-          <w:b/>
-          <w:bCs/>
-          <w:sz w:val="28"/>
-          <w:szCs w:val="28"/>
-        </w:rPr>
-      </w:pPr>
-      <w:r>
-        <w:rPr>
-          <w:rFonts w:ascii="Roboto" w:hAnsi="Roboto"/>
-          <w:b/>
-          <w:bCs/>
-        </w:rPr>
-        <w:t xml:space="preserve">Method: </w:t>
-      </w:r>
-      <w:r>
-        <w:rPr>
-          <w:rFonts w:ascii="Roboto" w:hAnsi="Roboto"/>
-        </w:rPr>
-        <w:t>ERP</w:t>
-      </w:r>
-    </w:p>
-    <w:p>
-      <w:pPr>
-        <w:rPr>
-          <w:rFonts w:ascii="Roboto" w:hAnsi="Roboto"/>
-        </w:rPr>
-      </w:pPr>
-    </w:p>
-    <w:p>
-      <w:pPr>
         <w:spacing w:line="276" w:lineRule="auto"/>
         <w:rPr>
-          <w:rFonts w:ascii="Roboto" w:hAnsi="Roboto"/>
-          <w:b/>
-          <w:bCs/>
-          <w:sz w:val="28"/>
-          <w:szCs w:val="28"/>
-        </w:rPr>
-      </w:pPr>
-    </w:p>
-    <w:p>
-      <w:pPr>
-        <w:spacing w:line="276" w:lineRule="auto"/>
-        <w:rPr>
-          <w:rFonts w:ascii="Roboto" w:hAnsi="Roboto"/>
-          <w:b/>
-          <w:bCs/>
-          <w:sz w:val="28"/>
-          <w:szCs w:val="28"/>
-        </w:rPr>
-      </w:pPr>
-      <w:r>
-        <w:rPr>
-          <w:rFonts w:ascii="Roboto" w:hAnsi="Roboto"/>
-          <w:b/>
-          <w:bCs/>
-          <w:sz w:val="28"/>
-          <w:szCs w:val="28"/>
-        </w:rPr>
-        <w:lastRenderedPageBreak/>
-        <w:t>TEACHING EXPERIENCE</w:t>
-      </w:r>
-    </w:p>
-    <w:p>
-      <w:pPr>
-        <w:spacing w:line="276" w:lineRule="auto"/>
-        <w:rPr>
-          <w:rFonts w:ascii="Roboto" w:hAnsi="Roboto"/>
+          <w:rFonts w:ascii="Roboto" w:hAnsi="Roboto" w:cs="Arial"/>
+          <w:color w:val="000000"/>
           <w:sz w:val="24"/>
           <w:szCs w:val="24"/>
         </w:rPr>
       </w:pPr>
       <w:r>
         <w:rPr>
-          <w:rFonts w:ascii="Roboto" w:hAnsi="Roboto"/>
-          <w:lang w:bidi="fa-IR"/>
-        </w:rPr>
-        <w:t>Feb 2022-Jun 2022</w:t>
+          <w:rFonts w:ascii="Roboto" w:hAnsi="Roboto" w:cs="Arial"/>
+          <w:color w:val="000000"/>
+          <w:sz w:val="24"/>
+          <w:szCs w:val="24"/>
+        </w:rPr>
+        <w:t>Graded assignments and exams to provide tailored feedback based on course expectations and outcomes</w:t>
+      </w:r>
+    </w:p>
+    <w:p>
+      <w:pPr>
+        <w:spacing w:line="276" w:lineRule="auto"/>
+        <w:rPr>
+          <w:rFonts w:ascii="Roboto" w:hAnsi="Roboto"/>
+          <w:sz w:val="24"/>
+          <w:szCs w:val="24"/>
+        </w:rPr>
+      </w:pPr>
+      <w:r>
+        <w:rPr>
+          <w:rFonts w:ascii="Roboto" w:hAnsi="Roboto"/>
+          <w:lang w:bidi="fa-IR"/>
+        </w:rPr>
+        <w:lastRenderedPageBreak/>
+        <w:t>Feb 2022</w:t>
+      </w:r>
+      <w:r>
+        <w:rPr>
+          <w:rFonts w:ascii="Roboto" w:hAnsi="Roboto"/>
+          <w:lang w:bidi="fa-IR"/>
+        </w:rPr>
+        <w:t xml:space="preserve"> </w:t>
+      </w:r>
+      <w:r>
+        <w:rPr>
+          <w:rFonts w:ascii="Roboto" w:hAnsi="Roboto"/>
+          <w:lang w:bidi="fa-IR"/>
+        </w:rPr>
+        <w:t>-</w:t>
+      </w:r>
+      <w:r>
+        <w:rPr>
+          <w:rFonts w:ascii="Roboto" w:hAnsi="Roboto"/>
+          <w:lang w:bidi="fa-IR"/>
+        </w:rPr>
+        <w:t xml:space="preserve"> </w:t>
+      </w:r>
+      <w:r>
+        <w:rPr>
+          <w:rFonts w:ascii="Roboto" w:hAnsi="Roboto"/>
+          <w:lang w:bidi="fa-IR"/>
+        </w:rPr>
+        <w:t>Jun 2022</w:t>
       </w:r>
       <w:r>
         <w:rPr>
@@ -1469,83 +1641,16 @@
       <w:r>
         <w:rPr>
           <w:rFonts w:ascii="Roboto" w:hAnsi="Roboto"/>
+        </w:rPr>
+        <w:t xml:space="preserve">Prepare course assignments for the class </w:t>
+      </w:r>
+      <w:r>
+        <w:rPr>
+          <w:rFonts w:ascii="Roboto" w:hAnsi="Roboto"/>
           <w:color w:val="auto"/>
           <w:sz w:val="22"/>
           <w:szCs w:val="22"/>
         </w:rPr>
-        <w:t>P</w:t>
-      </w:r>
-      <w:r>
-        <w:rPr>
-          <w:rFonts w:ascii="Roboto" w:hAnsi="Roboto"/>
-          <w:color w:val="auto"/>
-          <w:sz w:val="22"/>
-          <w:szCs w:val="22"/>
-        </w:rPr>
-        <w:t xml:space="preserve">rovided weekly online support for </w:t>
-      </w:r>
-      <w:r>
-        <w:rPr>
-          <w:rFonts w:ascii="Roboto" w:hAnsi="Roboto"/>
-          <w:color w:val="auto"/>
-          <w:sz w:val="22"/>
-          <w:szCs w:val="22"/>
-        </w:rPr>
-        <w:t>the class</w:t>
-      </w:r>
-      <w:r>
-        <w:rPr>
-          <w:rFonts w:ascii="Roboto" w:hAnsi="Roboto"/>
-          <w:color w:val="auto"/>
-          <w:sz w:val="22"/>
-          <w:szCs w:val="22"/>
-        </w:rPr>
-        <w:t xml:space="preserve"> to ensure student understanding and</w:t>
-      </w:r>
-      <w:r>
-        <w:rPr>
-          <w:rFonts w:ascii="Roboto" w:hAnsi="Roboto"/>
-          <w:color w:val="auto"/>
-          <w:sz w:val="22"/>
-          <w:szCs w:val="22"/>
-        </w:rPr>
-        <w:t xml:space="preserve"> </w:t>
-      </w:r>
-      <w:r>
-        <w:rPr>
-          <w:rFonts w:ascii="Roboto" w:hAnsi="Roboto"/>
-          <w:color w:val="auto"/>
-          <w:sz w:val="22"/>
-          <w:szCs w:val="22"/>
-        </w:rPr>
-        <w:t>learning of course materials</w:t>
-      </w:r>
-    </w:p>
-    <w:p>
-      <w:pPr>
-        <w:pStyle w:val="Default"/>
-        <w:numPr>
-          <w:ilvl w:val="0"/>
-          <w:numId w:val="1"/>
-        </w:numPr>
-        <w:spacing w:line="276" w:lineRule="auto"/>
-        <w:rPr>
-          <w:rFonts w:ascii="Roboto" w:hAnsi="Roboto"/>
-        </w:rPr>
-      </w:pPr>
-      <w:r>
-        <w:rPr>
-          <w:rFonts w:ascii="Roboto" w:hAnsi="Roboto"/>
-        </w:rPr>
-        <w:t xml:space="preserve">Prepare course assignments for the class </w:t>
-      </w:r>
-      <w:r>
-        <w:rPr>
-          <w:rFonts w:ascii="Roboto" w:hAnsi="Roboto"/>
-          <w:color w:val="auto"/>
-          <w:sz w:val="22"/>
-          <w:szCs w:val="22"/>
-        </w:rPr>
         <w:t>in a practicum-based course to ensure practice-based learning prior to field placement</w:t>
       </w:r>
     </w:p>
@@ -1573,7 +1678,35 @@
           <w:rFonts w:ascii="Roboto" w:hAnsi="Roboto"/>
           <w:lang w:bidi="fa-IR"/>
         </w:rPr>
-        <w:t xml:space="preserve">Feb 2022-Jun </w:t>
+        <w:t>Feb 2022</w:t>
+      </w:r>
+      <w:r>
+        <w:rPr>
+          <w:rFonts w:ascii="Roboto" w:hAnsi="Roboto"/>
+          <w:lang w:bidi="fa-IR"/>
+        </w:rPr>
+        <w:t xml:space="preserve"> </w:t>
+      </w:r>
+      <w:r>
+        <w:rPr>
+          <w:rFonts w:ascii="Roboto" w:hAnsi="Roboto"/>
+          <w:lang w:bidi="fa-IR"/>
+        </w:rPr>
+        <w:t>-</w:t>
+      </w:r>
+      <w:r>
+        <w:rPr>
+          <w:rFonts w:ascii="Roboto" w:hAnsi="Roboto"/>
+          <w:lang w:bidi="fa-IR"/>
+        </w:rPr>
+        <w:t xml:space="preserve"> </w:t>
+      </w:r>
+      <w:r>
+        <w:rPr>
+          <w:rFonts w:ascii="Roboto" w:hAnsi="Roboto"/>
+          <w:lang w:bidi="fa-IR"/>
+        </w:rPr>
+        <w:t xml:space="preserve">Jun </w:t>
       </w:r>
       <w:r>
         <w:rPr>
@@ -1668,7 +1801,13 @@
         <w:rPr>
           <w:rFonts w:ascii="Roboto" w:hAnsi="Roboto"/>
         </w:rPr>
-        <w:t>homework also the final project</w:t>
+        <w:t xml:space="preserve">assignments </w:t>
+      </w:r>
+      <w:r>
+        <w:rPr>
+          <w:rFonts w:ascii="Roboto" w:hAnsi="Roboto"/>
+        </w:rPr>
+        <w:t>also the final project</w:t>
       </w:r>
       <w:r>
         <w:rPr>
@@ -1703,7 +1842,35 @@
           <w:rFonts w:ascii="Roboto" w:hAnsi="Roboto"/>
           <w:lang w:bidi="fa-IR"/>
         </w:rPr>
-        <w:t>Sep 2021-Jan 2022</w:t>
+        <w:t>Sep 2021</w:t>
+      </w:r>
+      <w:r>
+        <w:rPr>
+          <w:rFonts w:ascii="Roboto" w:hAnsi="Roboto"/>
+          <w:lang w:bidi="fa-IR"/>
+        </w:rPr>
+        <w:t xml:space="preserve"> </w:t>
+      </w:r>
+      <w:r>
+        <w:rPr>
+          <w:rFonts w:ascii="Roboto" w:hAnsi="Roboto"/>
+          <w:lang w:bidi="fa-IR"/>
+        </w:rPr>
+        <w:t>-</w:t>
+      </w:r>
+      <w:r>
+        <w:rPr>
+          <w:rFonts w:ascii="Roboto" w:hAnsi="Roboto"/>
+          <w:lang w:bidi="fa-IR"/>
+        </w:rPr>
+        <w:t xml:space="preserve"> </w:t>
+      </w:r>
+      <w:r>
+        <w:rPr>
+          <w:rFonts w:ascii="Roboto" w:hAnsi="Roboto"/>
+          <w:lang w:bidi="fa-IR"/>
+        </w:rPr>
+        <w:t>Jan 2022</w:t>
       </w:r>
       <w:r>
         <w:rPr>
@@ -1874,7 +2041,42 @@
           <w:rFonts w:ascii="Roboto" w:hAnsi="Roboto"/>
           <w:lang w:bidi="fa-IR"/>
         </w:rPr>
-        <w:t xml:space="preserve">Aug 2021-Oct 2021 </w:t>
+        <w:t>Aug 2021</w:t>
+      </w:r>
+      <w:r>
+        <w:rPr>
+          <w:rFonts w:ascii="Roboto" w:hAnsi="Roboto"/>
+          <w:lang w:bidi="fa-IR"/>
+        </w:rPr>
+        <w:t xml:space="preserve"> </w:t>
+      </w:r>
+      <w:r>
+        <w:rPr>
+          <w:rFonts w:ascii="Roboto" w:hAnsi="Roboto"/>
+          <w:lang w:bidi="fa-IR"/>
+        </w:rPr>
+        <w:t>-</w:t>
+      </w:r>
+      <w:r>
+        <w:rPr>
+          <w:rFonts w:ascii="Roboto" w:hAnsi="Roboto"/>
+          <w:lang w:bidi="fa-IR"/>
+        </w:rPr>
+        <w:t xml:space="preserve"> </w:t>
+      </w:r>
+      <w:r>
+        <w:rPr>
+          <w:rFonts w:ascii="Roboto" w:hAnsi="Roboto"/>
+          <w:lang w:bidi="fa-IR"/>
+        </w:rPr>
+        <w:t>Oct 2021</w:t>
+      </w:r>
+      <w:r>
+        <w:rPr>
+          <w:rFonts w:ascii="Roboto" w:hAnsi="Roboto"/>
+          <w:lang w:bidi="fa-IR"/>
+        </w:rPr>
+        <w:tab/>
       </w:r>
       <w:r>
         <w:rPr>
@@ -1992,7 +2194,7 @@
         <mc:AlternateContent>
           <mc:Choice Requires="wps">
             <w:drawing>
-              <wp:anchor distT="0" distB="0" distL="114300" distR="114300" simplePos="0" relativeHeight="251677696" behindDoc="0" locked="0" layoutInCell="1" allowOverlap="1" wp14:anchorId="3878A8F8" wp14:editId="1BFD11FB">
+              <wp:anchor distT="0" distB="0" distL="114300" distR="114300" simplePos="0" relativeHeight="251677696" behindDoc="0" locked="0" layoutInCell="1" allowOverlap="1" wp14:anchorId="3878A8F8" wp14:editId="06FF895A">
                 <wp:simplePos x="0" y="0"/>
                 <wp:positionH relativeFrom="column">
                   <wp:posOffset>-328930</wp:posOffset>
@@ -2047,7 +2249,7 @@
           </mc:Choice>
           <mc:Fallback>
             <w:pict>
-              <v:line w14:anchorId="7854C0D5" id="Straight Connector 8" o:spid="_x0000_s1026" style="position:absolute;flip:y;z-index:251677696;visibility:visible;mso-wrap-style:square;mso-width-percent:0;mso-height-percent:0;mso-wrap-distance-left:9pt;mso-wrap-distance-top:0;mso-wrap-distance-right:9pt;mso-wrap-distance-bottom:0;mso-position-horizontal:absolute;mso-position-horizontal-relative:text;mso-position-vertical:absolute;mso-position-vertical-relative:text;mso-width-percent:0;mso-height-percent:0;mso-width-relative:margin;mso-height-relative:margin" from="-25.9pt,11.15pt" to="496.8pt,11.15pt" o:gfxdata="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" strokecolor="black [3200]" strokeweight=".5pt">
+              <v:line w14:anchorId="19BB2006" id="Straight Connector 8" o:spid="_x0000_s1026" style="position:absolute;flip:y;z-index:251677696;visibility:visible;mso-wrap-style:square;mso-width-percent:0;mso-height-percent:0;mso-wrap-distance-left:9pt;mso-wrap-distance-top:0;mso-wrap-distance-right:9pt;mso-wrap-distance-bottom:0;mso-position-horizontal:absolute;mso-position-horizontal-relative:text;mso-position-vertical:absolute;mso-position-vertical-relative:text;mso-width-percent:0;mso-height-percent:0;mso-width-relative:margin;mso-height-relative:margin" from="-25.9pt,11.15pt" to="496.8pt,11.15pt" o:gfxdata="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" strokecolor="black [3200]" strokeweight=".5pt">
                 <v:stroke joinstyle="miter"/>
               </v:line>
             </w:pict>
@@ -2099,16 +2301,50 @@
           <w:rFonts w:ascii="Roboto" w:hAnsi="Roboto"/>
           <w:lang w:bidi="fa-IR"/>
         </w:rPr>
-        <w:t>Aug 2021-Dec 2021</w:t>
-      </w:r>
-      <w:r>
-        <w:rPr>
-          <w:rFonts w:ascii="Roboto" w:hAnsi="Roboto"/>
-          <w:b/>
-          <w:bCs/>
+        <w:t>Aug 2021</w:t>
+      </w:r>
+      <w:r>
+        <w:rPr>
+          <w:rFonts w:ascii="Roboto" w:hAnsi="Roboto"/>
+          <w:lang w:bidi="fa-IR"/>
+        </w:rPr>
+        <w:t xml:space="preserve"> </w:t>
+      </w:r>
+      <w:r>
+        <w:rPr>
+          <w:rFonts w:ascii="Roboto" w:hAnsi="Roboto"/>
+          <w:lang w:bidi="fa-IR"/>
+        </w:rPr>
+        <w:t>-</w:t>
+      </w:r>
+      <w:r>
+        <w:rPr>
+          <w:rFonts w:ascii="Roboto" w:hAnsi="Roboto"/>
+          <w:lang w:bidi="fa-IR"/>
+        </w:rPr>
+        <w:t xml:space="preserve"> </w:t>
+      </w:r>
+      <w:r>
+        <w:rPr>
+          <w:rFonts w:ascii="Roboto" w:hAnsi="Roboto"/>
+          <w:lang w:bidi="fa-IR"/>
+        </w:rPr>
+        <w:t>Dec 2021</w:t>
+      </w:r>
+      <w:r>
+        <w:rPr>
+          <w:rFonts w:ascii="Roboto" w:hAnsi="Roboto"/>
           <w:lang w:bidi="fa-IR"/>
         </w:rPr>
         <w:tab/>
+      </w:r>
+      <w:r>
+        <w:rPr>
+          <w:rFonts w:ascii="Roboto" w:hAnsi="Roboto"/>
+          <w:b/>
+          <w:bCs/>
+          <w:lang w:bidi="fa-IR"/>
+        </w:rPr>
         <w:t xml:space="preserve">Title: </w:t>
       </w:r>
       <w:hyperlink r:id="rId15" w:history="1">
@@ -2149,6 +2385,23 @@
           <w:lang w:bidi="fa-IR"/>
         </w:rPr>
         <w:tab/>
+      </w:r>
+      <w:r>
+        <w:rPr>
+          <w:rFonts w:ascii="Roboto" w:hAnsi="Roboto"/>
+          <w:b/>
+          <w:bCs/>
+          <w:lang w:bidi="fa-IR"/>
+        </w:rPr>
+        <w:tab/>
+      </w:r>
+      <w:r>
+        <w:rPr>
+          <w:rFonts w:ascii="Roboto" w:hAnsi="Roboto"/>
+          <w:b/>
+          <w:bCs/>
+          <w:lang w:bidi="fa-IR"/>
+        </w:rPr>
         <w:t xml:space="preserve">Description: </w:t>
       </w:r>
       <w:r>
@@ -2175,7 +2428,42 @@
           <w:rFonts w:ascii="Roboto" w:hAnsi="Roboto"/>
           <w:lang w:bidi="fa-IR"/>
         </w:rPr>
-        <w:t>Apr 2020-Apr 2020</w:t>
+        <w:t>Apr 2020</w:t>
+      </w:r>
+      <w:r>
+        <w:rPr>
+          <w:rFonts w:ascii="Roboto" w:hAnsi="Roboto"/>
+          <w:lang w:bidi="fa-IR"/>
+        </w:rPr>
+        <w:t xml:space="preserve"> </w:t>
+      </w:r>
+      <w:r>
+        <w:rPr>
+          <w:rFonts w:ascii="Roboto" w:hAnsi="Roboto"/>
+          <w:lang w:bidi="fa-IR"/>
+        </w:rPr>
+        <w:t>-</w:t>
+      </w:r>
+      <w:r>
+        <w:rPr>
+          <w:rFonts w:ascii="Roboto" w:hAnsi="Roboto"/>
+          <w:lang w:bidi="fa-IR"/>
+        </w:rPr>
+        <w:t xml:space="preserve"> </w:t>
+      </w:r>
+      <w:r>
+        <w:rPr>
+          <w:rFonts w:ascii="Roboto" w:hAnsi="Roboto"/>
+          <w:lang w:bidi="fa-IR"/>
+        </w:rPr>
+        <w:t>Apr 2020</w:t>
+      </w:r>
+      <w:r>
+        <w:rPr>
+          <w:rFonts w:ascii="Roboto" w:hAnsi="Roboto"/>
+          <w:lang w:bidi="fa-IR"/>
+        </w:rPr>
+        <w:tab/>
       </w:r>
       <w:r>
         <w:rPr>
@@ -2240,6 +2528,13 @@
       <w:r>
         <w:rPr>
           <w:rFonts w:ascii="Roboto" w:hAnsi="Roboto"/>
+          <w:lang w:bidi="fa-IR"/>
+        </w:rPr>
+        <w:tab/>
+      </w:r>
+      <w:r>
+        <w:rPr>
+          <w:rFonts w:ascii="Roboto" w:hAnsi="Roboto"/>
           <w:b/>
           <w:bCs/>
           <w:lang w:bidi="fa-IR"/>
@@ -2272,7 +2567,35 @@
           <w:rFonts w:ascii="Roboto" w:hAnsi="Roboto"/>
           <w:lang w:bidi="fa-IR"/>
         </w:rPr>
-        <w:t>Aug 2018-Aug 2019</w:t>
+        <w:t>Aug 2018</w:t>
+      </w:r>
+      <w:r>
+        <w:rPr>
+          <w:rFonts w:ascii="Roboto" w:hAnsi="Roboto"/>
+          <w:lang w:bidi="fa-IR"/>
+        </w:rPr>
+        <w:t xml:space="preserve"> </w:t>
+      </w:r>
+      <w:r>
+        <w:rPr>
+          <w:rFonts w:ascii="Roboto" w:hAnsi="Roboto"/>
+          <w:lang w:bidi="fa-IR"/>
+        </w:rPr>
+        <w:t>-</w:t>
+      </w:r>
+      <w:r>
+        <w:rPr>
+          <w:rFonts w:ascii="Roboto" w:hAnsi="Roboto"/>
+          <w:lang w:bidi="fa-IR"/>
+        </w:rPr>
+        <w:t xml:space="preserve"> </w:t>
+      </w:r>
+      <w:r>
+        <w:rPr>
+          <w:rFonts w:ascii="Roboto" w:hAnsi="Roboto"/>
+          <w:lang w:bidi="fa-IR"/>
+        </w:rPr>
+        <w:t>Aug 2019</w:t>
       </w:r>
       <w:r>
         <w:rPr>
@@ -2335,6 +2658,15 @@
           <w:bCs/>
           <w:lang w:bidi="fa-IR"/>
         </w:rPr>
+        <w:tab/>
+      </w:r>
+      <w:r>
+        <w:rPr>
+          <w:rFonts w:ascii="Roboto" w:hAnsi="Roboto"/>
+          <w:b/>
+          <w:bCs/>
+          <w:lang w:bidi="fa-IR"/>
+        </w:rPr>
         <w:t xml:space="preserve">Description: </w:t>
       </w:r>
       <w:r>
@@ -2373,6 +2705,79 @@
           <w:lang w:bidi="fa-IR"/>
         </w:rPr>
       </w:pPr>
+      <w:r>
+        <w:rPr>
+          <w:b/>
+          <w:bCs/>
+          <w:noProof/>
+          <w:sz w:val="20"/>
+          <w:szCs w:val="20"/>
+        </w:rPr>
+        <mc:AlternateContent>
+          <mc:Choice Requires="wps">
+            <w:drawing>
+              <wp:anchor distT="0" distB="0" distL="114300" distR="114300" simplePos="0" relativeHeight="251687936" behindDoc="0" locked="0" layoutInCell="1" allowOverlap="1" wp14:anchorId="2A47097D" wp14:editId="080C62EE">
+                <wp:simplePos x="0" y="0"/>
+                <wp:positionH relativeFrom="column">
+                  <wp:posOffset>-330200</wp:posOffset>
+                </wp:positionH>
+                <wp:positionV relativeFrom="paragraph">
+                  <wp:posOffset>26328</wp:posOffset>
+                </wp:positionV>
+                <wp:extent cx="6638290" cy="0"/>
+                <wp:effectExtent l="0" t="0" r="0" b="0"/>
+                <wp:wrapNone/>
+                <wp:docPr id="10" name="Straight Connector 10"/>
+                <wp:cNvGraphicFramePr/>
+                <a:graphic xmlns:a="http://schemas.openxmlformats.org/drawingml/2006/main">
+                  <a:graphicData uri="http://schemas.microsoft.com/office/word/2010/wordprocessingShape">
+                    <wps:wsp>
+                      <wps:cNvCnPr/>
+                      <wps:spPr>
+                        <a:xfrm flipV="1">
+                          <a:off x="0" y="0"/>
+                          <a:ext cx="6638290" cy="0"/>
+                        </a:xfrm>
+                        <a:prstGeom prst="line">
+                          <a:avLst/>
+                        </a:prstGeom>
+                      </wps:spPr>
+                      <wps:style>
+                        <a:lnRef idx="1">
+                          <a:schemeClr val="dk1"/>
+                        </a:lnRef>
+                        <a:fillRef idx="0">
+                          <a:schemeClr val="dk1"/>
+                        </a:fillRef>
+                        <a:effectRef idx="0">
+                          <a:schemeClr val="dk1"/>
+                        </a:effectRef>
+                        <a:fontRef idx="minor">
+                          <a:schemeClr val="tx1"/>
+                        </a:fontRef>
+                      </wps:style>
+                      <wps:bodyPr/>
+                    </wps:wsp>
+                  </a:graphicData>
+                </a:graphic>
+                <wp14:sizeRelH relativeFrom="margin">
+                  <wp14:pctWidth>0</wp14:pctWidth>
+                </wp14:sizeRelH>
+                <wp14:sizeRelV relativeFrom="margin">
+                  <wp14:pctHeight>0</wp14:pctHeight>
+                </wp14:sizeRelV>
+              </wp:anchor>
+            </w:drawing>
+          </mc:Choice>
+          <mc:Fallback>
+            <w:pict>
+              <v:line w14:anchorId="473E32BE" id="Straight Connector 10" o:spid="_x0000_s1026" style="position:absolute;flip:y;z-index:251687936;visibility:visible;mso-wrap-style:square;mso-width-percent:0;mso-height-percent:0;mso-wrap-distance-left:9pt;mso-wrap-distance-top:0;mso-wrap-distance-right:9pt;mso-wrap-distance-bottom:0;mso-position-horizontal:absolute;mso-position-horizontal-relative:text;mso-position-vertical:absolute;mso-position-vertical-relative:text;mso-width-percent:0;mso-height-percent:0;mso-width-relative:margin;mso-height-relative:margin" from="-26pt,2.05pt" to="496.7pt,2.05pt" o:gfxdata="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" strokecolor="black [3200]" strokeweight=".5pt">
+                <v:stroke joinstyle="miter"/>
+              </v:line>
+            </w:pict>
+          </mc:Fallback>
+        </mc:AlternateContent>
+      </w:r>
     </w:p>
     <w:p>
       <w:pPr>
@@ -2388,6 +2793,17 @@
           <w:lang w:bidi="fa-IR"/>
         </w:rPr>
       </w:pPr>
+      <w:r>
+        <w:rPr>
+          <w:rFonts w:ascii="Roboto" w:hAnsi="Roboto"/>
+          <w:b/>
+          <w:bCs/>
+          <w:sz w:val="28"/>
+          <w:szCs w:val="28"/>
+          <w:lang w:bidi="fa-IR"/>
+        </w:rPr>
+        <w:t>CORE COURSES</w:t>
+      </w:r>
     </w:p>
     <w:p>
       <w:pPr>
@@ -2396,170 +2812,150 @@
         </w:tabs>
         <w:rPr>
           <w:rFonts w:ascii="Roboto" w:hAnsi="Roboto"/>
-          <w:b/>
-          <w:bCs/>
-          <w:sz w:val="28"/>
-          <w:szCs w:val="28"/>
-          <w:lang w:bidi="fa-IR"/>
-        </w:rPr>
-      </w:pPr>
-      <w:r>
-        <w:rPr>
-          <w:rFonts w:ascii="Roboto" w:hAnsi="Roboto"/>
-          <w:b/>
-          <w:bCs/>
-          <w:sz w:val="28"/>
-          <w:szCs w:val="28"/>
-          <w:lang w:bidi="fa-IR"/>
+          <w:lang w:bidi="fa-IR"/>
+        </w:rPr>
+      </w:pPr>
+      <w:r>
+        <w:rPr>
+          <w:rFonts w:ascii="Roboto" w:hAnsi="Roboto"/>
+          <w:lang w:bidi="fa-IR"/>
+        </w:rPr>
+        <w:t>Principles of Database Design</w:t>
+      </w:r>
+      <w:r>
+        <w:rPr>
+          <w:rFonts w:ascii="Roboto" w:hAnsi="Roboto"/>
+          <w:lang w:bidi="fa-IR"/>
+        </w:rPr>
+        <w:t xml:space="preserve"> (20) </w:t>
+      </w:r>
+      <w:r>
+        <w:rPr>
+          <w:rFonts w:ascii="Roboto" w:hAnsi="Roboto"/>
+          <w:b/>
+          <w:bCs/>
+        </w:rPr>
+        <w:t>•</w:t>
+      </w:r>
+      <w:r>
+        <w:rPr>
+          <w:rFonts w:ascii="Roboto" w:hAnsi="Roboto"/>
+          <w:lang w:bidi="fa-IR"/>
+        </w:rPr>
+        <w:t xml:space="preserve"> </w:t>
+      </w:r>
+      <w:r>
+        <w:rPr>
+          <w:rFonts w:ascii="Roboto" w:hAnsi="Roboto"/>
+          <w:lang w:bidi="fa-IR"/>
+        </w:rPr>
+        <w:t>Artificial Intelligence and Expert Systems (20)</w:t>
+      </w:r>
+      <w:r>
+        <w:rPr>
+          <w:rFonts w:ascii="Roboto" w:hAnsi="Roboto"/>
+          <w:b/>
+          <w:bCs/>
+        </w:rPr>
+        <w:t xml:space="preserve"> </w:t>
+      </w:r>
+      <w:r>
+        <w:rPr>
+          <w:rFonts w:ascii="Roboto" w:hAnsi="Roboto"/>
+          <w:b/>
+          <w:bCs/>
+        </w:rPr>
+        <w:t>•</w:t>
+      </w:r>
+      <w:r>
+        <w:rPr>
+          <w:rFonts w:ascii="Roboto" w:hAnsi="Roboto"/>
+        </w:rPr>
+        <w:t xml:space="preserve"> </w:t>
+      </w:r>
+      <w:r>
+        <w:rPr>
+          <w:rFonts w:ascii="Roboto" w:hAnsi="Roboto"/>
+        </w:rPr>
+        <w:t xml:space="preserve">Advanced Database (18) </w:t>
+      </w:r>
+      <w:r>
+        <w:rPr>
+          <w:rFonts w:ascii="Roboto" w:hAnsi="Roboto"/>
+          <w:b/>
+          <w:bCs/>
+        </w:rPr>
+        <w:t>•</w:t>
+      </w:r>
+      <w:r>
+        <w:rPr>
+          <w:rFonts w:ascii="Roboto" w:hAnsi="Roboto"/>
+        </w:rPr>
+        <w:t xml:space="preserve"> </w:t>
+      </w:r>
+      <w:r>
+        <w:rPr>
+          <w:rFonts w:ascii="Roboto" w:hAnsi="Roboto"/>
+        </w:rPr>
+        <w:t>Signals and Systems (17)</w:t>
+      </w:r>
+      <w:r>
+        <w:rPr>
+          <w:rFonts w:ascii="Roboto" w:hAnsi="Roboto"/>
+          <w:lang w:bidi="fa-IR"/>
+        </w:rPr>
+        <w:t xml:space="preserve"> </w:t>
+      </w:r>
+      <w:r>
+        <w:rPr>
+          <w:rFonts w:ascii="Roboto" w:hAnsi="Roboto"/>
+          <w:b/>
+          <w:bCs/>
+        </w:rPr>
+        <w:t>•</w:t>
+      </w:r>
+      <w:r>
+        <w:rPr>
+          <w:rFonts w:ascii="Roboto" w:hAnsi="Roboto"/>
+          <w:lang w:bidi="fa-IR"/>
+        </w:rPr>
+        <w:t xml:space="preserve"> </w:t>
+      </w:r>
+      <w:r>
+        <w:rPr>
+          <w:rFonts w:ascii="Roboto" w:hAnsi="Roboto"/>
+          <w:lang w:bidi="fa-IR"/>
+        </w:rPr>
+        <w:t xml:space="preserve">Computer Networks (20) </w:t>
+      </w:r>
+      <w:r>
+        <w:rPr>
+          <w:rFonts w:ascii="Roboto" w:hAnsi="Roboto"/>
+          <w:b/>
+          <w:bCs/>
+        </w:rPr>
+        <w:t>•</w:t>
+      </w:r>
+      <w:r>
+        <w:rPr>
+          <w:rFonts w:ascii="Roboto" w:hAnsi="Roboto"/>
+          <w:b/>
+          <w:bCs/>
+        </w:rPr>
+        <w:t xml:space="preserve"> </w:t>
+      </w:r>
+      <w:r>
+        <w:rPr>
+          <w:rFonts w:ascii="Roboto" w:hAnsi="Roboto"/>
+        </w:rPr>
+        <w:t xml:space="preserve">Advance Programming </w:t>
+      </w:r>
+      <w:r>
+        <w:rPr>
+          <w:rFonts w:ascii="Roboto" w:hAnsi="Roboto"/>
         </w:rPr>
         <w:lastRenderedPageBreak/>
-        <w:t>CORE COURSES</w:t>
-      </w:r>
-    </w:p>
-    <w:p>
-      <w:pPr>
-        <w:tabs>
-          <w:tab w:val="left" w:pos="5280"/>
-        </w:tabs>
-        <w:rPr>
-          <w:rFonts w:ascii="Roboto" w:hAnsi="Roboto"/>
-          <w:lang w:bidi="fa-IR"/>
-        </w:rPr>
-      </w:pPr>
-      <w:r>
-        <w:rPr>
-          <w:rFonts w:ascii="Roboto" w:hAnsi="Roboto"/>
-          <w:lang w:bidi="fa-IR"/>
-        </w:rPr>
-        <w:t>Principles of Database Design</w:t>
-      </w:r>
-      <w:r>
-        <w:rPr>
-          <w:rFonts w:ascii="Roboto" w:hAnsi="Roboto"/>
-          <w:lang w:bidi="fa-IR"/>
-        </w:rPr>
-        <w:t xml:space="preserve"> (20) </w:t>
-      </w:r>
-      <w:r>
-        <w:rPr>
-          <w:rFonts w:ascii="Roboto" w:hAnsi="Roboto"/>
-          <w:b/>
-          <w:bCs/>
-        </w:rPr>
-        <w:t>•</w:t>
-      </w:r>
-      <w:r>
-        <w:rPr>
-          <w:rFonts w:ascii="Roboto" w:hAnsi="Roboto"/>
-          <w:lang w:bidi="fa-IR"/>
-        </w:rPr>
-        <w:t xml:space="preserve"> </w:t>
-      </w:r>
-      <w:r>
-        <w:rPr>
-          <w:rFonts w:ascii="Roboto" w:hAnsi="Roboto"/>
-          <w:lang w:bidi="fa-IR"/>
-        </w:rPr>
-        <w:t>Artificial Intelligence and Expert Systems (20)</w:t>
-      </w:r>
-      <w:r>
-        <w:rPr>
-          <w:rFonts w:ascii="Roboto" w:hAnsi="Roboto"/>
-          <w:b/>
-          <w:bCs/>
-        </w:rPr>
-        <w:t xml:space="preserve"> </w:t>
-      </w:r>
-      <w:r>
-        <w:rPr>
-          <w:rFonts w:ascii="Roboto" w:hAnsi="Roboto"/>
-          <w:b/>
-          <w:bCs/>
-        </w:rPr>
-        <w:t>•</w:t>
-      </w:r>
-      <w:r>
-        <w:rPr>
-          <w:rFonts w:ascii="Roboto" w:hAnsi="Roboto"/>
-        </w:rPr>
-        <w:t xml:space="preserve"> </w:t>
-      </w:r>
-      <w:r>
-        <w:rPr>
-          <w:rFonts w:ascii="Roboto" w:hAnsi="Roboto"/>
-        </w:rPr>
-        <w:t xml:space="preserve">Advanced Database (18) </w:t>
-      </w:r>
-      <w:r>
-        <w:rPr>
-          <w:rFonts w:ascii="Roboto" w:hAnsi="Roboto"/>
-          <w:b/>
-          <w:bCs/>
-        </w:rPr>
-        <w:t>•</w:t>
-      </w:r>
-      <w:r>
-        <w:rPr>
-          <w:rFonts w:ascii="Roboto" w:hAnsi="Roboto"/>
-        </w:rPr>
-        <w:t xml:space="preserve"> </w:t>
-      </w:r>
-      <w:r>
-        <w:rPr>
-          <w:rFonts w:ascii="Roboto" w:hAnsi="Roboto"/>
-        </w:rPr>
-        <w:t>Signals and Systems (17)</w:t>
-      </w:r>
-      <w:r>
-        <w:rPr>
-          <w:rFonts w:ascii="Roboto" w:hAnsi="Roboto"/>
-          <w:lang w:bidi="fa-IR"/>
-        </w:rPr>
-        <w:t xml:space="preserve"> </w:t>
-      </w:r>
-      <w:r>
-        <w:rPr>
-          <w:rFonts w:ascii="Roboto" w:hAnsi="Roboto"/>
-          <w:b/>
-          <w:bCs/>
-        </w:rPr>
-        <w:t>•</w:t>
-      </w:r>
-      <w:r>
-        <w:rPr>
-          <w:rFonts w:ascii="Roboto" w:hAnsi="Roboto"/>
-          <w:lang w:bidi="fa-IR"/>
-        </w:rPr>
-        <w:t xml:space="preserve"> </w:t>
-      </w:r>
-      <w:r>
-        <w:rPr>
-          <w:rFonts w:ascii="Roboto" w:hAnsi="Roboto"/>
-          <w:lang w:bidi="fa-IR"/>
-        </w:rPr>
-        <w:t xml:space="preserve">Computer Networks (20) </w:t>
-      </w:r>
-      <w:r>
-        <w:rPr>
-          <w:rFonts w:ascii="Roboto" w:hAnsi="Roboto"/>
-          <w:b/>
-          <w:bCs/>
-        </w:rPr>
-        <w:t>•</w:t>
-      </w:r>
-      <w:r>
-        <w:rPr>
-          <w:rFonts w:ascii="Roboto" w:hAnsi="Roboto"/>
-          <w:b/>
-          <w:bCs/>
-        </w:rPr>
-        <w:t xml:space="preserve"> </w:t>
-      </w:r>
-      <w:r>
-        <w:rPr>
-          <w:rFonts w:ascii="Roboto" w:hAnsi="Roboto"/>
-        </w:rPr>
-        <w:t>Advance Programming (20)</w:t>
+        <w:t>(20)</w:t>
       </w:r>
       <w:r>
         <w:rPr>
@@ -4387,7 +4783,7 @@
   <w:abstractNum w:abstractNumId="1" w15:restartNumberingAfterBreak="0">
     <w:nsid w:val="0E5F06E5"/>
     <w:multiLevelType w:val="hybridMultilevel"/>
-    <w:tmpl w:val="C2827382"/>
+    <w:tmpl w:val="D8AA82E2"/>
     <w:lvl w:ilvl="0" w:tplc="D24E8FCA">
       <w:start w:val="1"/>
       <w:numFmt w:val="bullet"/>
@@ -4952,6 +5348,119 @@
     </w:lvl>
   </w:abstractNum>
   <w:abstractNum w:abstractNumId="6" w15:restartNumberingAfterBreak="0">
+    <w:nsid w:val="4695169C"/>
+    <w:multiLevelType w:val="hybridMultilevel"/>
+    <w:tmpl w:val="1A1E70E0"/>
+    <w:lvl w:ilvl="0" w:tplc="04090001">
+      <w:start w:val="1"/>
+      <w:numFmt w:val="bullet"/>
+      <w:lvlText w:val=""/>
+      <w:lvlJc w:val="left"/>
+      <w:pPr>
+        <w:ind w:left="720" w:hanging="360"/>
+      </w:pPr>
+      <w:rPr>
+        <w:rFonts w:ascii="Symbol" w:hAnsi="Symbol" w:hint="default"/>
+      </w:rPr>
+    </w:lvl>
+    <w:lvl w:ilvl="1" w:tplc="04090003" w:tentative="1">
+      <w:start w:val="1"/>
+      <w:numFmt w:val="bullet"/>
+      <w:lvlText w:val="o"/>
+      <w:lvlJc w:val="left"/>
+      <w:pPr>
+        <w:ind w:left="1440" w:hanging="360"/>
+      </w:pPr>
+      <w:rPr>
+        <w:rFonts w:ascii="Courier New" w:hAnsi="Courier New" w:cs="Courier New" w:hint="default"/>
+      </w:rPr>
+    </w:lvl>
+    <w:lvl w:ilvl="2" w:tplc="04090005" w:tentative="1">
+      <w:start w:val="1"/>
+      <w:numFmt w:val="bullet"/>
+      <w:lvlText w:val=""/>
+      <w:lvlJc w:val="left"/>
+      <w:pPr>
+        <w:ind w:left="2160" w:hanging="360"/>
+      </w:pPr>
+      <w:rPr>
+        <w:rFonts w:ascii="Wingdings" w:hAnsi="Wingdings" w:hint="default"/>
+      </w:rPr>
+    </w:lvl>
+    <w:lvl w:ilvl="3" w:tplc="04090001" w:tentative="1">
+      <w:start w:val="1"/>
+      <w:numFmt w:val="bullet"/>
+      <w:lvlText w:val=""/>
+      <w:lvlJc w:val="left"/>
+      <w:pPr>
+        <w:ind w:left="2880" w:hanging="360"/>
+      </w:pPr>
+      <w:rPr>
+        <w:rFonts w:ascii="Symbol" w:hAnsi="Symbol" w:hint="default"/>
+      </w:rPr>
+    </w:lvl>
+    <w:lvl w:ilvl="4" w:tplc="04090003" w:tentative="1">
+      <w:start w:val="1"/>
+      <w:numFmt w:val="bullet"/>
+      <w:lvlText w:val="o"/>
+      <w:lvlJc w:val="left"/>
+      <w:pPr>
+        <w:ind w:left="3600" w:hanging="360"/>
+      </w:pPr>
+      <w:rPr>
+        <w:rFonts w:ascii="Courier New" w:hAnsi="Courier New" w:cs="Courier New" w:hint="default"/>
+      </w:rPr>
+    </w:lvl>
+    <w:lvl w:ilvl="5" w:tplc="04090005" w:tentative="1">
+      <w:start w:val="1"/>
+      <w:numFmt w:val="bullet"/>
+      <w:lvlText w:val=""/>
+      <w:lvlJc w:val="left"/>
+      <w:pPr>
+        <w:ind w:left="4320" w:hanging="360"/>
+      </w:pPr>
+      <w:rPr>
+        <w:rFonts w:ascii="Wingdings" w:hAnsi="Wingdings" w:hint="default"/>
+      </w:rPr>
+    </w:lvl>
+    <w:lvl w:ilvl="6" w:tplc="04090001" w:tentative="1">
+      <w:start w:val="1"/>
+      <w:numFmt w:val="bullet"/>
+      <w:lvlText w:val=""/>
+      <w:lvlJc w:val="left"/>
+      <w:pPr>
+        <w:ind w:left="5040" w:hanging="360"/>
+      </w:pPr>
+      <w:rPr>
+        <w:rFonts w:ascii="Symbol" w:hAnsi="Symbol" w:hint="default"/>
+      </w:rPr>
+    </w:lvl>
+    <w:lvl w:ilvl="7" w:tplc="04090003" w:tentative="1">
+      <w:start w:val="1"/>
+      <w:numFmt w:val="bullet"/>
+      <w:lvlText w:val="o"/>
+      <w:lvlJc w:val="left"/>
+      <w:pPr>
+        <w:ind w:left="5760" w:hanging="360"/>
+      </w:pPr>
+      <w:rPr>
+        <w:rFonts w:ascii="Courier New" w:hAnsi="Courier New" w:cs="Courier New" w:hint="default"/>
+      </w:rPr>
+    </w:lvl>
+    <w:lvl w:ilvl="8" w:tplc="04090005" w:tentative="1">
+      <w:start w:val="1"/>
+      <w:numFmt w:val="bullet"/>
+      <w:lvlText w:val=""/>
+      <w:lvlJc w:val="left"/>
+      <w:pPr>
+        <w:ind w:left="6480" w:hanging="360"/>
+      </w:pPr>
+      <w:rPr>
+        <w:rFonts w:ascii="Wingdings" w:hAnsi="Wingdings" w:hint="default"/>
+      </w:rPr>
+    </w:lvl>
+  </w:abstractNum>
+  <w:abstractNum w:abstractNumId="7" w15:restartNumberingAfterBreak="0">
     <w:nsid w:val="63E4684D"/>
     <w:multiLevelType w:val="hybridMultilevel"/>
     <w:tmpl w:val="DA266A96"/>
@@ -5037,7 +5546,7 @@
       </w:pPr>
     </w:lvl>
   </w:abstractNum>
-  <w:abstractNum w:abstractNumId="7" w15:restartNumberingAfterBreak="0">
+  <w:abstractNum w:abstractNumId="8" w15:restartNumberingAfterBreak="0">
     <w:nsid w:val="6A98188D"/>
     <w:multiLevelType w:val="hybridMultilevel"/>
     <w:tmpl w:val="FD7AF12C"/>
@@ -5150,7 +5659,7 @@
       </w:rPr>
     </w:lvl>
   </w:abstractNum>
-  <w:abstractNum w:abstractNumId="8" w15:restartNumberingAfterBreak="0">
+  <w:abstractNum w:abstractNumId="9" w15:restartNumberingAfterBreak="0">
     <w:nsid w:val="6DC55C6F"/>
     <w:multiLevelType w:val="hybridMultilevel"/>
     <w:tmpl w:val="9114288A"/>
@@ -5263,7 +5772,7 @@
       </w:rPr>
     </w:lvl>
   </w:abstractNum>
-  <w:abstractNum w:abstractNumId="9" w15:restartNumberingAfterBreak="0">
+  <w:abstractNum w:abstractNumId="10" w15:restartNumberingAfterBreak="0">
     <w:nsid w:val="6F2B0389"/>
     <w:multiLevelType w:val="hybridMultilevel"/>
     <w:tmpl w:val="502E43C2"/>
@@ -5376,7 +5885,7 @@
       </w:rPr>
     </w:lvl>
   </w:abstractNum>
-  <w:abstractNum w:abstractNumId="10" w15:restartNumberingAfterBreak="0">
+  <w:abstractNum w:abstractNumId="11" w15:restartNumberingAfterBreak="0">
     <w:nsid w:val="76EC1729"/>
     <w:multiLevelType w:val="hybridMultilevel"/>
     <w:tmpl w:val="486A5722"/>
@@ -5496,10 +6005,10 @@
     <w:abstractNumId w:val="2"/>
   </w:num>
   <w:num w:numId="3" w16cid:durableId="1372683249">
-    <w:abstractNumId w:val="7"/>
+    <w:abstractNumId w:val="8"/>
   </w:num>
   <w:num w:numId="4" w16cid:durableId="1218515743">
-    <w:abstractNumId w:val="10"/>
+    <w:abstractNumId w:val="11"/>
   </w:num>
   <w:num w:numId="5" w16cid:durableId="813181568">
     <w:abstractNumId w:val="0"/>
@@ -5508,19 +6017,22 @@
     <w:abstractNumId w:val="3"/>
   </w:num>
   <w:num w:numId="7" w16cid:durableId="972095975">
-    <w:abstractNumId w:val="6"/>
+    <w:abstractNumId w:val="7"/>
   </w:num>
   <w:num w:numId="8" w16cid:durableId="2097549485">
-    <w:abstractNumId w:val="8"/>
+    <w:abstractNumId w:val="9"/>
   </w:num>
   <w:num w:numId="9" w16cid:durableId="1232547508">
     <w:abstractNumId w:val="4"/>
   </w:num>
   <w:num w:numId="10" w16cid:durableId="807741970">
-    <w:abstractNumId w:val="9"/>
+    <w:abstractNumId w:val="10"/>
   </w:num>
   <w:num w:numId="11" w16cid:durableId="1251281186">
     <w:abstractNumId w:val="5"/>
+  </w:num>
+  <w:num w:numId="12" w16cid:durableId="1717239822">
+    <w:abstractNumId w:val="6"/>
   </w:num>
 </w:numbering>
 </file>

</xml_diff>

<commit_message>
Update the time of IELTS
</commit_message>
<xml_diff>
--- a/docs/Omid Reza Heidari.docx
+++ b/docs/Omid Reza Heidari.docx
@@ -2166,7 +2166,7 @@
           <w:rFonts w:ascii="Roboto" w:hAnsi="Roboto"/>
           <w:noProof/>
         </w:rPr>
-        <w:t>During the apprenticeship, I have learned about physical attributes, setting up, and maintaining data centers in banks.</w:t>
+        <w:t>During the apprenticeship, I learned about physical attributes, setting up, and maintaining data centers in banks.</w:t>
       </w:r>
     </w:p>
     <w:p>
@@ -3911,43 +3911,42 @@
           <w:rFonts w:ascii="Roboto" w:hAnsi="Roboto"/>
           <w:lang w:bidi="fa-IR"/>
         </w:rPr>
-        <w:t xml:space="preserve">IELTS exam </w:t>
-      </w:r>
-      <w:r>
-        <w:rPr>
-          <w:rFonts w:ascii="Roboto" w:hAnsi="Roboto"/>
-          <w:lang w:bidi="fa-IR"/>
-        </w:rPr>
-        <w:t>w</w:t>
-      </w:r>
-      <w:r>
-        <w:rPr>
-          <w:rFonts w:ascii="Roboto" w:hAnsi="Roboto"/>
-          <w:lang w:bidi="fa-IR"/>
-        </w:rPr>
-        <w:t xml:space="preserve">ill be taken in </w:t>
-      </w:r>
-      <w:r>
-        <w:rPr>
-          <w:rFonts w:ascii="Roboto" w:hAnsi="Roboto"/>
-          <w:lang w:bidi="fa-IR"/>
-        </w:rPr>
-        <w:t xml:space="preserve">the </w:t>
-      </w:r>
-      <w:r>
-        <w:rPr>
-          <w:rFonts w:ascii="Roboto" w:hAnsi="Roboto"/>
-          <w:lang w:bidi="fa-IR"/>
-        </w:rPr>
-        <w:t>5</w:t>
-      </w:r>
-      <w:r>
-        <w:rPr>
-          <w:rFonts w:ascii="Roboto" w:hAnsi="Roboto"/>
-          <w:vertAlign w:val="superscript"/>
-          <w:lang w:bidi="fa-IR"/>
-        </w:rPr>
-        <w:t>th</w:t>
+        <w:t xml:space="preserve">IELTS exam will be taken </w:t>
+      </w:r>
+      <w:r>
+        <w:rPr>
+          <w:rFonts w:ascii="Roboto" w:hAnsi="Roboto"/>
+          <w:lang w:bidi="fa-IR"/>
+        </w:rPr>
+        <w:t>on</w:t>
+      </w:r>
+      <w:r>
+        <w:rPr>
+          <w:rFonts w:ascii="Roboto" w:hAnsi="Roboto"/>
+          <w:lang w:bidi="fa-IR"/>
+        </w:rPr>
+        <w:t xml:space="preserve"> the </w:t>
+      </w:r>
+      <w:r>
+        <w:rPr>
+          <w:rFonts w:ascii="Roboto" w:hAnsi="Roboto"/>
+          <w:lang w:bidi="fa-IR"/>
+        </w:rPr>
+        <w:t>8</w:t>
+      </w:r>
+      <w:r>
+        <w:rPr>
+          <w:rFonts w:ascii="Roboto" w:hAnsi="Roboto"/>
+          <w:lang w:bidi="fa-IR"/>
+        </w:rPr>
+        <w:t xml:space="preserve">th of </w:t>
+      </w:r>
+      <w:r>
+        <w:rPr>
+          <w:rFonts w:ascii="Roboto" w:hAnsi="Roboto"/>
+          <w:lang w:bidi="fa-IR"/>
+        </w:rPr>
+        <w:t>October</w:t>
       </w:r>
       <w:r>
         <w:rPr>
@@ -3955,20 +3954,6 @@
           <w:lang w:bidi="fa-IR"/>
         </w:rPr>
         <w:t xml:space="preserve"> </w:t>
-      </w:r>
-      <w:r>
-        <w:rPr>
-          <w:rFonts w:ascii="Roboto" w:hAnsi="Roboto"/>
-          <w:lang w:bidi="fa-IR"/>
-        </w:rPr>
-        <w:t xml:space="preserve">of </w:t>
-      </w:r>
-      <w:r>
-        <w:rPr>
-          <w:rFonts w:ascii="Roboto" w:hAnsi="Roboto"/>
-          <w:lang w:bidi="fa-IR"/>
-        </w:rPr>
-        <w:t>September</w:t>
       </w:r>
     </w:p>
     <w:p>

</xml_diff>

<commit_message>
Add a few frameworks
</commit_message>
<xml_diff>
--- a/docs/Omid Reza Heidari.docx
+++ b/docs/Omid Reza Heidari.docx
@@ -3642,7 +3642,81 @@
           <w:rFonts w:ascii="Roboto" w:hAnsi="Roboto"/>
           <w:lang w:bidi="fa-IR"/>
         </w:rPr>
-        <w:t>Laravel, Lumen, Vue.js, Nuxt.js</w:t>
+        <w:t>PyTorch</w:t>
+      </w:r>
+      <w:r>
+        <w:rPr>
+          <w:rFonts w:ascii="Roboto" w:hAnsi="Roboto"/>
+          <w:lang w:bidi="fa-IR"/>
+        </w:rPr>
+        <w:t xml:space="preserve">, </w:t>
+      </w:r>
+      <w:r>
+        <w:rPr>
+          <w:rFonts w:ascii="Roboto" w:hAnsi="Roboto"/>
+          <w:lang w:bidi="fa-IR"/>
+        </w:rPr>
+        <w:t>TensorFlow</w:t>
+      </w:r>
+      <w:r>
+        <w:rPr>
+          <w:rFonts w:ascii="Roboto" w:hAnsi="Roboto"/>
+          <w:lang w:bidi="fa-IR"/>
+        </w:rPr>
+        <w:t>,</w:t>
+      </w:r>
+      <w:r>
+        <w:rPr>
+          <w:rFonts w:ascii="Roboto" w:hAnsi="Roboto"/>
+          <w:b/>
+          <w:bCs/>
+          <w:lang w:bidi="fa-IR"/>
+        </w:rPr>
+        <w:t xml:space="preserve"> </w:t>
+      </w:r>
+      <w:r>
+        <w:rPr>
+          <w:rFonts w:ascii="Roboto" w:hAnsi="Roboto"/>
+          <w:lang w:bidi="fa-IR"/>
+        </w:rPr>
+        <w:t>scikit-learn</w:t>
+      </w:r>
+      <w:r>
+        <w:rPr>
+          <w:rFonts w:ascii="Roboto" w:hAnsi="Roboto"/>
+          <w:lang w:bidi="fa-IR"/>
+        </w:rPr>
+        <w:t>,</w:t>
+      </w:r>
+      <w:r>
+        <w:rPr>
+          <w:rFonts w:ascii="Roboto" w:hAnsi="Roboto"/>
+          <w:b/>
+          <w:bCs/>
+          <w:lang w:bidi="fa-IR"/>
+        </w:rPr>
+        <w:t xml:space="preserve"> </w:t>
+      </w:r>
+      <w:r>
+        <w:rPr>
+          <w:rFonts w:ascii="Roboto" w:hAnsi="Roboto"/>
+          <w:lang w:bidi="fa-IR"/>
+        </w:rPr>
+        <w:t>Laravel,</w:t>
+      </w:r>
+      <w:r>
+        <w:rPr>
+          <w:rFonts w:ascii="Roboto" w:hAnsi="Roboto"/>
+          <w:lang w:bidi="fa-IR"/>
+        </w:rPr>
+        <w:t xml:space="preserve"> </w:t>
+      </w:r>
+      <w:r>
+        <w:rPr>
+          <w:rFonts w:ascii="Roboto" w:hAnsi="Roboto"/>
+          <w:lang w:bidi="fa-IR"/>
+        </w:rPr>
+        <w:t>Vue.js, Nuxt.js</w:t>
       </w:r>
     </w:p>
     <w:p>
@@ -3762,20 +3836,6 @@
           <w:lang w:bidi="fa-IR"/>
         </w:rPr>
         <w:t>, MongoDB</w:t>
-      </w:r>
-      <w:r>
-        <w:rPr>
-          <w:rFonts w:ascii="Roboto" w:hAnsi="Roboto"/>
-          <w:lang w:bidi="fa-IR"/>
-        </w:rPr>
-        <w:t xml:space="preserve">, </w:t>
-      </w:r>
-      <w:r>
-        <w:rPr>
-          <w:rFonts w:ascii="Roboto" w:hAnsi="Roboto"/>
-          <w:lang w:bidi="fa-IR"/>
-        </w:rPr>
-        <w:t>Cassandra</w:t>
       </w:r>
     </w:p>
     <w:p>

</xml_diff>

<commit_message>
Fix the date of IELTS exam
</commit_message>
<xml_diff>
--- a/docs/Omid Reza Heidari.docx
+++ b/docs/Omid Reza Heidari.docx
@@ -3642,28 +3642,7 @@
           <w:rFonts w:ascii="Roboto" w:hAnsi="Roboto"/>
           <w:lang w:bidi="fa-IR"/>
         </w:rPr>
-        <w:t>PyTorch</w:t>
-      </w:r>
-      <w:r>
-        <w:rPr>
-          <w:rFonts w:ascii="Roboto" w:hAnsi="Roboto"/>
-          <w:lang w:bidi="fa-IR"/>
-        </w:rPr>
-        <w:t xml:space="preserve">, </w:t>
-      </w:r>
-      <w:r>
-        <w:rPr>
-          <w:rFonts w:ascii="Roboto" w:hAnsi="Roboto"/>
-          <w:lang w:bidi="fa-IR"/>
-        </w:rPr>
-        <w:t>TensorFlow</w:t>
-      </w:r>
-      <w:r>
-        <w:rPr>
-          <w:rFonts w:ascii="Roboto" w:hAnsi="Roboto"/>
-          <w:lang w:bidi="fa-IR"/>
-        </w:rPr>
-        <w:t>,</w:t>
+        <w:t>PyTorch, TensorFlow,</w:t>
       </w:r>
       <w:r>
         <w:rPr>
@@ -3679,14 +3658,7 @@
           <w:rFonts w:ascii="Roboto" w:hAnsi="Roboto"/>
           <w:lang w:bidi="fa-IR"/>
         </w:rPr>
-        <w:t>scikit-learn</w:t>
-      </w:r>
-      <w:r>
-        <w:rPr>
-          <w:rFonts w:ascii="Roboto" w:hAnsi="Roboto"/>
-          <w:lang w:bidi="fa-IR"/>
-        </w:rPr>
-        <w:t>,</w:t>
+        <w:t>scikit-learn,</w:t>
       </w:r>
       <w:r>
         <w:rPr>
@@ -3992,28 +3964,21 @@
           <w:rFonts w:ascii="Roboto" w:hAnsi="Roboto"/>
           <w:lang w:bidi="fa-IR"/>
         </w:rPr>
-        <w:t>8</w:t>
-      </w:r>
-      <w:r>
-        <w:rPr>
-          <w:rFonts w:ascii="Roboto" w:hAnsi="Roboto"/>
-          <w:lang w:bidi="fa-IR"/>
-        </w:rPr>
-        <w:t xml:space="preserve">th of </w:t>
-      </w:r>
-      <w:r>
-        <w:rPr>
-          <w:rFonts w:ascii="Roboto" w:hAnsi="Roboto"/>
-          <w:lang w:bidi="fa-IR"/>
-        </w:rPr>
-        <w:t>October</w:t>
-      </w:r>
-      <w:r>
-        <w:rPr>
-          <w:rFonts w:ascii="Roboto" w:hAnsi="Roboto"/>
-          <w:lang w:bidi="fa-IR"/>
-        </w:rPr>
-        <w:t xml:space="preserve"> </w:t>
+        <w:t>21</w:t>
+      </w:r>
+      <w:r>
+        <w:rPr>
+          <w:rFonts w:ascii="Roboto" w:hAnsi="Roboto"/>
+          <w:lang w:bidi="fa-IR"/>
+        </w:rPr>
+        <w:t>th of</w:t>
+      </w:r>
+      <w:r>
+        <w:rPr>
+          <w:rFonts w:ascii="Roboto" w:hAnsi="Roboto"/>
+          <w:lang w:bidi="fa-IR"/>
+        </w:rPr>
+        <w:t xml:space="preserve"> November</w:t>
       </w:r>
     </w:p>
     <w:p>

</xml_diff>

<commit_message>
Add a new reference & link a title to a GitHub repo
</commit_message>
<xml_diff>
--- a/docs/Omid Reza Heidari.docx
+++ b/docs/Omid Reza Heidari.docx
@@ -1377,12 +1377,16 @@
         </w:rPr>
         <w:t xml:space="preserve"> </w:t>
       </w:r>
-      <w:r>
-        <w:rPr>
-          <w:rFonts w:ascii="Roboto" w:hAnsi="Roboto"/>
-        </w:rPr>
-        <w:t>Machin Learning</w:t>
-      </w:r>
+      <w:hyperlink r:id="rId12" w:history="1">
+        <w:r>
+          <w:rPr>
+            <w:rStyle w:val="Hyperlink"/>
+            <w:rFonts w:ascii="Roboto" w:hAnsi="Roboto"/>
+            <w:u w:val="none"/>
+          </w:rPr>
+          <w:t>Machin Learning</w:t>
+        </w:r>
+      </w:hyperlink>
       <w:r>
         <w:rPr>
           <w:rFonts w:ascii="Roboto" w:hAnsi="Roboto"/>
@@ -1541,7 +1545,7 @@
         </w:rPr>
         <w:t xml:space="preserve"> </w:t>
       </w:r>
-      <w:hyperlink r:id="rId12" w:history="1">
+      <w:hyperlink r:id="rId13" w:history="1">
         <w:r>
           <w:rPr>
             <w:rStyle w:val="Hyperlink"/>
@@ -1740,7 +1744,7 @@
         </w:rPr>
         <w:t xml:space="preserve"> </w:t>
       </w:r>
-      <w:hyperlink r:id="rId13" w:history="1">
+      <w:hyperlink r:id="rId14" w:history="1">
         <w:r>
           <w:rPr>
             <w:rStyle w:val="Hyperlink"/>
@@ -1887,7 +1891,7 @@
         </w:rPr>
         <w:t xml:space="preserve">Teaching Assistant, </w:t>
       </w:r>
-      <w:hyperlink r:id="rId14" w:history="1">
+      <w:hyperlink r:id="rId15" w:history="1">
         <w:r>
           <w:rPr>
             <w:rStyle w:val="Hyperlink"/>
@@ -2347,7 +2351,7 @@
         </w:rPr>
         <w:t xml:space="preserve">Title: </w:t>
       </w:r>
-      <w:hyperlink r:id="rId15" w:history="1">
+      <w:hyperlink r:id="rId16" w:history="1">
         <w:r>
           <w:rPr>
             <w:rStyle w:val="Hyperlink"/>
@@ -2488,7 +2492,7 @@
         </w:rPr>
         <w:t xml:space="preserve">: </w:t>
       </w:r>
-      <w:hyperlink r:id="rId16" w:history="1">
+      <w:hyperlink r:id="rId17" w:history="1">
         <w:r>
           <w:rPr>
             <w:rStyle w:val="Hyperlink"/>
@@ -2620,7 +2624,7 @@
         </w:rPr>
         <w:t xml:space="preserve">: </w:t>
       </w:r>
-      <w:hyperlink r:id="rId17" w:history="1">
+      <w:hyperlink r:id="rId18" w:history="1">
         <w:r>
           <w:rPr>
             <w:rStyle w:val="Hyperlink"/>
@@ -3222,7 +3226,7 @@
         </w:rPr>
         <w:tab/>
       </w:r>
-      <w:hyperlink r:id="rId18" w:history="1">
+      <w:hyperlink r:id="rId19" w:history="1">
         <w:r>
           <w:rPr>
             <w:rStyle w:val="Hyperlink"/>
@@ -3273,7 +3277,7 @@
         </w:rPr>
         <w:tab/>
       </w:r>
-      <w:hyperlink r:id="rId19" w:history="1">
+      <w:hyperlink r:id="rId20" w:history="1">
         <w:r>
           <w:rPr>
             <w:rStyle w:val="Hyperlink"/>
@@ -3338,7 +3342,7 @@
         </w:rPr>
         <w:tab/>
       </w:r>
-      <w:hyperlink r:id="rId20" w:history="1">
+      <w:hyperlink r:id="rId21" w:history="1">
         <w:r>
           <w:rPr>
             <w:rStyle w:val="Hyperlink"/>
@@ -4091,7 +4095,8 @@
     <w:tbl>
       <w:tblPr>
         <w:tblStyle w:val="TableGrid"/>
-        <w:tblW w:w="10063" w:type="dxa"/>
+        <w:tblW w:w="9810" w:type="dxa"/>
+        <w:jc w:val="center"/>
         <w:tblBorders>
           <w:top w:val="none" w:sz="0" w:space="0" w:color="auto"/>
           <w:left w:val="none" w:sz="0" w:space="0" w:color="auto"/>
@@ -4103,16 +4108,146 @@
         <w:tblLook w:val="04A0" w:firstRow="1" w:lastRow="0" w:firstColumn="1" w:lastColumn="0" w:noHBand="0" w:noVBand="1"/>
       </w:tblPr>
       <w:tblGrid>
-        <w:gridCol w:w="4828"/>
-        <w:gridCol w:w="5235"/>
+        <w:gridCol w:w="5040"/>
+        <w:gridCol w:w="4770"/>
       </w:tblGrid>
       <w:tr>
         <w:trPr>
           <w:trHeight w:val="1080"/>
+          <w:jc w:val="center"/>
         </w:trPr>
         <w:tc>
           <w:tcPr>
-            <w:tcW w:w="4828" w:type="dxa"/>
+            <w:tcW w:w="5040" w:type="dxa"/>
+          </w:tcPr>
+          <w:p>
+            <w:pPr>
+              <w:rPr>
+                <w:rStyle w:val="mr1"/>
+                <w:rFonts w:ascii="Roboto" w:hAnsi="Roboto"/>
+                <w:rtl/>
+              </w:rPr>
+            </w:pPr>
+            <w:hyperlink r:id="rId22" w:history="1">
+              <w:r>
+                <w:rPr>
+                  <w:rStyle w:val="Hyperlink"/>
+                  <w:rFonts w:ascii="Roboto" w:hAnsi="Roboto"/>
+                  <w:u w:val="none"/>
+                  <w:lang w:bidi="fa-IR"/>
+                </w:rPr>
+                <w:t>Dr. Mohsen</w:t>
+              </w:r>
+              <w:r>
+                <w:rPr>
+                  <w:rStyle w:val="Hyperlink"/>
+                  <w:rFonts w:ascii="Roboto" w:hAnsi="Roboto"/>
+                  <w:u w:val="none"/>
+                  <w:lang w:bidi="fa-IR"/>
+                </w:rPr>
+                <w:t xml:space="preserve"> </w:t>
+              </w:r>
+              <w:r>
+                <w:rPr>
+                  <w:rStyle w:val="Hyperlink"/>
+                  <w:rFonts w:ascii="Roboto" w:hAnsi="Roboto"/>
+                  <w:u w:val="none"/>
+                  <w:lang w:bidi="fa-IR"/>
+                </w:rPr>
+                <w:t>Dadashi</w:t>
+              </w:r>
+            </w:hyperlink>
+            <w:r>
+              <w:rPr>
+                <w:rFonts w:ascii="Roboto" w:hAnsi="Roboto"/>
+                <w:lang w:bidi="fa-IR"/>
+              </w:rPr>
+              <w:t xml:space="preserve">, </w:t>
+            </w:r>
+            <w:r>
+              <w:rPr>
+                <w:rStyle w:val="mr1"/>
+                <w:rFonts w:ascii="Roboto" w:hAnsi="Roboto"/>
+              </w:rPr>
+              <w:t>Associate Professor</w:t>
+            </w:r>
+          </w:p>
+          <w:p>
+            <w:pPr>
+              <w:rPr>
+                <w:rFonts w:ascii="Roboto" w:hAnsi="Roboto"/>
+                <w:lang w:bidi="fa-IR"/>
+              </w:rPr>
+            </w:pPr>
+            <w:r>
+              <w:rPr>
+                <w:rFonts w:ascii="Roboto" w:hAnsi="Roboto"/>
+                <w:lang w:bidi="fa-IR"/>
+              </w:rPr>
+              <w:t xml:space="preserve">Faculty of Medicine, </w:t>
+            </w:r>
+            <w:r>
+              <w:rPr>
+                <w:rFonts w:ascii="Roboto" w:hAnsi="Roboto"/>
+                <w:lang w:bidi="fa-IR"/>
+              </w:rPr>
+              <w:t>Zanjan University of Medical Sciences</w:t>
+            </w:r>
+          </w:p>
+          <w:p>
+            <w:pPr>
+              <w:rPr>
+                <w:rFonts w:ascii="Roboto" w:hAnsi="Roboto"/>
+                <w:lang w:bidi="fa-IR"/>
+              </w:rPr>
+            </w:pPr>
+            <w:r>
+              <w:rPr>
+                <w:rFonts w:ascii="Roboto" w:hAnsi="Roboto"/>
+                <w:lang w:bidi="fa-IR"/>
+              </w:rPr>
+              <w:t>Tel: (+98) 9127433559</w:t>
+            </w:r>
+          </w:p>
+          <w:p>
+            <w:pPr>
+              <w:rPr>
+                <w:rFonts w:ascii="Roboto" w:hAnsi="Roboto"/>
+              </w:rPr>
+            </w:pPr>
+            <w:r>
+              <w:rPr>
+                <w:rFonts w:ascii="Roboto" w:hAnsi="Roboto"/>
+                <w:lang w:bidi="fa-IR"/>
+              </w:rPr>
+              <w:t>Email:</w:t>
+            </w:r>
+            <w:r>
+              <w:t xml:space="preserve"> </w:t>
+            </w:r>
+            <w:hyperlink r:id="rId23" w:history="1">
+              <w:r>
+                <w:rPr>
+                  <w:rStyle w:val="Hyperlink"/>
+                  <w:rFonts w:ascii="Roboto" w:hAnsi="Roboto"/>
+                  <w:u w:val="none"/>
+                </w:rPr>
+                <w:t>mohsendadashi@zums.ac.ir</w:t>
+              </w:r>
+            </w:hyperlink>
+          </w:p>
+          <w:p>
+            <w:pPr>
+              <w:rPr>
+                <w:rFonts w:ascii="Roboto" w:hAnsi="Roboto"/>
+                <w:lang w:bidi="fa-IR"/>
+              </w:rPr>
+            </w:pPr>
+          </w:p>
+        </w:tc>
+        <w:tc>
+          <w:tcPr>
+            <w:tcW w:w="4770" w:type="dxa"/>
           </w:tcPr>
           <w:p>
             <w:pPr>
@@ -4122,7 +4257,7 @@
                 <w:lang w:bidi="fa-IR"/>
               </w:rPr>
             </w:pPr>
-            <w:hyperlink r:id="rId21" w:history="1">
+            <w:hyperlink r:id="rId24" w:history="1">
               <w:r>
                 <w:rPr>
                   <w:rStyle w:val="Hyperlink"/>
@@ -4229,7 +4364,7 @@
               </w:rPr>
               <w:t xml:space="preserve">Email: </w:t>
             </w:r>
-            <w:hyperlink r:id="rId22" w:history="1">
+            <w:hyperlink r:id="rId25" w:history="1">
               <w:r>
                 <w:rPr>
                   <w:rStyle w:val="Hyperlink"/>
@@ -4242,9 +4377,15 @@
             </w:hyperlink>
           </w:p>
         </w:tc>
+      </w:tr>
+      <w:tr>
+        <w:trPr>
+          <w:trHeight w:val="1113"/>
+          <w:jc w:val="center"/>
+        </w:trPr>
         <w:tc>
           <w:tcPr>
-            <w:tcW w:w="5235" w:type="dxa"/>
+            <w:tcW w:w="5040" w:type="dxa"/>
           </w:tcPr>
           <w:p>
             <w:pPr>
@@ -4253,7 +4394,7 @@
                 <w:lang w:bidi="fa-IR"/>
               </w:rPr>
             </w:pPr>
-            <w:hyperlink r:id="rId23" w:history="1">
+            <w:hyperlink r:id="rId26" w:history="1">
               <w:r>
                 <w:rPr>
                   <w:rStyle w:val="Hyperlink"/>
@@ -4348,7 +4489,7 @@
               </w:rPr>
               <w:t xml:space="preserve">Email: </w:t>
             </w:r>
-            <w:hyperlink r:id="rId24" w:history="1">
+            <w:hyperlink r:id="rId27" w:history="1">
               <w:r>
                 <w:rPr>
                   <w:rStyle w:val="Hyperlink"/>
@@ -4360,27 +4501,10 @@
               </w:r>
             </w:hyperlink>
           </w:p>
-          <w:p>
-            <w:pPr>
-              <w:rPr>
-                <w:rFonts w:ascii="Roboto" w:hAnsi="Roboto"/>
-                <w:b/>
-                <w:bCs/>
-                <w:sz w:val="28"/>
-                <w:szCs w:val="28"/>
-                <w:lang w:bidi="fa-IR"/>
-              </w:rPr>
-            </w:pPr>
-          </w:p>
         </w:tc>
-      </w:tr>
-      <w:tr>
-        <w:trPr>
-          <w:trHeight w:val="1113"/>
-        </w:trPr>
         <w:tc>
           <w:tcPr>
-            <w:tcW w:w="4828" w:type="dxa"/>
+            <w:tcW w:w="4770" w:type="dxa"/>
           </w:tcPr>
           <w:p>
             <w:pPr>
@@ -4392,7 +4516,7 @@
                 <w:lang w:bidi="fa-IR"/>
               </w:rPr>
             </w:pPr>
-            <w:hyperlink r:id="rId25" w:history="1">
+            <w:hyperlink r:id="rId28" w:history="1">
               <w:r>
                 <w:rPr>
                   <w:rStyle w:val="Hyperlink"/>
@@ -4424,7 +4548,8 @@
           <w:p>
             <w:pPr>
               <w:rPr>
-                <w:rFonts w:ascii="Roboto" w:hAnsi="Roboto"/>
+                <w:rFonts w:ascii="Roboto" w:hAnsi="Roboto" w:hint="cs"/>
+                <w:rtl/>
                 <w:lang w:bidi="fa-IR"/>
               </w:rPr>
             </w:pPr>
@@ -4486,7 +4611,7 @@
               </w:rPr>
               <w:t xml:space="preserve">Email: </w:t>
             </w:r>
-            <w:hyperlink r:id="rId26" w:history="1">
+            <w:hyperlink r:id="rId29" w:history="1">
               <w:r>
                 <w:rPr>
                   <w:rStyle w:val="Hyperlink"/>
@@ -4499,23 +4624,6 @@
             </w:hyperlink>
           </w:p>
         </w:tc>
-        <w:tc>
-          <w:tcPr>
-            <w:tcW w:w="5235" w:type="dxa"/>
-          </w:tcPr>
-          <w:p>
-            <w:pPr>
-              <w:rPr>
-                <w:rFonts w:ascii="Roboto" w:hAnsi="Roboto"/>
-                <w:b/>
-                <w:bCs/>
-                <w:sz w:val="28"/>
-                <w:szCs w:val="28"/>
-                <w:lang w:bidi="fa-IR"/>
-              </w:rPr>
-            </w:pPr>
-          </w:p>
-        </w:tc>
       </w:tr>
     </w:tbl>
     <w:p>
@@ -4528,7 +4636,7 @@
       </w:pPr>
     </w:p>
     <w:sectPr>
-      <w:footerReference w:type="default" r:id="rId27"/>
+      <w:footerReference w:type="default" r:id="rId30"/>
       <w:pgSz w:w="12240" w:h="15840"/>
       <w:pgMar w:top="1440" w:right="1440" w:bottom="1440" w:left="1440" w:header="720" w:footer="720" w:gutter="0"/>
       <w:pgBorders w:offsetFrom="page">
@@ -6639,6 +6747,11 @@
       </w:tblBorders>
     </w:tblPr>
   </w:style>
+  <w:style w:type="character" w:customStyle="1" w:styleId="mr1">
+    <w:name w:val="mr1"/>
+    <w:basedOn w:val="DefaultParagraphFont"/>
+    <w:rsid w:val="00296481"/>
+  </w:style>
 </w:styles>
 </file>
 

</xml_diff>

<commit_message>
Update the date of the IELTS exam
</commit_message>
<xml_diff>
--- a/docs/Omid Reza Heidari.docx
+++ b/docs/Omid Reza Heidari.docx
@@ -3968,14 +3968,14 @@
           <w:rFonts w:ascii="Roboto" w:hAnsi="Roboto"/>
           <w:lang w:bidi="fa-IR"/>
         </w:rPr>
-        <w:t>21</w:t>
-      </w:r>
-      <w:r>
-        <w:rPr>
-          <w:rFonts w:ascii="Roboto" w:hAnsi="Roboto"/>
-          <w:lang w:bidi="fa-IR"/>
-        </w:rPr>
-        <w:t>th of</w:t>
+        <w:t>2nd</w:t>
+      </w:r>
+      <w:r>
+        <w:rPr>
+          <w:rFonts w:ascii="Roboto" w:hAnsi="Roboto"/>
+          <w:lang w:bidi="fa-IR"/>
+        </w:rPr>
+        <w:t xml:space="preserve"> of</w:t>
       </w:r>
       <w:r>
         <w:rPr>
@@ -4136,25 +4136,7 @@
                   <w:u w:val="none"/>
                   <w:lang w:bidi="fa-IR"/>
                 </w:rPr>
-                <w:t>Dr. Mohsen</w:t>
-              </w:r>
-              <w:r>
-                <w:rPr>
-                  <w:rStyle w:val="Hyperlink"/>
-                  <w:rFonts w:ascii="Roboto" w:hAnsi="Roboto"/>
-                  <w:u w:val="none"/>
-                  <w:lang w:bidi="fa-IR"/>
-                </w:rPr>
-                <w:t xml:space="preserve"> </w:t>
-              </w:r>
-              <w:r>
-                <w:rPr>
-                  <w:rStyle w:val="Hyperlink"/>
-                  <w:rFonts w:ascii="Roboto" w:hAnsi="Roboto"/>
-                  <w:u w:val="none"/>
-                  <w:lang w:bidi="fa-IR"/>
-                </w:rPr>
-                <w:t>Dadashi</w:t>
+                <w:t>Dr. Mohsen Dadashi</w:t>
               </w:r>
             </w:hyperlink>
             <w:r>
@@ -4548,7 +4530,7 @@
           <w:p>
             <w:pPr>
               <w:rPr>
-                <w:rFonts w:ascii="Roboto" w:hAnsi="Roboto" w:hint="cs"/>
+                <w:rFonts w:ascii="Roboto" w:hAnsi="Roboto"/>
                 <w:rtl/>
                 <w:lang w:bidi="fa-IR"/>
               </w:rPr>

</xml_diff>

<commit_message>
Fix the font of some parts
</commit_message>
<xml_diff>
--- a/docs/Omid Reza Heidari.docx
+++ b/docs/Omid Reza Heidari.docx
@@ -1111,11 +1111,19 @@
           <w:rFonts w:ascii="Roboto" w:hAnsi="Roboto"/>
           <w:lang w:bidi="fa-IR"/>
         </w:rPr>
-        <w:t xml:space="preserve"> Collect, Prepare, and Analyze </w:t>
+        <w:t xml:space="preserve"> </w:t>
+      </w:r>
+      <w:r>
+        <w:rPr>
+          <w:rFonts w:ascii="Roboto" w:hAnsi="Roboto"/>
+          <w:lang w:bidi="fa-IR"/>
+        </w:rPr>
+        <w:t xml:space="preserve">Collect, Prepare, and Analyze </w:t>
       </w:r>
       <w:r>
         <w:rPr>
           <w:rStyle w:val="hgkelc"/>
+          <w:rFonts w:ascii="Roboto" w:hAnsi="Roboto"/>
         </w:rPr>
         <w:t>Electroencephalogram</w:t>
       </w:r>
@@ -2678,21 +2686,7 @@
           <w:rFonts w:ascii="Roboto" w:hAnsi="Roboto"/>
           <w:lang w:bidi="fa-IR"/>
         </w:rPr>
-        <w:t xml:space="preserve">The open-source project that helps </w:t>
-      </w:r>
-      <w:r>
-        <w:rPr>
-          <w:rFonts w:ascii="Roboto" w:hAnsi="Roboto"/>
-          <w:lang w:bidi="fa-IR"/>
-        </w:rPr>
-        <w:t xml:space="preserve">database </w:t>
-      </w:r>
-      <w:r>
-        <w:rPr>
-          <w:rFonts w:ascii="Roboto" w:hAnsi="Roboto"/>
-          <w:lang w:bidi="fa-IR"/>
-        </w:rPr>
-        <w:t>administrators to manage Redis servers</w:t>
+        <w:t>The open-source project that helps database administrators to manage Redis servers</w:t>
       </w:r>
     </w:p>
     <w:p>
@@ -4166,14 +4160,7 @@
                 <w:rFonts w:ascii="Roboto" w:hAnsi="Roboto"/>
                 <w:lang w:bidi="fa-IR"/>
               </w:rPr>
-              <w:t xml:space="preserve">Faculty of Medicine, </w:t>
-            </w:r>
-            <w:r>
-              <w:rPr>
-                <w:rFonts w:ascii="Roboto" w:hAnsi="Roboto"/>
-                <w:lang w:bidi="fa-IR"/>
-              </w:rPr>
-              <w:t>Zanjan University of Medical Sciences</w:t>
+              <w:t>Faculty of Medicine, Zanjan University of Medical Sciences</w:t>
             </w:r>
           </w:p>
           <w:p>
@@ -4205,6 +4192,9 @@
               <w:t>Email:</w:t>
             </w:r>
             <w:r>
+              <w:rPr>
+                <w:rFonts w:ascii="Roboto" w:hAnsi="Roboto"/>
+              </w:rPr>
               <w:t xml:space="preserve"> </w:t>
             </w:r>
             <w:hyperlink r:id="rId23" w:history="1">
@@ -4289,21 +4279,7 @@
                 <w:rFonts w:ascii="Roboto" w:hAnsi="Roboto"/>
                 <w:lang w:bidi="fa-IR"/>
               </w:rPr>
-              <w:t>Department of Computer</w:t>
-            </w:r>
-            <w:r>
-              <w:rPr>
-                <w:rFonts w:ascii="Roboto" w:hAnsi="Roboto"/>
-                <w:lang w:bidi="fa-IR"/>
-              </w:rPr>
-              <w:t xml:space="preserve">, </w:t>
-            </w:r>
-            <w:r>
-              <w:rPr>
-                <w:rFonts w:ascii="Roboto" w:hAnsi="Roboto"/>
-                <w:lang w:bidi="fa-IR"/>
-              </w:rPr>
-              <w:t>University of Zanjan</w:t>
+              <w:t>Department of Computer, University of Zanjan</w:t>
             </w:r>
           </w:p>
           <w:p>
@@ -4318,14 +4294,7 @@
                 <w:rFonts w:ascii="Roboto" w:hAnsi="Roboto"/>
                 <w:lang w:bidi="fa-IR"/>
               </w:rPr>
-              <w:t>Tel</w:t>
-            </w:r>
-            <w:r>
-              <w:rPr>
-                <w:rFonts w:ascii="Roboto" w:hAnsi="Roboto"/>
-                <w:lang w:bidi="fa-IR"/>
-              </w:rPr>
-              <w:t>: (+98) 9356661037</w:t>
+              <w:t>Tel: (+98) 9356661037</w:t>
             </w:r>
           </w:p>
           <w:p>
@@ -4400,6 +4369,7 @@
             <w:r>
               <w:rPr>
                 <w:rStyle w:val="Hyperlink"/>
+                <w:rFonts w:ascii="Roboto" w:hAnsi="Roboto"/>
                 <w:u w:val="none"/>
               </w:rPr>
               <w:t xml:space="preserve"> </w:t>
@@ -4424,21 +4394,7 @@
                 <w:rFonts w:ascii="Roboto" w:hAnsi="Roboto"/>
                 <w:lang w:bidi="fa-IR"/>
               </w:rPr>
-              <w:t>Department of Computer</w:t>
-            </w:r>
-            <w:r>
-              <w:rPr>
-                <w:rFonts w:ascii="Roboto" w:hAnsi="Roboto"/>
-                <w:lang w:bidi="fa-IR"/>
-              </w:rPr>
-              <w:t xml:space="preserve">, </w:t>
-            </w:r>
-            <w:r>
-              <w:rPr>
-                <w:rFonts w:ascii="Roboto" w:hAnsi="Roboto"/>
-                <w:lang w:bidi="fa-IR"/>
-              </w:rPr>
-              <w:t>Islamic Azad University</w:t>
+              <w:t>Department of Computer, Islamic Azad University</w:t>
             </w:r>
           </w:p>
           <w:p>
@@ -4540,21 +4496,7 @@
                 <w:rFonts w:ascii="Roboto" w:hAnsi="Roboto"/>
                 <w:lang w:bidi="fa-IR"/>
               </w:rPr>
-              <w:t>Department of Computer</w:t>
-            </w:r>
-            <w:r>
-              <w:rPr>
-                <w:rFonts w:ascii="Roboto" w:hAnsi="Roboto"/>
-                <w:lang w:bidi="fa-IR"/>
-              </w:rPr>
-              <w:t xml:space="preserve">, </w:t>
-            </w:r>
-            <w:r>
-              <w:rPr>
-                <w:rFonts w:ascii="Roboto" w:hAnsi="Roboto"/>
-                <w:lang w:bidi="fa-IR"/>
-              </w:rPr>
-              <w:t>University of Zanjan</w:t>
+              <w:t>Department of Computer, University of Zanjan</w:t>
             </w:r>
           </w:p>
           <w:p>
@@ -4569,14 +4511,7 @@
                 <w:rFonts w:ascii="Roboto" w:hAnsi="Roboto"/>
                 <w:lang w:bidi="fa-IR"/>
               </w:rPr>
-              <w:t>Tel</w:t>
-            </w:r>
-            <w:r>
-              <w:rPr>
-                <w:rFonts w:ascii="Roboto" w:hAnsi="Roboto"/>
-                <w:lang w:bidi="fa-IR"/>
-              </w:rPr>
-              <w:t>: (+98) 9127403049</w:t>
+              <w:t>Tel: (+98) 9127403049</w:t>
             </w:r>
           </w:p>
           <w:p>

</xml_diff>

<commit_message>
Update the IELTS score
</commit_message>
<xml_diff>
--- a/docs/Omid Reza Heidari.docx
+++ b/docs/Omid Reza Heidari.docx
@@ -3941,42 +3941,23 @@
           <w:rFonts w:ascii="Roboto" w:hAnsi="Roboto"/>
           <w:lang w:bidi="fa-IR"/>
         </w:rPr>
-        <w:t xml:space="preserve">IELTS exam will be taken </w:t>
-      </w:r>
-      <w:r>
-        <w:rPr>
-          <w:rFonts w:ascii="Roboto" w:hAnsi="Roboto"/>
-          <w:lang w:bidi="fa-IR"/>
-        </w:rPr>
-        <w:t>on</w:t>
-      </w:r>
-      <w:r>
-        <w:rPr>
-          <w:rFonts w:ascii="Roboto" w:hAnsi="Roboto"/>
-          <w:lang w:bidi="fa-IR"/>
-        </w:rPr>
-        <w:t xml:space="preserve"> the </w:t>
-      </w:r>
-      <w:r>
-        <w:rPr>
-          <w:rFonts w:ascii="Roboto" w:hAnsi="Roboto"/>
-          <w:lang w:bidi="fa-IR"/>
-        </w:rPr>
-        <w:t>2nd</w:t>
-      </w:r>
-      <w:r>
-        <w:rPr>
-          <w:rFonts w:ascii="Roboto" w:hAnsi="Roboto"/>
-          <w:lang w:bidi="fa-IR"/>
-        </w:rPr>
-        <w:t xml:space="preserve"> of</w:t>
-      </w:r>
-      <w:r>
-        <w:rPr>
-          <w:rFonts w:ascii="Roboto" w:hAnsi="Roboto"/>
-          <w:lang w:bidi="fa-IR"/>
-        </w:rPr>
-        <w:t xml:space="preserve"> November</w:t>
+        <w:t>IELTS</w:t>
+      </w:r>
+      <w:r>
+        <w:rPr>
+          <w:rFonts w:ascii="Roboto" w:hAnsi="Roboto"/>
+          <w:b/>
+          <w:bCs/>
+          <w:lang w:bidi="fa-IR"/>
+        </w:rPr>
+        <w:t xml:space="preserve"> </w:t>
+      </w:r>
+      <w:r>
+        <w:rPr>
+          <w:rFonts w:ascii="Roboto" w:hAnsi="Roboto"/>
+          <w:lang w:bidi="fa-IR"/>
+        </w:rPr>
+        <w:t>7</w:t>
       </w:r>
     </w:p>
     <w:p>

</xml_diff>

<commit_message>
Add publication section to the website and CV
</commit_message>
<xml_diff>
--- a/docs/Omid Reza Heidari.docx
+++ b/docs/Omid Reza Heidari.docx
@@ -1243,7 +1243,29 @@
           <w:sz w:val="20"/>
           <w:szCs w:val="20"/>
         </w:rPr>
-        <w:t xml:space="preserve">Method: </w:t>
+        <w:t>Method</w:t>
+      </w:r>
+      <w:r>
+        <w:rPr>
+          <w:rFonts w:asciiTheme="minorBidi" w:hAnsiTheme="minorBidi"/>
+          <w:b/>
+          <w:bCs/>
+          <w:color w:val="4C4D4F"/>
+          <w:sz w:val="20"/>
+          <w:szCs w:val="20"/>
+        </w:rPr>
+        <w:t>s</w:t>
+      </w:r>
+      <w:r>
+        <w:rPr>
+          <w:rFonts w:asciiTheme="minorBidi" w:hAnsiTheme="minorBidi"/>
+          <w:b/>
+          <w:bCs/>
+          <w:color w:val="4C4D4F"/>
+          <w:sz w:val="20"/>
+          <w:szCs w:val="20"/>
+        </w:rPr>
+        <w:t xml:space="preserve">: </w:t>
       </w:r>
       <w:r>
         <w:rPr>
@@ -2135,6 +2157,119 @@
           <w:rFonts w:asciiTheme="minorBidi" w:hAnsiTheme="minorBidi"/>
           <w:b/>
           <w:bCs/>
+          <w:color w:val="4B4C4E"/>
+          <w:sz w:val="24"/>
+          <w:szCs w:val="24"/>
+        </w:rPr>
+      </w:pPr>
+      <w:r>
+        <w:rPr>
+          <w:rFonts w:asciiTheme="minorBidi" w:hAnsiTheme="minorBidi"/>
+          <w:b/>
+          <w:bCs/>
+          <w:color w:val="4B4C4E"/>
+          <w:sz w:val="24"/>
+          <w:szCs w:val="24"/>
+        </w:rPr>
+        <w:t>PUBLICATIONS</w:t>
+      </w:r>
+    </w:p>
+    <w:p>
+      <w:pPr>
+        <w:rPr>
+          <w:rFonts w:asciiTheme="minorBidi" w:hAnsiTheme="minorBidi"/>
+          <w:b/>
+          <w:bCs/>
+          <w:color w:val="4B4C4E"/>
+          <w:sz w:val="20"/>
+          <w:szCs w:val="20"/>
+          <w:lang w:bidi="fa-IR"/>
+        </w:rPr>
+      </w:pPr>
+      <w:r>
+        <w:rPr>
+          <w:rFonts w:asciiTheme="minorBidi" w:hAnsiTheme="minorBidi"/>
+          <w:b/>
+          <w:bCs/>
+          <w:color w:val="4B4C4E"/>
+          <w:sz w:val="20"/>
+          <w:szCs w:val="20"/>
+          <w:lang w:bidi="fa-IR"/>
+        </w:rPr>
+        <w:t>Works in preparation</w:t>
+      </w:r>
+    </w:p>
+    <w:p>
+      <w:pPr>
+        <w:pStyle w:val="ListParagraph"/>
+        <w:numPr>
+          <w:ilvl w:val="0"/>
+          <w:numId w:val="13"/>
+        </w:numPr>
+        <w:rPr>
+          <w:rFonts w:asciiTheme="minorBidi" w:hAnsiTheme="minorBidi"/>
+          <w:b/>
+          <w:bCs/>
+          <w:color w:val="4B4C4E"/>
+          <w:sz w:val="20"/>
+          <w:szCs w:val="20"/>
+          <w:lang w:bidi="fa-IR"/>
+        </w:rPr>
+      </w:pPr>
+      <w:r>
+        <w:rPr>
+          <w:rFonts w:asciiTheme="minorBidi" w:hAnsiTheme="minorBidi"/>
+          <w:color w:val="4C4D4F"/>
+          <w:sz w:val="20"/>
+          <w:szCs w:val="20"/>
+        </w:rPr>
+        <w:t>OR Heidari, FN Yousefi,</w:t>
+      </w:r>
+      <w:r>
+        <w:rPr>
+          <w:rFonts w:asciiTheme="minorBidi" w:hAnsiTheme="minorBidi"/>
+          <w:color w:val="4C4D4F"/>
+          <w:sz w:val="20"/>
+          <w:szCs w:val="20"/>
+        </w:rPr>
+        <w:t xml:space="preserve"> MA Nitsche,</w:t>
+      </w:r>
+      <w:r>
+        <w:rPr>
+          <w:rFonts w:asciiTheme="minorBidi" w:hAnsiTheme="minorBidi"/>
+          <w:color w:val="4C4D4F"/>
+          <w:sz w:val="20"/>
+          <w:szCs w:val="20"/>
+        </w:rPr>
+        <w:t xml:space="preserve"> M Dadashi, </w:t>
+      </w:r>
+      <w:r>
+        <w:rPr>
+          <w:rFonts w:asciiTheme="minorBidi" w:hAnsiTheme="minorBidi"/>
+          <w:color w:val="4C4D4F"/>
+          <w:sz w:val="20"/>
+          <w:szCs w:val="20"/>
+        </w:rPr>
+        <w:t>Effectiveness of tDCS over the DLPFC on reducing clinical symptoms, improving working memory, and aberrant EEG functional connectivity in resting-state schizophrenia patients</w:t>
+      </w:r>
+    </w:p>
+    <w:p>
+      <w:pPr>
+        <w:rPr>
+          <w:rFonts w:asciiTheme="minorBidi" w:hAnsiTheme="minorBidi"/>
+          <w:color w:val="4B4C4E"/>
+          <w:sz w:val="2"/>
+          <w:szCs w:val="2"/>
+          <w:lang w:bidi="fa-IR"/>
+        </w:rPr>
+      </w:pPr>
+    </w:p>
+    <w:p>
+      <w:pPr>
+        <w:rPr>
+          <w:rFonts w:asciiTheme="minorBidi" w:hAnsiTheme="minorBidi"/>
+          <w:b/>
+          <w:bCs/>
           <w:color w:val="4C4D4F"/>
           <w:sz w:val="24"/>
           <w:szCs w:val="24"/>
@@ -2928,6 +3063,7 @@
         <w:tabs>
           <w:tab w:val="left" w:pos="5280"/>
         </w:tabs>
+        <w:spacing w:line="276" w:lineRule="auto"/>
         <w:rPr>
           <w:rFonts w:asciiTheme="minorBidi" w:hAnsiTheme="minorBidi"/>
           <w:color w:val="4C4D4F"/>
@@ -3384,6 +3520,7 @@
           <w:sz w:val="20"/>
           <w:szCs w:val="20"/>
         </w:rPr>
+        <w:lastRenderedPageBreak/>
         <w:t>Apr 2022</w:t>
       </w:r>
       <w:r>
@@ -3616,7 +3753,6 @@
           <w:szCs w:val="24"/>
           <w:lang w:bidi="fa-IR"/>
         </w:rPr>
-        <w:lastRenderedPageBreak/>
         <w:t>TECHNICAL SKILLS</w:t>
       </w:r>
     </w:p>
@@ -4171,22 +4307,8 @@
                   <w:u w:val="none"/>
                   <w:lang w:bidi="fa-IR"/>
                 </w:rPr>
-                <w:t xml:space="preserve">Dr. Mohsen </w:t>
+                <w:t>Dr. Mohsen Dadashi</w:t>
               </w:r>
-              <w:proofErr w:type="spellStart"/>
-              <w:r>
-                <w:rPr>
-                  <w:rStyle w:val="Hyperlink"/>
-                  <w:rFonts w:asciiTheme="minorBidi" w:hAnsiTheme="minorBidi"/>
-                  <w:color w:val="2F5496" w:themeColor="accent1" w:themeShade="BF"/>
-                  <w:sz w:val="20"/>
-                  <w:szCs w:val="20"/>
-                  <w:u w:val="none"/>
-                  <w:lang w:bidi="fa-IR"/>
-                </w:rPr>
-                <w:t>Dadashi</w:t>
-              </w:r>
-              <w:proofErr w:type="spellEnd"/>
             </w:hyperlink>
             <w:r>
               <w:rPr>
@@ -6157,6 +6279,119 @@
     </w:lvl>
   </w:abstractNum>
   <w:abstractNum w:abstractNumId="11" w15:restartNumberingAfterBreak="0">
+    <w:nsid w:val="75E51B3A"/>
+    <w:multiLevelType w:val="hybridMultilevel"/>
+    <w:tmpl w:val="56067F34"/>
+    <w:lvl w:ilvl="0" w:tplc="04090001">
+      <w:start w:val="1"/>
+      <w:numFmt w:val="bullet"/>
+      <w:lvlText w:val=""/>
+      <w:lvlJc w:val="left"/>
+      <w:pPr>
+        <w:ind w:left="720" w:hanging="360"/>
+      </w:pPr>
+      <w:rPr>
+        <w:rFonts w:ascii="Symbol" w:hAnsi="Symbol" w:hint="default"/>
+      </w:rPr>
+    </w:lvl>
+    <w:lvl w:ilvl="1" w:tplc="04090003" w:tentative="1">
+      <w:start w:val="1"/>
+      <w:numFmt w:val="bullet"/>
+      <w:lvlText w:val="o"/>
+      <w:lvlJc w:val="left"/>
+      <w:pPr>
+        <w:ind w:left="1440" w:hanging="360"/>
+      </w:pPr>
+      <w:rPr>
+        <w:rFonts w:ascii="Courier New" w:hAnsi="Courier New" w:cs="Courier New" w:hint="default"/>
+      </w:rPr>
+    </w:lvl>
+    <w:lvl w:ilvl="2" w:tplc="04090005" w:tentative="1">
+      <w:start w:val="1"/>
+      <w:numFmt w:val="bullet"/>
+      <w:lvlText w:val=""/>
+      <w:lvlJc w:val="left"/>
+      <w:pPr>
+        <w:ind w:left="2160" w:hanging="360"/>
+      </w:pPr>
+      <w:rPr>
+        <w:rFonts w:ascii="Wingdings" w:hAnsi="Wingdings" w:hint="default"/>
+      </w:rPr>
+    </w:lvl>
+    <w:lvl w:ilvl="3" w:tplc="04090001" w:tentative="1">
+      <w:start w:val="1"/>
+      <w:numFmt w:val="bullet"/>
+      <w:lvlText w:val=""/>
+      <w:lvlJc w:val="left"/>
+      <w:pPr>
+        <w:ind w:left="2880" w:hanging="360"/>
+      </w:pPr>
+      <w:rPr>
+        <w:rFonts w:ascii="Symbol" w:hAnsi="Symbol" w:hint="default"/>
+      </w:rPr>
+    </w:lvl>
+    <w:lvl w:ilvl="4" w:tplc="04090003" w:tentative="1">
+      <w:start w:val="1"/>
+      <w:numFmt w:val="bullet"/>
+      <w:lvlText w:val="o"/>
+      <w:lvlJc w:val="left"/>
+      <w:pPr>
+        <w:ind w:left="3600" w:hanging="360"/>
+      </w:pPr>
+      <w:rPr>
+        <w:rFonts w:ascii="Courier New" w:hAnsi="Courier New" w:cs="Courier New" w:hint="default"/>
+      </w:rPr>
+    </w:lvl>
+    <w:lvl w:ilvl="5" w:tplc="04090005" w:tentative="1">
+      <w:start w:val="1"/>
+      <w:numFmt w:val="bullet"/>
+      <w:lvlText w:val=""/>
+      <w:lvlJc w:val="left"/>
+      <w:pPr>
+        <w:ind w:left="4320" w:hanging="360"/>
+      </w:pPr>
+      <w:rPr>
+        <w:rFonts w:ascii="Wingdings" w:hAnsi="Wingdings" w:hint="default"/>
+      </w:rPr>
+    </w:lvl>
+    <w:lvl w:ilvl="6" w:tplc="04090001" w:tentative="1">
+      <w:start w:val="1"/>
+      <w:numFmt w:val="bullet"/>
+      <w:lvlText w:val=""/>
+      <w:lvlJc w:val="left"/>
+      <w:pPr>
+        <w:ind w:left="5040" w:hanging="360"/>
+      </w:pPr>
+      <w:rPr>
+        <w:rFonts w:ascii="Symbol" w:hAnsi="Symbol" w:hint="default"/>
+      </w:rPr>
+    </w:lvl>
+    <w:lvl w:ilvl="7" w:tplc="04090003" w:tentative="1">
+      <w:start w:val="1"/>
+      <w:numFmt w:val="bullet"/>
+      <w:lvlText w:val="o"/>
+      <w:lvlJc w:val="left"/>
+      <w:pPr>
+        <w:ind w:left="5760" w:hanging="360"/>
+      </w:pPr>
+      <w:rPr>
+        <w:rFonts w:ascii="Courier New" w:hAnsi="Courier New" w:cs="Courier New" w:hint="default"/>
+      </w:rPr>
+    </w:lvl>
+    <w:lvl w:ilvl="8" w:tplc="04090005" w:tentative="1">
+      <w:start w:val="1"/>
+      <w:numFmt w:val="bullet"/>
+      <w:lvlText w:val=""/>
+      <w:lvlJc w:val="left"/>
+      <w:pPr>
+        <w:ind w:left="6480" w:hanging="360"/>
+      </w:pPr>
+      <w:rPr>
+        <w:rFonts w:ascii="Wingdings" w:hAnsi="Wingdings" w:hint="default"/>
+      </w:rPr>
+    </w:lvl>
+  </w:abstractNum>
+  <w:abstractNum w:abstractNumId="12" w15:restartNumberingAfterBreak="0">
     <w:nsid w:val="76EC1729"/>
     <w:multiLevelType w:val="hybridMultilevel"/>
     <w:tmpl w:val="486A5722"/>
@@ -6279,7 +6514,7 @@
     <w:abstractNumId w:val="8"/>
   </w:num>
   <w:num w:numId="4" w16cid:durableId="1218515743">
-    <w:abstractNumId w:val="11"/>
+    <w:abstractNumId w:val="12"/>
   </w:num>
   <w:num w:numId="5" w16cid:durableId="813181568">
     <w:abstractNumId w:val="0"/>
@@ -6304,6 +6539,9 @@
   </w:num>
   <w:num w:numId="12" w16cid:durableId="1717239822">
     <w:abstractNumId w:val="6"/>
+  </w:num>
+  <w:num w:numId="13" w16cid:durableId="356808474">
+    <w:abstractNumId w:val="11"/>
   </w:num>
 </w:numbering>
 </file>
@@ -6706,7 +6944,7 @@
   <w:style w:type="paragraph" w:default="1" w:styleId="Normal">
     <w:name w:val="Normal"/>
     <w:qFormat/>
-    <w:rsid w:val="00EF005C"/>
+    <w:rsid w:val="003A2C26"/>
   </w:style>
   <w:style w:type="paragraph" w:styleId="Heading1">
     <w:name w:val="heading 1"/>

</xml_diff>

<commit_message>
update packages & add a new in-progress publication
</commit_message>
<xml_diff>
--- a/docs/Omid Reza Heidari.docx
+++ b/docs/Omid Reza Heidari.docx
@@ -2257,6 +2257,87 @@
       <w:pPr>
         <w:rPr>
           <w:rFonts w:asciiTheme="minorBidi" w:hAnsiTheme="minorBidi"/>
+          <w:b/>
+          <w:bCs/>
+          <w:color w:val="4B4C4E"/>
+          <w:sz w:val="20"/>
+          <w:szCs w:val="20"/>
+          <w:lang w:bidi="fa-IR"/>
+        </w:rPr>
+      </w:pPr>
+      <w:r>
+        <w:rPr>
+          <w:rFonts w:asciiTheme="minorBidi" w:hAnsiTheme="minorBidi"/>
+          <w:b/>
+          <w:bCs/>
+          <w:color w:val="4B4C4E"/>
+          <w:sz w:val="20"/>
+          <w:szCs w:val="20"/>
+          <w:lang w:bidi="fa-IR"/>
+        </w:rPr>
+        <w:t>Works in progress</w:t>
+      </w:r>
+    </w:p>
+    <w:p>
+      <w:pPr>
+        <w:pStyle w:val="ListParagraph"/>
+        <w:numPr>
+          <w:ilvl w:val="0"/>
+          <w:numId w:val="13"/>
+        </w:numPr>
+        <w:rPr>
+          <w:rFonts w:asciiTheme="minorBidi" w:hAnsiTheme="minorBidi"/>
+          <w:color w:val="4B4C4E"/>
+          <w:sz w:val="20"/>
+          <w:szCs w:val="20"/>
+          <w:lang w:bidi="fa-IR"/>
+        </w:rPr>
+      </w:pPr>
+      <w:r>
+        <w:rPr>
+          <w:rFonts w:asciiTheme="minorBidi" w:hAnsiTheme="minorBidi"/>
+          <w:color w:val="4B4C4E"/>
+          <w:sz w:val="20"/>
+          <w:szCs w:val="20"/>
+          <w:lang w:bidi="fa-IR"/>
+        </w:rPr>
+        <w:t xml:space="preserve">OR Heidari, </w:t>
+      </w:r>
+      <w:r>
+        <w:rPr>
+          <w:rFonts w:asciiTheme="minorBidi" w:hAnsiTheme="minorBidi"/>
+          <w:color w:val="4B4C4E"/>
+          <w:sz w:val="20"/>
+          <w:szCs w:val="20"/>
+          <w:lang w:bidi="fa-IR"/>
+        </w:rPr>
+        <w:t>M Dadashi</w:t>
+      </w:r>
+      <w:r>
+        <w:rPr>
+          <w:rFonts w:asciiTheme="minorBidi" w:hAnsiTheme="minorBidi"/>
+          <w:color w:val="4B4C4E"/>
+          <w:sz w:val="20"/>
+          <w:szCs w:val="20"/>
+          <w:lang w:bidi="fa-IR"/>
+        </w:rPr>
+        <w:t xml:space="preserve">, </w:t>
+      </w:r>
+      <w:r>
+        <w:rPr>
+          <w:rFonts w:asciiTheme="minorBidi" w:hAnsiTheme="minorBidi"/>
+          <w:color w:val="4B4C4E"/>
+          <w:sz w:val="20"/>
+          <w:szCs w:val="20"/>
+          <w:lang w:bidi="fa-IR"/>
+        </w:rPr>
+        <w:t>Assessment of structural connectivity and brain volumes after tDCS in stroke: a machine-learning method</w:t>
+      </w:r>
+    </w:p>
+    <w:p>
+      <w:pPr>
+        <w:rPr>
+          <w:rFonts w:asciiTheme="minorBidi" w:hAnsiTheme="minorBidi"/>
           <w:color w:val="4B4C4E"/>
           <w:sz w:val="2"/>
           <w:szCs w:val="2"/>
@@ -3403,6 +3484,20 @@
         <w:spacing w:line="276" w:lineRule="auto"/>
         <w:rPr>
           <w:rFonts w:asciiTheme="minorBidi" w:hAnsiTheme="minorBidi"/>
+          <w:sz w:val="2"/>
+          <w:szCs w:val="2"/>
+          <w:lang w:bidi="fa-IR"/>
+        </w:rPr>
+      </w:pPr>
+    </w:p>
+    <w:p>
+      <w:pPr>
+        <w:tabs>
+          <w:tab w:val="left" w:pos="5280"/>
+        </w:tabs>
+        <w:spacing w:line="276" w:lineRule="auto"/>
+        <w:rPr>
+          <w:rFonts w:asciiTheme="minorBidi" w:hAnsiTheme="minorBidi"/>
           <w:b/>
           <w:bCs/>
           <w:color w:val="4C4D4F"/>
@@ -3421,6 +3516,7 @@
           <w:szCs w:val="24"/>
           <w:lang w:bidi="fa-IR"/>
         </w:rPr>
+        <w:lastRenderedPageBreak/>
         <w:t>ONLINE</w:t>
       </w:r>
       <w:r>
@@ -3520,7 +3616,6 @@
           <w:sz w:val="20"/>
           <w:szCs w:val="20"/>
         </w:rPr>
-        <w:lastRenderedPageBreak/>
         <w:t>Apr 2022</w:t>
       </w:r>
       <w:r>
@@ -6291,7 +6386,7 @@
   <w:abstractNum w:abstractNumId="11" w15:restartNumberingAfterBreak="0">
     <w:nsid w:val="75E51B3A"/>
     <w:multiLevelType w:val="hybridMultilevel"/>
-    <w:tmpl w:val="56067F34"/>
+    <w:tmpl w:val="2B827FFE"/>
     <w:lvl w:ilvl="0" w:tplc="04090001">
       <w:start w:val="1"/>
       <w:numFmt w:val="bullet"/>

</xml_diff>

<commit_message>
Remove References & up-to-date other parts
</commit_message>
<xml_diff>
--- a/docs/Omid Reza Heidari.docx
+++ b/docs/Omid Reza Heidari.docx
@@ -145,9 +145,10 @@
       <w:pPr>
         <w:spacing w:line="276" w:lineRule="auto"/>
         <w:rPr>
+          <w:rFonts w:asciiTheme="minorBidi" w:hAnsiTheme="minorBidi"/>
           <w:color w:val="4B4C4E"/>
-          <w:sz w:val="20"/>
-          <w:szCs w:val="20"/>
+          <w:sz w:val="2"/>
+          <w:szCs w:val="2"/>
         </w:rPr>
       </w:pPr>
     </w:p>
@@ -286,7 +287,16 @@
           <w:sz w:val="20"/>
           <w:szCs w:val="20"/>
         </w:rPr>
-        <w:t xml:space="preserve">Faculty of Computer, </w:t>
+        <w:t>Computer Engineering Department</w:t>
+      </w:r>
+      <w:r>
+        <w:rPr>
+          <w:rFonts w:asciiTheme="minorBidi" w:hAnsiTheme="minorBidi"/>
+          <w:color w:val="4C4D4F"/>
+          <w:sz w:val="20"/>
+          <w:szCs w:val="20"/>
+        </w:rPr>
+        <w:t xml:space="preserve">, </w:t>
       </w:r>
       <w:r>
         <w:rPr>
@@ -606,33 +616,22 @@
     <w:p>
       <w:pPr>
         <w:spacing w:line="240" w:lineRule="auto"/>
-        <w:ind w:left="720"/>
-        <w:rPr>
-          <w:rFonts w:asciiTheme="minorBidi" w:hAnsiTheme="minorBidi"/>
-          <w:color w:val="4C4D4F"/>
-          <w:sz w:val="20"/>
-          <w:szCs w:val="20"/>
-        </w:rPr>
-      </w:pPr>
-      <w:r>
-        <w:rPr>
-          <w:rFonts w:asciiTheme="minorBidi" w:hAnsiTheme="minorBidi"/>
-          <w:b/>
-          <w:bCs/>
-          <w:color w:val="4C4D4F"/>
-          <w:sz w:val="20"/>
-          <w:szCs w:val="20"/>
-        </w:rPr>
-        <w:tab/>
-      </w:r>
-      <w:r>
-        <w:rPr>
-          <w:rFonts w:asciiTheme="minorBidi" w:hAnsiTheme="minorBidi"/>
-          <w:color w:val="4C4D4F"/>
-          <w:sz w:val="20"/>
-          <w:szCs w:val="20"/>
-        </w:rPr>
-        <w:t>Faculty of Computer,</w:t>
+        <w:ind w:left="720" w:firstLine="720"/>
+        <w:rPr>
+          <w:rFonts w:asciiTheme="minorBidi" w:hAnsiTheme="minorBidi"/>
+          <w:color w:val="4C4D4F"/>
+          <w:sz w:val="20"/>
+          <w:szCs w:val="20"/>
+        </w:rPr>
+      </w:pPr>
+      <w:r>
+        <w:rPr>
+          <w:rFonts w:asciiTheme="minorBidi" w:hAnsiTheme="minorBidi"/>
+          <w:color w:val="4C4D4F"/>
+          <w:sz w:val="20"/>
+          <w:szCs w:val="20"/>
+        </w:rPr>
+        <w:t>Computer Engineering Department,</w:t>
       </w:r>
       <w:r>
         <w:rPr>
@@ -1019,7 +1018,17 @@
           <w:szCs w:val="20"/>
           <w:lang w:bidi="fa-IR"/>
         </w:rPr>
-        <w:t>Jun 2022</w:t>
+        <w:t>Nov</w:t>
+      </w:r>
+      <w:r>
+        <w:rPr>
+          <w:rFonts w:asciiTheme="minorBidi" w:hAnsiTheme="minorBidi"/>
+          <w:color w:val="4C4D4F"/>
+          <w:sz w:val="20"/>
+          <w:szCs w:val="20"/>
+          <w:lang w:bidi="fa-IR"/>
+        </w:rPr>
+        <w:t xml:space="preserve"> 2022</w:t>
       </w:r>
       <w:r>
         <w:rPr>
@@ -1039,69 +1048,63 @@
           <w:szCs w:val="20"/>
           <w:lang w:bidi="fa-IR"/>
         </w:rPr>
-        <w:t>-</w:t>
-      </w:r>
-      <w:r>
-        <w:rPr>
-          <w:rFonts w:asciiTheme="minorBidi" w:hAnsiTheme="minorBidi"/>
+        <w:t xml:space="preserve">- </w:t>
+      </w:r>
+      <w:r>
+        <w:rPr>
+          <w:rFonts w:asciiTheme="minorBidi" w:hAnsiTheme="minorBidi"/>
+          <w:color w:val="4C4D4F"/>
+          <w:sz w:val="20"/>
+          <w:szCs w:val="20"/>
+          <w:lang w:bidi="fa-IR"/>
+        </w:rPr>
+        <w:t>Present</w:t>
+      </w:r>
+      <w:r>
+        <w:rPr>
+          <w:rFonts w:asciiTheme="minorBidi" w:hAnsiTheme="minorBidi"/>
+          <w:color w:val="4C4D4F"/>
+          <w:sz w:val="20"/>
+          <w:szCs w:val="20"/>
+          <w:lang w:bidi="fa-IR"/>
+        </w:rPr>
+        <w:tab/>
+      </w:r>
+      <w:r>
+        <w:rPr>
+          <w:rFonts w:asciiTheme="minorBidi" w:hAnsiTheme="minorBidi"/>
+          <w:b/>
+          <w:bCs/>
+          <w:color w:val="4C4D4F"/>
+          <w:sz w:val="20"/>
+          <w:szCs w:val="20"/>
+          <w:lang w:bidi="fa-IR"/>
+        </w:rPr>
+        <w:t>Machine Learning Researcher</w:t>
+      </w:r>
+      <w:r>
+        <w:rPr>
+          <w:rFonts w:asciiTheme="minorBidi" w:hAnsiTheme="minorBidi"/>
+          <w:b/>
+          <w:bCs/>
+          <w:color w:val="4C4D4F"/>
+          <w:sz w:val="20"/>
+          <w:szCs w:val="20"/>
+          <w:lang w:bidi="fa-IR"/>
+        </w:rPr>
+        <w:t>,</w:t>
+      </w:r>
+      <w:r>
+        <w:rPr>
+          <w:rFonts w:asciiTheme="minorBidi" w:hAnsiTheme="minorBidi"/>
+          <w:b/>
+          <w:bCs/>
           <w:color w:val="4C4D4F"/>
           <w:sz w:val="20"/>
           <w:szCs w:val="20"/>
           <w:lang w:bidi="fa-IR"/>
         </w:rPr>
         <w:t xml:space="preserve"> </w:t>
-      </w:r>
-      <w:r>
-        <w:rPr>
-          <w:rFonts w:asciiTheme="minorBidi" w:hAnsiTheme="minorBidi"/>
-          <w:color w:val="4C4D4F"/>
-          <w:sz w:val="20"/>
-          <w:szCs w:val="20"/>
-          <w:lang w:bidi="fa-IR"/>
-        </w:rPr>
-        <w:t>Sep</w:t>
-      </w:r>
-      <w:r>
-        <w:rPr>
-          <w:rFonts w:asciiTheme="minorBidi" w:hAnsiTheme="minorBidi"/>
-          <w:color w:val="4C4D4F"/>
-          <w:sz w:val="20"/>
-          <w:szCs w:val="20"/>
-          <w:lang w:bidi="fa-IR"/>
-        </w:rPr>
-        <w:t xml:space="preserve"> </w:t>
-      </w:r>
-      <w:r>
-        <w:rPr>
-          <w:rFonts w:asciiTheme="minorBidi" w:hAnsiTheme="minorBidi"/>
-          <w:color w:val="4C4D4F"/>
-          <w:sz w:val="20"/>
-          <w:szCs w:val="20"/>
-          <w:lang w:bidi="fa-IR"/>
-        </w:rPr>
-        <w:t>2022</w:t>
-      </w:r>
-      <w:r>
-        <w:rPr>
-          <w:rFonts w:asciiTheme="minorBidi" w:hAnsiTheme="minorBidi"/>
-          <w:color w:val="4C4D4F"/>
-          <w:sz w:val="20"/>
-          <w:szCs w:val="20"/>
-          <w:lang w:bidi="fa-IR"/>
-        </w:rPr>
-        <w:tab/>
-      </w:r>
-      <w:r>
-        <w:rPr>
-          <w:rFonts w:asciiTheme="minorBidi" w:hAnsiTheme="minorBidi"/>
-          <w:b/>
-          <w:bCs/>
-          <w:color w:val="4C4D4F"/>
-          <w:sz w:val="20"/>
-          <w:szCs w:val="20"/>
-          <w:lang w:bidi="fa-IR"/>
-        </w:rPr>
-        <w:t xml:space="preserve">Data Research Analyst, </w:t>
       </w:r>
       <w:r>
         <w:rPr>
@@ -1122,28 +1125,43 @@
           <w:numId w:val="1"/>
         </w:numPr>
         <w:rPr>
-          <w:rFonts w:asciiTheme="minorBidi" w:hAnsiTheme="minorBidi"/>
-          <w:color w:val="4C4D4F"/>
-          <w:sz w:val="20"/>
-          <w:szCs w:val="20"/>
-        </w:rPr>
-      </w:pPr>
-      <w:r>
-        <w:rPr>
-          <w:rFonts w:asciiTheme="minorBidi" w:hAnsiTheme="minorBidi"/>
-          <w:b/>
-          <w:bCs/>
-          <w:color w:val="4C4D4F"/>
-          <w:sz w:val="20"/>
-          <w:szCs w:val="20"/>
-        </w:rPr>
-        <w:t>Research Title:</w:t>
-      </w:r>
-      <w:r>
-        <w:rPr>
-          <w:rFonts w:asciiTheme="minorBidi" w:hAnsiTheme="minorBidi"/>
-          <w:b/>
-          <w:bCs/>
+          <w:rStyle w:val="hgkelc"/>
+          <w:rFonts w:asciiTheme="minorBidi" w:hAnsiTheme="minorBidi"/>
+          <w:color w:val="4C4D4F"/>
+          <w:sz w:val="20"/>
+          <w:szCs w:val="20"/>
+        </w:rPr>
+      </w:pPr>
+      <w:r>
+        <w:rPr>
+          <w:rFonts w:asciiTheme="minorBidi" w:hAnsiTheme="minorBidi"/>
+          <w:color w:val="4C4D4F"/>
+          <w:sz w:val="20"/>
+          <w:szCs w:val="20"/>
+        </w:rPr>
+        <w:t>Conduct</w:t>
+      </w:r>
+      <w:r>
+        <w:rPr>
+          <w:rFonts w:asciiTheme="minorBidi" w:hAnsiTheme="minorBidi"/>
+          <w:color w:val="4C4D4F"/>
+          <w:sz w:val="20"/>
+          <w:szCs w:val="20"/>
+        </w:rPr>
+        <w:t>ing</w:t>
+      </w:r>
+      <w:r>
+        <w:rPr>
+          <w:rFonts w:asciiTheme="minorBidi" w:hAnsiTheme="minorBidi"/>
+          <w:color w:val="4C4D4F"/>
+          <w:sz w:val="20"/>
+          <w:szCs w:val="20"/>
+        </w:rPr>
+        <w:t xml:space="preserve"> research in the area of</w:t>
+      </w:r>
+      <w:r>
+        <w:rPr>
+          <w:rFonts w:asciiTheme="minorBidi" w:hAnsiTheme="minorBidi"/>
           <w:color w:val="4C4D4F"/>
           <w:sz w:val="20"/>
           <w:szCs w:val="20"/>
@@ -1152,12 +1170,106 @@
       </w:r>
       <w:r>
         <w:rPr>
-          <w:rFonts w:asciiTheme="minorBidi" w:hAnsiTheme="minorBidi"/>
-          <w:color w:val="4C4D4F"/>
-          <w:sz w:val="20"/>
-          <w:szCs w:val="20"/>
-        </w:rPr>
-        <w:t>Effectiveness of tDCS over the DLPFC on reducing clinical symptoms, improving working memory, and aberrant EEG functional connectivity in resting-state schizophrenia patients</w:t>
+          <w:rStyle w:val="hgkelc"/>
+          <w:rFonts w:asciiTheme="minorBidi" w:hAnsiTheme="minorBidi"/>
+          <w:color w:val="4C4D4F"/>
+          <w:sz w:val="20"/>
+          <w:szCs w:val="20"/>
+        </w:rPr>
+        <w:t xml:space="preserve">Machine Learning and </w:t>
+      </w:r>
+      <w:r>
+        <w:rPr>
+          <w:rFonts w:asciiTheme="minorBidi" w:hAnsiTheme="minorBidi"/>
+          <w:color w:val="4C4D4F"/>
+          <w:sz w:val="20"/>
+          <w:szCs w:val="20"/>
+        </w:rPr>
+        <w:t xml:space="preserve">Structural </w:t>
+      </w:r>
+      <w:r>
+        <w:rPr>
+          <w:rFonts w:asciiTheme="minorBidi" w:hAnsiTheme="minorBidi"/>
+          <w:color w:val="4C4D4F"/>
+          <w:sz w:val="20"/>
+          <w:szCs w:val="20"/>
+        </w:rPr>
+        <w:t>M</w:t>
+      </w:r>
+      <w:r>
+        <w:rPr>
+          <w:rFonts w:asciiTheme="minorBidi" w:hAnsiTheme="minorBidi"/>
+          <w:color w:val="4C4D4F"/>
+          <w:sz w:val="20"/>
+          <w:szCs w:val="20"/>
+        </w:rPr>
+        <w:t xml:space="preserve">agnetic </w:t>
+      </w:r>
+      <w:r>
+        <w:rPr>
+          <w:rFonts w:asciiTheme="minorBidi" w:hAnsiTheme="minorBidi"/>
+          <w:color w:val="4C4D4F"/>
+          <w:sz w:val="20"/>
+          <w:szCs w:val="20"/>
+        </w:rPr>
+        <w:t>R</w:t>
+      </w:r>
+      <w:r>
+        <w:rPr>
+          <w:rFonts w:asciiTheme="minorBidi" w:hAnsiTheme="minorBidi"/>
+          <w:color w:val="4C4D4F"/>
+          <w:sz w:val="20"/>
+          <w:szCs w:val="20"/>
+        </w:rPr>
+        <w:t xml:space="preserve">esonance </w:t>
+      </w:r>
+      <w:r>
+        <w:rPr>
+          <w:rFonts w:asciiTheme="minorBidi" w:hAnsiTheme="minorBidi"/>
+          <w:color w:val="4C4D4F"/>
+          <w:sz w:val="20"/>
+          <w:szCs w:val="20"/>
+        </w:rPr>
+        <w:t>I</w:t>
+      </w:r>
+      <w:r>
+        <w:rPr>
+          <w:rFonts w:asciiTheme="minorBidi" w:hAnsiTheme="minorBidi"/>
+          <w:color w:val="4C4D4F"/>
+          <w:sz w:val="20"/>
+          <w:szCs w:val="20"/>
+        </w:rPr>
+        <w:t>maging</w:t>
+      </w:r>
+      <w:r>
+        <w:rPr>
+          <w:rStyle w:val="hgkelc"/>
+          <w:rFonts w:asciiTheme="minorBidi" w:hAnsiTheme="minorBidi"/>
+          <w:color w:val="4C4D4F"/>
+          <w:sz w:val="20"/>
+          <w:szCs w:val="20"/>
+        </w:rPr>
+        <w:t xml:space="preserve"> </w:t>
+      </w:r>
+      <w:r>
+        <w:rPr>
+          <w:rStyle w:val="hgkelc"/>
+          <w:rFonts w:asciiTheme="minorBidi" w:hAnsiTheme="minorBidi"/>
+          <w:color w:val="4C4D4F"/>
+          <w:sz w:val="20"/>
+          <w:szCs w:val="20"/>
+        </w:rPr>
+        <w:t xml:space="preserve">under the supervision of </w:t>
+      </w:r>
+      <w:r>
+        <w:rPr>
+          <w:rStyle w:val="hgkelc"/>
+          <w:rFonts w:asciiTheme="minorBidi" w:hAnsiTheme="minorBidi"/>
+          <w:color w:val="4C4D4F"/>
+          <w:sz w:val="20"/>
+          <w:szCs w:val="20"/>
+        </w:rPr>
+        <w:t>Dr. Mohsen Dadashi</w:t>
       </w:r>
     </w:p>
     <w:p>
@@ -1169,34 +1281,11 @@
         </w:numPr>
         <w:rPr>
           <w:rFonts w:asciiTheme="minorBidi" w:hAnsiTheme="minorBidi"/>
-          <w:b/>
-          <w:bCs/>
-          <w:color w:val="4C4D4F"/>
-          <w:sz w:val="20"/>
-          <w:szCs w:val="20"/>
-        </w:rPr>
-      </w:pPr>
-      <w:r>
-        <w:rPr>
-          <w:rFonts w:asciiTheme="minorBidi" w:hAnsiTheme="minorBidi"/>
-          <w:b/>
-          <w:bCs/>
-          <w:color w:val="4C4D4F"/>
-          <w:sz w:val="20"/>
-          <w:szCs w:val="20"/>
-        </w:rPr>
-        <w:t>Task:</w:t>
-      </w:r>
-      <w:r>
-        <w:rPr>
-          <w:rFonts w:asciiTheme="minorBidi" w:hAnsiTheme="minorBidi"/>
-          <w:color w:val="4C4D4F"/>
-          <w:sz w:val="20"/>
-          <w:szCs w:val="20"/>
-          <w:lang w:bidi="fa-IR"/>
-        </w:rPr>
-        <w:t xml:space="preserve"> Collect, Prepare, and Analyze </w:t>
-      </w:r>
+          <w:color w:val="4C4D4F"/>
+          <w:sz w:val="20"/>
+          <w:szCs w:val="20"/>
+        </w:rPr>
+      </w:pPr>
       <w:r>
         <w:rPr>
           <w:rStyle w:val="hgkelc"/>
@@ -1205,17 +1294,152 @@
           <w:sz w:val="20"/>
           <w:szCs w:val="20"/>
         </w:rPr>
-        <w:t>Electroencephalogram</w:t>
-      </w:r>
-      <w:r>
-        <w:rPr>
-          <w:rFonts w:asciiTheme="minorBidi" w:hAnsiTheme="minorBidi"/>
-          <w:color w:val="4C4D4F"/>
-          <w:sz w:val="20"/>
-          <w:szCs w:val="20"/>
-          <w:lang w:bidi="fa-IR"/>
-        </w:rPr>
-        <w:t xml:space="preserve"> Data</w:t>
+        <w:t xml:space="preserve">Collecting and preprocessing data to </w:t>
+      </w:r>
+      <w:r>
+        <w:rPr>
+          <w:rStyle w:val="hgkelc"/>
+          <w:rFonts w:asciiTheme="minorBidi" w:hAnsiTheme="minorBidi"/>
+          <w:color w:val="4C4D4F"/>
+          <w:sz w:val="20"/>
+          <w:szCs w:val="20"/>
+        </w:rPr>
+        <w:t xml:space="preserve">be </w:t>
+      </w:r>
+      <w:r>
+        <w:rPr>
+          <w:rStyle w:val="hgkelc"/>
+          <w:rFonts w:asciiTheme="minorBidi" w:hAnsiTheme="minorBidi"/>
+          <w:color w:val="4C4D4F"/>
+          <w:sz w:val="20"/>
+          <w:szCs w:val="20"/>
+        </w:rPr>
+        <w:t>evaluate</w:t>
+      </w:r>
+      <w:r>
+        <w:rPr>
+          <w:rStyle w:val="hgkelc"/>
+          <w:rFonts w:asciiTheme="minorBidi" w:hAnsiTheme="minorBidi"/>
+          <w:color w:val="4C4D4F"/>
+          <w:sz w:val="20"/>
+          <w:szCs w:val="20"/>
+        </w:rPr>
+        <w:t>d</w:t>
+      </w:r>
+      <w:r>
+        <w:rPr>
+          <w:rStyle w:val="hgkelc"/>
+          <w:rFonts w:asciiTheme="minorBidi" w:hAnsiTheme="minorBidi"/>
+          <w:color w:val="4C4D4F"/>
+          <w:sz w:val="20"/>
+          <w:szCs w:val="20"/>
+        </w:rPr>
+        <w:t xml:space="preserve"> with Machine Learning models</w:t>
+      </w:r>
+    </w:p>
+    <w:p>
+      <w:pPr>
+        <w:rPr>
+          <w:rFonts w:asciiTheme="minorBidi" w:hAnsiTheme="minorBidi"/>
+          <w:color w:val="4C4D4F"/>
+          <w:sz w:val="20"/>
+          <w:szCs w:val="20"/>
+          <w:lang w:bidi="fa-IR"/>
+        </w:rPr>
+      </w:pPr>
+      <w:r>
+        <w:rPr>
+          <w:rFonts w:asciiTheme="minorBidi" w:hAnsiTheme="minorBidi"/>
+          <w:color w:val="4C4D4F"/>
+          <w:sz w:val="20"/>
+          <w:szCs w:val="20"/>
+          <w:lang w:bidi="fa-IR"/>
+        </w:rPr>
+        <w:t>Ju</w:t>
+      </w:r>
+      <w:r>
+        <w:rPr>
+          <w:rFonts w:asciiTheme="minorBidi" w:hAnsiTheme="minorBidi"/>
+          <w:color w:val="4C4D4F"/>
+          <w:sz w:val="20"/>
+          <w:szCs w:val="20"/>
+          <w:lang w:bidi="fa-IR"/>
+        </w:rPr>
+        <w:t>l</w:t>
+      </w:r>
+      <w:r>
+        <w:rPr>
+          <w:rFonts w:asciiTheme="minorBidi" w:hAnsiTheme="minorBidi"/>
+          <w:color w:val="4C4D4F"/>
+          <w:sz w:val="20"/>
+          <w:szCs w:val="20"/>
+          <w:lang w:bidi="fa-IR"/>
+        </w:rPr>
+        <w:t xml:space="preserve"> 2022 - </w:t>
+      </w:r>
+      <w:r>
+        <w:rPr>
+          <w:rFonts w:asciiTheme="minorBidi" w:hAnsiTheme="minorBidi"/>
+          <w:color w:val="4C4D4F"/>
+          <w:sz w:val="20"/>
+          <w:szCs w:val="20"/>
+          <w:lang w:bidi="fa-IR"/>
+        </w:rPr>
+        <w:t>Oct</w:t>
+      </w:r>
+      <w:r>
+        <w:rPr>
+          <w:rFonts w:asciiTheme="minorBidi" w:hAnsiTheme="minorBidi"/>
+          <w:color w:val="4C4D4F"/>
+          <w:sz w:val="20"/>
+          <w:szCs w:val="20"/>
+          <w:lang w:bidi="fa-IR"/>
+        </w:rPr>
+        <w:t xml:space="preserve"> 2022</w:t>
+      </w:r>
+      <w:r>
+        <w:rPr>
+          <w:rFonts w:asciiTheme="minorBidi" w:hAnsiTheme="minorBidi"/>
+          <w:color w:val="4C4D4F"/>
+          <w:sz w:val="20"/>
+          <w:szCs w:val="20"/>
+          <w:lang w:bidi="fa-IR"/>
+        </w:rPr>
+        <w:tab/>
+      </w:r>
+      <w:r>
+        <w:rPr>
+          <w:rFonts w:asciiTheme="minorBidi" w:hAnsiTheme="minorBidi"/>
+          <w:b/>
+          <w:bCs/>
+          <w:color w:val="4C4D4F"/>
+          <w:sz w:val="20"/>
+          <w:szCs w:val="20"/>
+          <w:lang w:bidi="fa-IR"/>
+        </w:rPr>
+        <w:t>Data Research Analyst,</w:t>
+      </w:r>
+      <w:r>
+        <w:rPr>
+          <w:rFonts w:asciiTheme="minorBidi" w:hAnsiTheme="minorBidi"/>
+          <w:b/>
+          <w:bCs/>
+          <w:color w:val="4C4D4F"/>
+          <w:sz w:val="20"/>
+          <w:szCs w:val="20"/>
+          <w:lang w:bidi="fa-IR"/>
+        </w:rPr>
+        <w:t xml:space="preserve"> </w:t>
+      </w:r>
+      <w:r>
+        <w:rPr>
+          <w:rFonts w:asciiTheme="minorBidi" w:hAnsiTheme="minorBidi"/>
+          <w:color w:val="4C4D4F"/>
+          <w:sz w:val="20"/>
+          <w:szCs w:val="20"/>
+          <w:lang w:bidi="fa-IR"/>
+        </w:rPr>
+        <w:t>Zanjan University of Medical Science</w:t>
       </w:r>
     </w:p>
     <w:p>
@@ -1227,93 +1451,102 @@
         </w:numPr>
         <w:rPr>
           <w:rFonts w:asciiTheme="minorBidi" w:hAnsiTheme="minorBidi"/>
-          <w:b/>
-          <w:bCs/>
-          <w:color w:val="4C4D4F"/>
-          <w:sz w:val="20"/>
-          <w:szCs w:val="20"/>
-        </w:rPr>
-      </w:pPr>
-      <w:r>
-        <w:rPr>
-          <w:rFonts w:asciiTheme="minorBidi" w:hAnsiTheme="minorBidi"/>
-          <w:b/>
-          <w:bCs/>
-          <w:color w:val="4C4D4F"/>
-          <w:sz w:val="20"/>
-          <w:szCs w:val="20"/>
-        </w:rPr>
-        <w:t>Method</w:t>
-      </w:r>
-      <w:r>
-        <w:rPr>
-          <w:rFonts w:asciiTheme="minorBidi" w:hAnsiTheme="minorBidi"/>
-          <w:b/>
-          <w:bCs/>
-          <w:color w:val="4C4D4F"/>
-          <w:sz w:val="20"/>
-          <w:szCs w:val="20"/>
-        </w:rPr>
-        <w:t>s</w:t>
-      </w:r>
-      <w:r>
-        <w:rPr>
-          <w:rFonts w:asciiTheme="minorBidi" w:hAnsiTheme="minorBidi"/>
-          <w:b/>
-          <w:bCs/>
-          <w:color w:val="4C4D4F"/>
-          <w:sz w:val="20"/>
-          <w:szCs w:val="20"/>
-        </w:rPr>
-        <w:t xml:space="preserve">: </w:t>
-      </w:r>
-      <w:r>
-        <w:rPr>
-          <w:rFonts w:asciiTheme="minorBidi" w:hAnsiTheme="minorBidi"/>
-          <w:color w:val="4C4D4F"/>
-          <w:sz w:val="20"/>
-          <w:szCs w:val="20"/>
-        </w:rPr>
-        <w:t>FFT</w:t>
-      </w:r>
-      <w:r>
-        <w:rPr>
-          <w:rFonts w:asciiTheme="minorBidi" w:hAnsiTheme="minorBidi"/>
-          <w:color w:val="4C4D4F"/>
-          <w:sz w:val="20"/>
-          <w:szCs w:val="20"/>
-        </w:rPr>
-        <w:t xml:space="preserve">, </w:t>
-      </w:r>
-      <w:r>
-        <w:rPr>
-          <w:rFonts w:asciiTheme="minorBidi" w:hAnsiTheme="minorBidi"/>
-          <w:color w:val="4C4D4F"/>
-          <w:sz w:val="20"/>
-          <w:szCs w:val="20"/>
-        </w:rPr>
-        <w:t>P</w:t>
-      </w:r>
-      <w:r>
-        <w:rPr>
-          <w:rFonts w:asciiTheme="minorBidi" w:hAnsiTheme="minorBidi"/>
-          <w:color w:val="4C4D4F"/>
-          <w:sz w:val="20"/>
-          <w:szCs w:val="20"/>
-        </w:rPr>
-        <w:t>w</w:t>
-      </w:r>
-      <w:r>
-        <w:rPr>
-          <w:rFonts w:asciiTheme="minorBidi" w:hAnsiTheme="minorBidi"/>
-          <w:color w:val="4C4D4F"/>
-          <w:sz w:val="20"/>
-          <w:szCs w:val="20"/>
-        </w:rPr>
-        <w:t>elch,</w:t>
-      </w:r>
-      <w:r>
-        <w:rPr>
+          <w:color w:val="4C4D4F"/>
+          <w:sz w:val="20"/>
+          <w:szCs w:val="20"/>
+        </w:rPr>
+      </w:pPr>
+      <w:r>
+        <w:rPr>
+          <w:rFonts w:asciiTheme="minorBidi" w:hAnsiTheme="minorBidi"/>
+          <w:color w:val="4C4D4F"/>
+          <w:sz w:val="20"/>
+          <w:szCs w:val="20"/>
+        </w:rPr>
+        <w:t>Conducted</w:t>
+      </w:r>
+      <w:r>
+        <w:rPr>
+          <w:rFonts w:asciiTheme="minorBidi" w:hAnsiTheme="minorBidi"/>
+          <w:color w:val="4C4D4F"/>
+          <w:sz w:val="20"/>
+          <w:szCs w:val="20"/>
+        </w:rPr>
+        <w:t xml:space="preserve"> research in the area of </w:t>
+      </w:r>
+      <w:r>
+        <w:rPr>
+          <w:rStyle w:val="hgkelc"/>
+          <w:rFonts w:asciiTheme="minorBidi" w:hAnsiTheme="minorBidi"/>
+          <w:color w:val="4C4D4F"/>
+          <w:sz w:val="20"/>
+          <w:szCs w:val="20"/>
+        </w:rPr>
+        <w:t>Electroencephalogram</w:t>
+      </w:r>
+      <w:r>
+        <w:rPr>
+          <w:rStyle w:val="hgkelc"/>
+          <w:rFonts w:asciiTheme="minorBidi" w:hAnsiTheme="minorBidi"/>
+          <w:color w:val="4C4D4F"/>
+          <w:sz w:val="20"/>
+          <w:szCs w:val="20"/>
+        </w:rPr>
+        <w:t xml:space="preserve"> signals </w:t>
+      </w:r>
+      <w:r>
+        <w:rPr>
+          <w:rStyle w:val="hgkelc"/>
+          <w:rFonts w:asciiTheme="minorBidi" w:hAnsiTheme="minorBidi"/>
+          <w:color w:val="4C4D4F"/>
+          <w:sz w:val="20"/>
+          <w:szCs w:val="20"/>
+        </w:rPr>
+        <w:t xml:space="preserve">within a team of two </w:t>
+      </w:r>
+      <w:r>
+        <w:rPr>
+          <w:rStyle w:val="hgkelc"/>
+          <w:rFonts w:asciiTheme="minorBidi" w:hAnsiTheme="minorBidi"/>
+          <w:color w:val="4C4D4F"/>
+          <w:sz w:val="20"/>
+          <w:szCs w:val="20"/>
+        </w:rPr>
+        <w:t xml:space="preserve">under the supervision of </w:t>
+      </w:r>
+      <w:r>
+        <w:rPr>
+          <w:rStyle w:val="hgkelc"/>
+          <w:rFonts w:asciiTheme="minorBidi" w:hAnsiTheme="minorBidi"/>
+          <w:color w:val="4C4D4F"/>
+          <w:sz w:val="20"/>
+          <w:szCs w:val="20"/>
+        </w:rPr>
+        <w:t>Dr. Michael Nitsche and Dr. Mohsen Dadashi</w:t>
+      </w:r>
+      <w:r>
+        <w:rPr>
+          <w:rStyle w:val="hgkelc"/>
+          <w:rFonts w:asciiTheme="minorBidi" w:hAnsiTheme="minorBidi"/>
+          <w:color w:val="4C4D4F"/>
+          <w:sz w:val="20"/>
+          <w:szCs w:val="20"/>
+        </w:rPr>
+        <w:t xml:space="preserve">, which led to </w:t>
+      </w:r>
+      <w:r>
+        <w:rPr>
+          <w:rStyle w:val="hgkelc"/>
+          <w:rFonts w:asciiTheme="minorBidi" w:hAnsiTheme="minorBidi"/>
+          <w:color w:val="4C4D4F"/>
+          <w:sz w:val="20"/>
+          <w:szCs w:val="20"/>
+        </w:rPr>
+        <w:t>a</w:t>
+      </w:r>
+      <w:r>
+        <w:rPr>
+          <w:rStyle w:val="hgkelc"/>
           <w:rFonts w:asciiTheme="minorBidi" w:hAnsiTheme="minorBidi"/>
           <w:color w:val="4C4D4F"/>
           <w:sz w:val="20"/>
@@ -1323,12 +1556,148 @@
       </w:r>
       <w:r>
         <w:rPr>
+          <w:rStyle w:val="hgkelc"/>
+          <w:rFonts w:asciiTheme="minorBidi" w:hAnsiTheme="minorBidi"/>
+          <w:color w:val="4C4D4F"/>
+          <w:sz w:val="20"/>
+          <w:szCs w:val="20"/>
+        </w:rPr>
+        <w:t>publication</w:t>
+      </w:r>
+    </w:p>
+    <w:p>
+      <w:pPr>
+        <w:pStyle w:val="ListParagraph"/>
+        <w:numPr>
+          <w:ilvl w:val="0"/>
+          <w:numId w:val="1"/>
+        </w:numPr>
+        <w:contextualSpacing w:val="0"/>
+        <w:rPr>
+          <w:rFonts w:asciiTheme="minorBidi" w:hAnsiTheme="minorBidi"/>
+          <w:b/>
+          <w:bCs/>
+          <w:color w:val="4C4D4F"/>
+          <w:sz w:val="20"/>
+          <w:szCs w:val="20"/>
+        </w:rPr>
+      </w:pPr>
+      <w:r>
+        <w:rPr>
+          <w:rFonts w:asciiTheme="minorBidi" w:hAnsiTheme="minorBidi"/>
+          <w:color w:val="4C4D4F"/>
+          <w:sz w:val="20"/>
+          <w:szCs w:val="20"/>
+        </w:rPr>
+        <w:t>Utilize</w:t>
+      </w:r>
+      <w:r>
+        <w:rPr>
+          <w:rFonts w:asciiTheme="minorBidi" w:hAnsiTheme="minorBidi"/>
+          <w:color w:val="4C4D4F"/>
+          <w:sz w:val="20"/>
+          <w:szCs w:val="20"/>
+        </w:rPr>
+        <w:t>d</w:t>
+      </w:r>
+      <w:r>
+        <w:rPr>
+          <w:rFonts w:asciiTheme="minorBidi" w:hAnsiTheme="minorBidi"/>
+          <w:color w:val="4C4D4F"/>
+          <w:sz w:val="20"/>
+          <w:szCs w:val="20"/>
+        </w:rPr>
+        <w:t xml:space="preserve"> several approaches, such as Welch, </w:t>
+      </w:r>
+      <w:r>
+        <w:rPr>
           <w:rFonts w:asciiTheme="minorBidi" w:hAnsiTheme="minorBidi"/>
           <w:color w:val="4C4D4F"/>
           <w:sz w:val="20"/>
           <w:szCs w:val="20"/>
         </w:rPr>
         <w:t>Convolution</w:t>
+      </w:r>
+      <w:r>
+        <w:rPr>
+          <w:rFonts w:asciiTheme="minorBidi" w:hAnsiTheme="minorBidi"/>
+          <w:color w:val="4C4D4F"/>
+          <w:sz w:val="20"/>
+          <w:szCs w:val="20"/>
+        </w:rPr>
+        <w:t>,</w:t>
+      </w:r>
+      <w:r>
+        <w:rPr>
+          <w:rFonts w:asciiTheme="minorBidi" w:hAnsiTheme="minorBidi"/>
+          <w:color w:val="4C4D4F"/>
+          <w:sz w:val="20"/>
+          <w:szCs w:val="20"/>
+        </w:rPr>
+        <w:t xml:space="preserve"> and</w:t>
+      </w:r>
+      <w:r>
+        <w:rPr>
+          <w:rFonts w:asciiTheme="minorBidi" w:hAnsiTheme="minorBidi"/>
+          <w:color w:val="4C4D4F"/>
+          <w:sz w:val="20"/>
+          <w:szCs w:val="20"/>
+        </w:rPr>
+        <w:t xml:space="preserve"> </w:t>
+      </w:r>
+      <w:r>
+        <w:rPr>
+          <w:rFonts w:asciiTheme="minorBidi" w:hAnsiTheme="minorBidi"/>
+          <w:color w:val="4C4D4F"/>
+          <w:sz w:val="20"/>
+          <w:szCs w:val="20"/>
+        </w:rPr>
+        <w:t>Fourier transform</w:t>
+      </w:r>
+      <w:r>
+        <w:rPr>
+          <w:rFonts w:asciiTheme="minorBidi" w:hAnsiTheme="minorBidi"/>
+          <w:color w:val="4C4D4F"/>
+          <w:sz w:val="20"/>
+          <w:szCs w:val="20"/>
+        </w:rPr>
+        <w:t xml:space="preserve"> </w:t>
+      </w:r>
+      <w:r>
+        <w:rPr>
+          <w:rFonts w:asciiTheme="minorBidi" w:hAnsiTheme="minorBidi"/>
+          <w:color w:val="4C4D4F"/>
+          <w:sz w:val="20"/>
+          <w:szCs w:val="20"/>
+        </w:rPr>
+        <w:t>to</w:t>
+      </w:r>
+      <w:r>
+        <w:rPr>
+          <w:rFonts w:asciiTheme="minorBidi" w:hAnsiTheme="minorBidi"/>
+          <w:color w:val="4C4D4F"/>
+          <w:sz w:val="20"/>
+          <w:szCs w:val="20"/>
+        </w:rPr>
+        <w:t xml:space="preserve"> compute connectivity, </w:t>
+      </w:r>
+      <w:r>
+        <w:rPr>
+          <w:rFonts w:asciiTheme="minorBidi" w:hAnsiTheme="minorBidi"/>
+          <w:color w:val="4C4D4F"/>
+          <w:sz w:val="20"/>
+          <w:szCs w:val="20"/>
+        </w:rPr>
+        <w:t xml:space="preserve">power, </w:t>
+      </w:r>
+      <w:r>
+        <w:rPr>
+          <w:rFonts w:asciiTheme="minorBidi" w:hAnsiTheme="minorBidi"/>
+          <w:color w:val="4C4D4F"/>
+          <w:sz w:val="20"/>
+          <w:szCs w:val="20"/>
+        </w:rPr>
+        <w:t>and amplitude</w:t>
       </w:r>
     </w:p>
     <w:p>
@@ -1534,7 +1903,25 @@
           <w:sz w:val="20"/>
           <w:szCs w:val="20"/>
         </w:rPr>
-        <w:t>Prepare two types of homework, namely theoretical homework, and practical homework</w:t>
+        <w:t>Prepare two types of homework, namely theoretical</w:t>
+      </w:r>
+      <w:r>
+        <w:rPr>
+          <w:rFonts w:asciiTheme="minorBidi" w:hAnsiTheme="minorBidi"/>
+          <w:color w:val="4C4D4F"/>
+          <w:sz w:val="20"/>
+          <w:szCs w:val="20"/>
+        </w:rPr>
+        <w:t xml:space="preserve"> </w:t>
+      </w:r>
+      <w:r>
+        <w:rPr>
+          <w:rFonts w:asciiTheme="minorBidi" w:hAnsiTheme="minorBidi"/>
+          <w:color w:val="4C4D4F"/>
+          <w:sz w:val="20"/>
+          <w:szCs w:val="20"/>
+        </w:rPr>
+        <w:t>and practical</w:t>
       </w:r>
     </w:p>
     <w:p>
@@ -1783,6 +2170,7 @@
           <w:sz w:val="20"/>
           <w:szCs w:val="20"/>
         </w:rPr>
+        <w:lastRenderedPageBreak/>
         <w:t>Prepare course assignments for the class in a practicum-based course to ensure practice-based learning prior to field placement</w:t>
       </w:r>
     </w:p>
@@ -1813,7 +2201,6 @@
           <w:szCs w:val="20"/>
           <w:lang w:bidi="fa-IR"/>
         </w:rPr>
-        <w:lastRenderedPageBreak/>
         <w:t>Feb 2022</w:t>
       </w:r>
       <w:r>
@@ -2241,7 +2628,25 @@
           <w:sz w:val="20"/>
           <w:szCs w:val="20"/>
         </w:rPr>
-        <w:t xml:space="preserve"> M Dadashi, </w:t>
+        <w:t xml:space="preserve"> M Dadashi</w:t>
+      </w:r>
+      <w:r>
+        <w:rPr>
+          <w:rFonts w:asciiTheme="minorBidi" w:hAnsiTheme="minorBidi"/>
+          <w:color w:val="4C4D4F"/>
+          <w:sz w:val="20"/>
+          <w:szCs w:val="20"/>
+        </w:rPr>
+        <w:t xml:space="preserve">. </w:t>
+      </w:r>
+      <w:r>
+        <w:rPr>
+          <w:rFonts w:asciiTheme="minorBidi" w:hAnsiTheme="minorBidi"/>
+          <w:color w:val="4C4D4F"/>
+          <w:sz w:val="20"/>
+          <w:szCs w:val="20"/>
+        </w:rPr>
+        <w:t>“</w:t>
       </w:r>
       <w:r>
         <w:rPr>
@@ -2252,86 +2657,14 @@
         </w:rPr>
         <w:t>Effectiveness of tDCS over the DLPFC on reducing clinical symptoms, improving working memory, and aberrant EEG functional connectivity in resting-state schizophrenia patients</w:t>
       </w:r>
-    </w:p>
-    <w:p>
-      <w:pPr>
-        <w:rPr>
-          <w:rFonts w:asciiTheme="minorBidi" w:hAnsiTheme="minorBidi"/>
-          <w:b/>
-          <w:bCs/>
-          <w:color w:val="4B4C4E"/>
-          <w:sz w:val="20"/>
-          <w:szCs w:val="20"/>
-          <w:lang w:bidi="fa-IR"/>
-        </w:rPr>
-      </w:pPr>
-      <w:r>
-        <w:rPr>
-          <w:rFonts w:asciiTheme="minorBidi" w:hAnsiTheme="minorBidi"/>
-          <w:b/>
-          <w:bCs/>
-          <w:color w:val="4B4C4E"/>
-          <w:sz w:val="20"/>
-          <w:szCs w:val="20"/>
-          <w:lang w:bidi="fa-IR"/>
-        </w:rPr>
-        <w:t>Works in progress</w:t>
-      </w:r>
-    </w:p>
-    <w:p>
-      <w:pPr>
-        <w:pStyle w:val="ListParagraph"/>
-        <w:numPr>
-          <w:ilvl w:val="0"/>
-          <w:numId w:val="13"/>
-        </w:numPr>
-        <w:rPr>
-          <w:rFonts w:asciiTheme="minorBidi" w:hAnsiTheme="minorBidi"/>
-          <w:color w:val="4B4C4E"/>
-          <w:sz w:val="20"/>
-          <w:szCs w:val="20"/>
-          <w:lang w:bidi="fa-IR"/>
-        </w:rPr>
-      </w:pPr>
-      <w:r>
-        <w:rPr>
-          <w:rFonts w:asciiTheme="minorBidi" w:hAnsiTheme="minorBidi"/>
-          <w:color w:val="4B4C4E"/>
-          <w:sz w:val="20"/>
-          <w:szCs w:val="20"/>
-          <w:lang w:bidi="fa-IR"/>
-        </w:rPr>
-        <w:t xml:space="preserve">OR Heidari, </w:t>
-      </w:r>
-      <w:r>
-        <w:rPr>
-          <w:rFonts w:asciiTheme="minorBidi" w:hAnsiTheme="minorBidi"/>
-          <w:color w:val="4B4C4E"/>
-          <w:sz w:val="20"/>
-          <w:szCs w:val="20"/>
-          <w:lang w:bidi="fa-IR"/>
-        </w:rPr>
-        <w:t>M Dadashi</w:t>
-      </w:r>
-      <w:r>
-        <w:rPr>
-          <w:rFonts w:asciiTheme="minorBidi" w:hAnsiTheme="minorBidi"/>
-          <w:color w:val="4B4C4E"/>
-          <w:sz w:val="20"/>
-          <w:szCs w:val="20"/>
-          <w:lang w:bidi="fa-IR"/>
-        </w:rPr>
-        <w:t xml:space="preserve">, </w:t>
-      </w:r>
-      <w:r>
-        <w:rPr>
-          <w:rFonts w:asciiTheme="minorBidi" w:hAnsiTheme="minorBidi"/>
-          <w:color w:val="4B4C4E"/>
-          <w:sz w:val="20"/>
-          <w:szCs w:val="20"/>
-          <w:lang w:bidi="fa-IR"/>
-        </w:rPr>
-        <w:t>Assessment of structural connectivity and brain volumes after tDCS in stroke: a machine-learning method</w:t>
+      <w:r>
+        <w:rPr>
+          <w:rFonts w:asciiTheme="minorBidi" w:hAnsiTheme="minorBidi"/>
+          <w:color w:val="4C4D4F"/>
+          <w:sz w:val="20"/>
+          <w:szCs w:val="20"/>
+        </w:rPr>
+        <w:t>”</w:t>
       </w:r>
     </w:p>
     <w:p>
@@ -2742,6 +3075,16 @@
         </w:rPr>
         <w:t>Bachelor Final Project</w:t>
       </w:r>
+      <w:r>
+        <w:rPr>
+          <w:rFonts w:asciiTheme="minorBidi" w:hAnsiTheme="minorBidi"/>
+          <w:color w:val="4C4D4F"/>
+          <w:sz w:val="20"/>
+          <w:szCs w:val="20"/>
+          <w:lang w:bidi="fa-IR"/>
+        </w:rPr>
+        <w:t xml:space="preserve"> </w:t>
+      </w:r>
     </w:p>
     <w:p>
       <w:pPr>
@@ -3093,7 +3436,17 @@
           <w:szCs w:val="20"/>
           <w:lang w:bidi="fa-IR"/>
         </w:rPr>
-        <w:t>The open-source project that helps database administrators to manage Redis servers</w:t>
+        <w:t>An</w:t>
+      </w:r>
+      <w:r>
+        <w:rPr>
+          <w:rFonts w:asciiTheme="minorBidi" w:hAnsiTheme="minorBidi"/>
+          <w:color w:val="4C4D4F"/>
+          <w:sz w:val="20"/>
+          <w:szCs w:val="20"/>
+          <w:lang w:bidi="fa-IR"/>
+        </w:rPr>
+        <w:t xml:space="preserve"> open-source project that helps database administrators to manage Redis servers</w:t>
       </w:r>
     </w:p>
     <w:p>
@@ -3461,6 +3814,20 @@
         </w:rPr>
         <w:t xml:space="preserve"> Basics of Wireless Networks (17)</w:t>
       </w:r>
+    </w:p>
+    <w:p>
+      <w:pPr>
+        <w:tabs>
+          <w:tab w:val="left" w:pos="5280"/>
+        </w:tabs>
+        <w:spacing w:line="276" w:lineRule="auto"/>
+        <w:rPr>
+          <w:rFonts w:asciiTheme="minorBidi" w:hAnsiTheme="minorBidi"/>
+          <w:sz w:val="2"/>
+          <w:szCs w:val="2"/>
+          <w:lang w:bidi="fa-IR"/>
+        </w:rPr>
+      </w:pPr>
     </w:p>
     <w:p>
       <w:pPr>
@@ -4312,650 +4679,13 @@
         <w:t xml:space="preserve"> (L:7.5, R:7, W:6, S:6.5)</w:t>
       </w:r>
     </w:p>
-    <w:p>
-      <w:pPr>
-        <w:tabs>
-          <w:tab w:val="left" w:pos="3253"/>
-        </w:tabs>
-        <w:spacing w:line="276" w:lineRule="auto"/>
-        <w:rPr>
-          <w:rFonts w:asciiTheme="minorBidi" w:hAnsiTheme="minorBidi"/>
-          <w:color w:val="4C4D4F"/>
-          <w:sz w:val="2"/>
-          <w:szCs w:val="2"/>
-          <w:lang w:bidi="fa-IR"/>
-        </w:rPr>
-      </w:pPr>
-    </w:p>
-    <w:p>
-      <w:pPr>
-        <w:rPr>
-          <w:rFonts w:asciiTheme="minorBidi" w:hAnsiTheme="minorBidi"/>
-          <w:b/>
-          <w:bCs/>
-          <w:color w:val="4C4D4F"/>
-          <w:sz w:val="24"/>
-          <w:szCs w:val="24"/>
-          <w:lang w:bidi="fa-IR"/>
-        </w:rPr>
-      </w:pPr>
-      <w:r>
-        <w:rPr>
-          <w:rFonts w:asciiTheme="minorBidi" w:hAnsiTheme="minorBidi"/>
-          <w:b/>
-          <w:bCs/>
-          <w:color w:val="4C4D4F"/>
-          <w:sz w:val="24"/>
-          <w:szCs w:val="24"/>
-          <w:lang w:bidi="fa-IR"/>
-        </w:rPr>
-        <w:t>REFERENCES</w:t>
-      </w:r>
-    </w:p>
-    <w:tbl>
-      <w:tblPr>
-        <w:tblStyle w:val="TableGrid"/>
-        <w:tblW w:w="9315" w:type="dxa"/>
-        <w:jc w:val="center"/>
-        <w:tblBorders>
-          <w:top w:val="none" w:sz="0" w:space="0" w:color="auto"/>
-          <w:left w:val="none" w:sz="0" w:space="0" w:color="auto"/>
-          <w:bottom w:val="none" w:sz="0" w:space="0" w:color="auto"/>
-          <w:right w:val="none" w:sz="0" w:space="0" w:color="auto"/>
-          <w:insideH w:val="none" w:sz="0" w:space="0" w:color="auto"/>
-          <w:insideV w:val="none" w:sz="0" w:space="0" w:color="auto"/>
-        </w:tblBorders>
-        <w:tblLook w:val="04A0" w:firstRow="1" w:lastRow="0" w:firstColumn="1" w:lastColumn="0" w:noHBand="0" w:noVBand="1"/>
-      </w:tblPr>
-      <w:tblGrid>
-        <w:gridCol w:w="4770"/>
-        <w:gridCol w:w="4545"/>
-      </w:tblGrid>
-      <w:tr>
-        <w:trPr>
-          <w:trHeight w:val="1080"/>
-          <w:jc w:val="center"/>
-        </w:trPr>
-        <w:tc>
-          <w:tcPr>
-            <w:tcW w:w="4770" w:type="dxa"/>
-          </w:tcPr>
-          <w:p>
-            <w:pPr>
-              <w:rPr>
-                <w:rStyle w:val="mr1"/>
-                <w:rFonts w:asciiTheme="minorBidi" w:hAnsiTheme="minorBidi"/>
-                <w:color w:val="4C4D4F"/>
-                <w:sz w:val="20"/>
-                <w:szCs w:val="20"/>
-                <w:rtl/>
-              </w:rPr>
-            </w:pPr>
-            <w:hyperlink r:id="rId22" w:history="1">
-              <w:r>
-                <w:rPr>
-                  <w:rStyle w:val="Hyperlink"/>
-                  <w:rFonts w:asciiTheme="minorBidi" w:hAnsiTheme="minorBidi"/>
-                  <w:color w:val="2F5496" w:themeColor="accent1" w:themeShade="BF"/>
-                  <w:sz w:val="20"/>
-                  <w:szCs w:val="20"/>
-                  <w:u w:val="none"/>
-                  <w:lang w:bidi="fa-IR"/>
-                </w:rPr>
-                <w:t>Dr. Mohsen Dadashi</w:t>
-              </w:r>
-            </w:hyperlink>
-            <w:r>
-              <w:rPr>
-                <w:rFonts w:asciiTheme="minorBidi" w:hAnsiTheme="minorBidi"/>
-                <w:color w:val="4C4D4F"/>
-                <w:sz w:val="20"/>
-                <w:szCs w:val="20"/>
-                <w:lang w:bidi="fa-IR"/>
-              </w:rPr>
-              <w:t xml:space="preserve">, </w:t>
-            </w:r>
-            <w:r>
-              <w:rPr>
-                <w:rStyle w:val="mr1"/>
-                <w:rFonts w:asciiTheme="minorBidi" w:hAnsiTheme="minorBidi"/>
-                <w:color w:val="4C4D4F"/>
-                <w:sz w:val="20"/>
-                <w:szCs w:val="20"/>
-              </w:rPr>
-              <w:t>Associate Professor</w:t>
-            </w:r>
-          </w:p>
-          <w:p>
-            <w:pPr>
-              <w:rPr>
-                <w:rFonts w:asciiTheme="minorBidi" w:hAnsiTheme="minorBidi"/>
-                <w:color w:val="4C4D4F"/>
-                <w:sz w:val="20"/>
-                <w:szCs w:val="20"/>
-                <w:lang w:bidi="fa-IR"/>
-              </w:rPr>
-            </w:pPr>
-            <w:r>
-              <w:rPr>
-                <w:rFonts w:asciiTheme="minorBidi" w:hAnsiTheme="minorBidi"/>
-                <w:color w:val="4C4D4F"/>
-                <w:sz w:val="20"/>
-                <w:szCs w:val="20"/>
-                <w:lang w:bidi="fa-IR"/>
-              </w:rPr>
-              <w:t>Faculty of Medicine, Zanjan University of Medical Sciences</w:t>
-            </w:r>
-          </w:p>
-          <w:p>
-            <w:pPr>
-              <w:rPr>
-                <w:rFonts w:asciiTheme="minorBidi" w:hAnsiTheme="minorBidi"/>
-                <w:color w:val="4C4D4F"/>
-                <w:sz w:val="20"/>
-                <w:szCs w:val="20"/>
-                <w:lang w:bidi="fa-IR"/>
-              </w:rPr>
-            </w:pPr>
-            <w:r>
-              <w:rPr>
-                <w:rFonts w:asciiTheme="minorBidi" w:hAnsiTheme="minorBidi"/>
-                <w:color w:val="4C4D4F"/>
-                <w:sz w:val="20"/>
-                <w:szCs w:val="20"/>
-                <w:lang w:bidi="fa-IR"/>
-              </w:rPr>
-              <w:t>Tel: (+98) 9127433559</w:t>
-            </w:r>
-          </w:p>
-          <w:p>
-            <w:pPr>
-              <w:rPr>
-                <w:rFonts w:asciiTheme="minorBidi" w:hAnsiTheme="minorBidi"/>
-                <w:color w:val="2F5496" w:themeColor="accent1" w:themeShade="BF"/>
-                <w:sz w:val="20"/>
-                <w:szCs w:val="20"/>
-              </w:rPr>
-            </w:pPr>
-            <w:r>
-              <w:rPr>
-                <w:rFonts w:asciiTheme="minorBidi" w:hAnsiTheme="minorBidi"/>
-                <w:color w:val="4C4D4F"/>
-                <w:sz w:val="20"/>
-                <w:szCs w:val="20"/>
-                <w:lang w:bidi="fa-IR"/>
-              </w:rPr>
-              <w:t>Email:</w:t>
-            </w:r>
-            <w:r>
-              <w:rPr>
-                <w:rFonts w:asciiTheme="minorBidi" w:hAnsiTheme="minorBidi"/>
-                <w:color w:val="4C4D4F"/>
-                <w:sz w:val="20"/>
-                <w:szCs w:val="20"/>
-              </w:rPr>
-              <w:t xml:space="preserve"> </w:t>
-            </w:r>
-            <w:hyperlink r:id="rId23" w:history="1">
-              <w:r>
-                <w:rPr>
-                  <w:rStyle w:val="Hyperlink"/>
-                  <w:rFonts w:asciiTheme="minorBidi" w:hAnsiTheme="minorBidi"/>
-                  <w:color w:val="2F5496" w:themeColor="accent1" w:themeShade="BF"/>
-                  <w:sz w:val="20"/>
-                  <w:szCs w:val="20"/>
-                  <w:u w:val="none"/>
-                </w:rPr>
-                <w:t>mohsendadashi@zums.ac.ir</w:t>
-              </w:r>
-            </w:hyperlink>
-          </w:p>
-          <w:p>
-            <w:pPr>
-              <w:rPr>
-                <w:rFonts w:asciiTheme="minorBidi" w:hAnsiTheme="minorBidi"/>
-                <w:sz w:val="20"/>
-                <w:szCs w:val="20"/>
-                <w:lang w:bidi="fa-IR"/>
-              </w:rPr>
-            </w:pPr>
-          </w:p>
-        </w:tc>
-        <w:tc>
-          <w:tcPr>
-            <w:tcW w:w="4545" w:type="dxa"/>
-          </w:tcPr>
-          <w:p>
-            <w:pPr>
-              <w:rPr>
-                <w:rFonts w:asciiTheme="minorBidi" w:hAnsiTheme="minorBidi"/>
-                <w:color w:val="4C4D4F"/>
-                <w:sz w:val="20"/>
-                <w:szCs w:val="20"/>
-                <w:lang w:bidi="fa-IR"/>
-              </w:rPr>
-            </w:pPr>
-            <w:hyperlink r:id="rId24" w:history="1">
-              <w:r>
-                <w:rPr>
-                  <w:rStyle w:val="Hyperlink"/>
-                  <w:rFonts w:asciiTheme="minorBidi" w:hAnsiTheme="minorBidi"/>
-                  <w:color w:val="2F5496" w:themeColor="accent1" w:themeShade="BF"/>
-                  <w:sz w:val="20"/>
-                  <w:szCs w:val="20"/>
-                  <w:u w:val="none"/>
-                  <w:lang w:bidi="fa-IR"/>
-                </w:rPr>
-                <w:t>Dr. Ali Azarpeyvand</w:t>
-              </w:r>
-            </w:hyperlink>
-            <w:r>
-              <w:rPr>
-                <w:rStyle w:val="Hyperlink"/>
-                <w:rFonts w:asciiTheme="minorBidi" w:hAnsiTheme="minorBidi"/>
-                <w:color w:val="4C4D4F"/>
-                <w:sz w:val="20"/>
-                <w:szCs w:val="20"/>
-                <w:u w:val="none"/>
-                <w:lang w:bidi="fa-IR"/>
-              </w:rPr>
-              <w:t xml:space="preserve">, </w:t>
-            </w:r>
-            <w:r>
-              <w:rPr>
-                <w:rStyle w:val="mr1"/>
-                <w:rFonts w:asciiTheme="minorBidi" w:hAnsiTheme="minorBidi"/>
-                <w:color w:val="4C4D4F"/>
-                <w:sz w:val="20"/>
-                <w:szCs w:val="20"/>
-              </w:rPr>
-              <w:t xml:space="preserve">Associate </w:t>
-            </w:r>
-            <w:r>
-              <w:rPr>
-                <w:rFonts w:asciiTheme="minorBidi" w:hAnsiTheme="minorBidi"/>
-                <w:color w:val="4C4D4F"/>
-                <w:sz w:val="20"/>
-                <w:szCs w:val="20"/>
-                <w:lang w:bidi="fa-IR"/>
-              </w:rPr>
-              <w:t>Professor</w:t>
-            </w:r>
-          </w:p>
-          <w:p>
-            <w:pPr>
-              <w:rPr>
-                <w:rFonts w:asciiTheme="minorBidi" w:hAnsiTheme="minorBidi"/>
-                <w:color w:val="4C4D4F"/>
-                <w:sz w:val="20"/>
-                <w:szCs w:val="20"/>
-                <w:lang w:bidi="fa-IR"/>
-              </w:rPr>
-            </w:pPr>
-            <w:r>
-              <w:rPr>
-                <w:rFonts w:asciiTheme="minorBidi" w:hAnsiTheme="minorBidi"/>
-                <w:color w:val="4C4D4F"/>
-                <w:sz w:val="20"/>
-                <w:szCs w:val="20"/>
-                <w:lang w:bidi="fa-IR"/>
-              </w:rPr>
-              <w:t>Department of Computer, University of Zanjan</w:t>
-            </w:r>
-          </w:p>
-          <w:p>
-            <w:pPr>
-              <w:rPr>
-                <w:rFonts w:asciiTheme="minorBidi" w:hAnsiTheme="minorBidi"/>
-                <w:color w:val="4C4D4F"/>
-                <w:sz w:val="20"/>
-                <w:szCs w:val="20"/>
-                <w:lang w:bidi="fa-IR"/>
-              </w:rPr>
-            </w:pPr>
-            <w:r>
-              <w:rPr>
-                <w:rFonts w:asciiTheme="minorBidi" w:hAnsiTheme="minorBidi"/>
-                <w:color w:val="4C4D4F"/>
-                <w:sz w:val="20"/>
-                <w:szCs w:val="20"/>
-                <w:lang w:bidi="fa-IR"/>
-              </w:rPr>
-              <w:t>Tel: (+98) 9356661037</w:t>
-            </w:r>
-          </w:p>
-          <w:p>
-            <w:pPr>
-              <w:rPr>
-                <w:rFonts w:asciiTheme="minorBidi" w:hAnsiTheme="minorBidi"/>
-                <w:b/>
-                <w:bCs/>
-                <w:sz w:val="20"/>
-                <w:szCs w:val="20"/>
-                <w:lang w:bidi="fa-IR"/>
-              </w:rPr>
-            </w:pPr>
-            <w:r>
-              <w:rPr>
-                <w:rFonts w:asciiTheme="minorBidi" w:hAnsiTheme="minorBidi"/>
-                <w:color w:val="4C4D4F"/>
-                <w:sz w:val="20"/>
-                <w:szCs w:val="20"/>
-                <w:lang w:bidi="fa-IR"/>
-              </w:rPr>
-              <w:t xml:space="preserve">Email: </w:t>
-            </w:r>
-            <w:hyperlink r:id="rId25" w:history="1">
-              <w:r>
-                <w:rPr>
-                  <w:rStyle w:val="Hyperlink"/>
-                  <w:rFonts w:asciiTheme="minorBidi" w:hAnsiTheme="minorBidi"/>
-                  <w:color w:val="2F5496" w:themeColor="accent1" w:themeShade="BF"/>
-                  <w:sz w:val="20"/>
-                  <w:szCs w:val="20"/>
-                  <w:u w:val="none"/>
-                  <w:lang w:bidi="fa-IR"/>
-                </w:rPr>
-                <w:t>azarpeyvand@znu.ac.ir</w:t>
-              </w:r>
-            </w:hyperlink>
-          </w:p>
-        </w:tc>
-      </w:tr>
-      <w:tr>
-        <w:trPr>
-          <w:trHeight w:val="1113"/>
-          <w:jc w:val="center"/>
-        </w:trPr>
-        <w:tc>
-          <w:tcPr>
-            <w:tcW w:w="4770" w:type="dxa"/>
-          </w:tcPr>
-          <w:p>
-            <w:pPr>
-              <w:rPr>
-                <w:rFonts w:asciiTheme="minorBidi" w:hAnsiTheme="minorBidi"/>
-                <w:color w:val="4C4D4F"/>
-                <w:sz w:val="20"/>
-                <w:szCs w:val="20"/>
-                <w:lang w:bidi="fa-IR"/>
-              </w:rPr>
-            </w:pPr>
-            <w:hyperlink r:id="rId26" w:history="1">
-              <w:r>
-                <w:rPr>
-                  <w:rStyle w:val="Hyperlink"/>
-                  <w:rFonts w:asciiTheme="minorBidi" w:hAnsiTheme="minorBidi"/>
-                  <w:color w:val="2F5496" w:themeColor="accent1" w:themeShade="BF"/>
-                  <w:sz w:val="20"/>
-                  <w:szCs w:val="20"/>
-                  <w:u w:val="none"/>
-                  <w:lang w:bidi="fa-IR"/>
-                </w:rPr>
-                <w:t>Dr. Mojtaba Aajami</w:t>
-              </w:r>
-            </w:hyperlink>
-            <w:r>
-              <w:rPr>
-                <w:rStyle w:val="Hyperlink"/>
-                <w:rFonts w:asciiTheme="minorBidi" w:hAnsiTheme="minorBidi"/>
-                <w:color w:val="4C4D4F"/>
-                <w:sz w:val="20"/>
-                <w:szCs w:val="20"/>
-                <w:u w:val="none"/>
-                <w:lang w:bidi="fa-IR"/>
-              </w:rPr>
-              <w:t>,</w:t>
-            </w:r>
-            <w:r>
-              <w:rPr>
-                <w:rStyle w:val="Hyperlink"/>
-                <w:rFonts w:asciiTheme="minorBidi" w:hAnsiTheme="minorBidi"/>
-                <w:color w:val="4C4D4F"/>
-                <w:sz w:val="20"/>
-                <w:szCs w:val="20"/>
-                <w:u w:val="none"/>
-              </w:rPr>
-              <w:t xml:space="preserve"> </w:t>
-            </w:r>
-            <w:r>
-              <w:rPr>
-                <w:rFonts w:asciiTheme="minorBidi" w:hAnsiTheme="minorBidi"/>
-                <w:color w:val="4C4D4F"/>
-                <w:sz w:val="20"/>
-                <w:szCs w:val="20"/>
-                <w:lang w:bidi="fa-IR"/>
-              </w:rPr>
-              <w:t>Assistant Professor</w:t>
-            </w:r>
-          </w:p>
-          <w:p>
-            <w:pPr>
-              <w:rPr>
-                <w:rFonts w:asciiTheme="minorBidi" w:hAnsiTheme="minorBidi"/>
-                <w:color w:val="4C4D4F"/>
-                <w:sz w:val="20"/>
-                <w:szCs w:val="20"/>
-                <w:lang w:bidi="fa-IR"/>
-              </w:rPr>
-            </w:pPr>
-            <w:r>
-              <w:rPr>
-                <w:rFonts w:asciiTheme="minorBidi" w:hAnsiTheme="minorBidi"/>
-                <w:color w:val="4C4D4F"/>
-                <w:sz w:val="20"/>
-                <w:szCs w:val="20"/>
-                <w:lang w:bidi="fa-IR"/>
-              </w:rPr>
-              <w:t>Department of Computer, Islamic Azad University</w:t>
-            </w:r>
-          </w:p>
-          <w:p>
-            <w:pPr>
-              <w:rPr>
-                <w:rFonts w:asciiTheme="minorBidi" w:hAnsiTheme="minorBidi"/>
-                <w:color w:val="4C4D4F"/>
-                <w:sz w:val="20"/>
-                <w:szCs w:val="20"/>
-                <w:lang w:bidi="fa-IR"/>
-              </w:rPr>
-            </w:pPr>
-            <w:r>
-              <w:rPr>
-                <w:rFonts w:asciiTheme="minorBidi" w:hAnsiTheme="minorBidi"/>
-                <w:color w:val="4C4D4F"/>
-                <w:sz w:val="20"/>
-                <w:szCs w:val="20"/>
-                <w:lang w:bidi="fa-IR"/>
-              </w:rPr>
-              <w:t>Tel: (+98) 9123412431</w:t>
-            </w:r>
-          </w:p>
-          <w:p>
-            <w:pPr>
-              <w:rPr>
-                <w:rFonts w:asciiTheme="minorBidi" w:hAnsiTheme="minorBidi"/>
-                <w:color w:val="0563C1" w:themeColor="hyperlink"/>
-                <w:sz w:val="20"/>
-                <w:szCs w:val="20"/>
-                <w:lang w:bidi="fa-IR"/>
-              </w:rPr>
-            </w:pPr>
-            <w:r>
-              <w:rPr>
-                <w:rFonts w:asciiTheme="minorBidi" w:hAnsiTheme="minorBidi"/>
-                <w:color w:val="4C4D4F"/>
-                <w:sz w:val="20"/>
-                <w:szCs w:val="20"/>
-                <w:lang w:bidi="fa-IR"/>
-              </w:rPr>
-              <w:t xml:space="preserve">Email: </w:t>
-            </w:r>
-            <w:hyperlink r:id="rId27" w:history="1">
-              <w:r>
-                <w:rPr>
-                  <w:rStyle w:val="Hyperlink"/>
-                  <w:rFonts w:asciiTheme="minorBidi" w:hAnsiTheme="minorBidi"/>
-                  <w:color w:val="2F5496" w:themeColor="accent1" w:themeShade="BF"/>
-                  <w:sz w:val="20"/>
-                  <w:szCs w:val="20"/>
-                  <w:u w:val="none"/>
-                  <w:lang w:bidi="fa-IR"/>
-                </w:rPr>
-                <w:t>aajami@iauz.ac.ir</w:t>
-              </w:r>
-            </w:hyperlink>
-          </w:p>
-        </w:tc>
-        <w:tc>
-          <w:tcPr>
-            <w:tcW w:w="4545" w:type="dxa"/>
-          </w:tcPr>
-          <w:p>
-            <w:pPr>
-              <w:rPr>
-                <w:rStyle w:val="Hyperlink"/>
-                <w:rFonts w:asciiTheme="minorBidi" w:hAnsiTheme="minorBidi"/>
-                <w:color w:val="4C4D4F"/>
-                <w:sz w:val="20"/>
-                <w:szCs w:val="20"/>
-                <w:u w:val="none"/>
-                <w:lang w:bidi="fa-IR"/>
-              </w:rPr>
-            </w:pPr>
-            <w:hyperlink r:id="rId28" w:history="1">
-              <w:r>
-                <w:rPr>
-                  <w:rStyle w:val="Hyperlink"/>
-                  <w:rFonts w:asciiTheme="minorBidi" w:hAnsiTheme="minorBidi"/>
-                  <w:color w:val="2F5496" w:themeColor="accent1" w:themeShade="BF"/>
-                  <w:sz w:val="20"/>
-                  <w:szCs w:val="20"/>
-                  <w:u w:val="none"/>
-                  <w:lang w:bidi="fa-IR"/>
-                </w:rPr>
-                <w:t>Dr. Davud Mohammadpur</w:t>
-              </w:r>
-            </w:hyperlink>
-            <w:r>
-              <w:rPr>
-                <w:rStyle w:val="Hyperlink"/>
-                <w:rFonts w:asciiTheme="minorBidi" w:hAnsiTheme="minorBidi"/>
-                <w:color w:val="4C4D4F"/>
-                <w:sz w:val="20"/>
-                <w:szCs w:val="20"/>
-                <w:u w:val="none"/>
-                <w:lang w:bidi="fa-IR"/>
-              </w:rPr>
-              <w:t>,</w:t>
-            </w:r>
-            <w:r>
-              <w:rPr>
-                <w:rFonts w:asciiTheme="minorBidi" w:hAnsiTheme="minorBidi"/>
-                <w:color w:val="4C4D4F"/>
-                <w:sz w:val="20"/>
-                <w:szCs w:val="20"/>
-                <w:lang w:bidi="fa-IR"/>
-              </w:rPr>
-              <w:t xml:space="preserve"> Assistant Professor</w:t>
-            </w:r>
-          </w:p>
-          <w:p>
-            <w:pPr>
-              <w:rPr>
-                <w:rFonts w:asciiTheme="minorBidi" w:hAnsiTheme="minorBidi"/>
-                <w:color w:val="4C4D4F"/>
-                <w:sz w:val="20"/>
-                <w:szCs w:val="20"/>
-                <w:rtl/>
-                <w:lang w:bidi="fa-IR"/>
-              </w:rPr>
-            </w:pPr>
-            <w:r>
-              <w:rPr>
-                <w:rFonts w:asciiTheme="minorBidi" w:hAnsiTheme="minorBidi"/>
-                <w:color w:val="4C4D4F"/>
-                <w:sz w:val="20"/>
-                <w:szCs w:val="20"/>
-                <w:lang w:bidi="fa-IR"/>
-              </w:rPr>
-              <w:t>Department of Computer, University of Zanjan</w:t>
-            </w:r>
-          </w:p>
-          <w:p>
-            <w:pPr>
-              <w:rPr>
-                <w:rFonts w:asciiTheme="minorBidi" w:hAnsiTheme="minorBidi"/>
-                <w:color w:val="4C4D4F"/>
-                <w:sz w:val="20"/>
-                <w:szCs w:val="20"/>
-                <w:lang w:bidi="fa-IR"/>
-              </w:rPr>
-            </w:pPr>
-            <w:r>
-              <w:rPr>
-                <w:rFonts w:asciiTheme="minorBidi" w:hAnsiTheme="minorBidi"/>
-                <w:color w:val="4C4D4F"/>
-                <w:sz w:val="20"/>
-                <w:szCs w:val="20"/>
-                <w:lang w:bidi="fa-IR"/>
-              </w:rPr>
-              <w:t>Tel: (+98) 9127403049</w:t>
-            </w:r>
-          </w:p>
-          <w:p>
-            <w:pPr>
-              <w:rPr>
-                <w:rFonts w:asciiTheme="minorBidi" w:hAnsiTheme="minorBidi"/>
-                <w:sz w:val="20"/>
-                <w:szCs w:val="20"/>
-                <w:lang w:bidi="fa-IR"/>
-              </w:rPr>
-            </w:pPr>
-            <w:r>
-              <w:rPr>
-                <w:rFonts w:asciiTheme="minorBidi" w:hAnsiTheme="minorBidi"/>
-                <w:color w:val="4C4D4F"/>
-                <w:sz w:val="20"/>
-                <w:szCs w:val="20"/>
-                <w:lang w:bidi="fa-IR"/>
-              </w:rPr>
-              <w:t xml:space="preserve">Email: </w:t>
-            </w:r>
-            <w:hyperlink r:id="rId29" w:history="1">
-              <w:r>
-                <w:rPr>
-                  <w:rStyle w:val="Hyperlink"/>
-                  <w:rFonts w:asciiTheme="minorBidi" w:hAnsiTheme="minorBidi"/>
-                  <w:color w:val="2F5496" w:themeColor="accent1" w:themeShade="BF"/>
-                  <w:sz w:val="20"/>
-                  <w:szCs w:val="20"/>
-                  <w:u w:val="none"/>
-                  <w:lang w:bidi="fa-IR"/>
-                </w:rPr>
-                <w:t>dmp@znu.ac.ir</w:t>
-              </w:r>
-            </w:hyperlink>
-          </w:p>
-        </w:tc>
-      </w:tr>
-    </w:tbl>
-    <w:p>
-      <w:pPr>
-        <w:spacing w:line="240" w:lineRule="auto"/>
-        <w:rPr>
-          <w:rFonts w:ascii="Roboto" w:hAnsi="Roboto"/>
-          <w:lang w:bidi="fa-IR"/>
-        </w:rPr>
-      </w:pPr>
-    </w:p>
     <w:sectPr>
-      <w:headerReference w:type="even" r:id="rId30"/>
-      <w:headerReference w:type="default" r:id="rId31"/>
-      <w:footerReference w:type="even" r:id="rId32"/>
-      <w:footerReference w:type="default" r:id="rId33"/>
-      <w:headerReference w:type="first" r:id="rId34"/>
-      <w:footerReference w:type="first" r:id="rId35"/>
+      <w:headerReference w:type="even" r:id="rId22"/>
+      <w:headerReference w:type="default" r:id="rId23"/>
+      <w:footerReference w:type="even" r:id="rId24"/>
+      <w:footerReference w:type="default" r:id="rId25"/>
+      <w:headerReference w:type="first" r:id="rId26"/>
+      <w:footerReference w:type="first" r:id="rId27"/>
       <w:pgSz w:w="12240" w:h="15840"/>
       <w:pgMar w:top="1440" w:right="1440" w:bottom="1440" w:left="1440" w:header="720" w:footer="720" w:gutter="0"/>
       <w:pgBorders w:offsetFrom="page">

</xml_diff>

<commit_message>
Fix some tense-related mistakes
</commit_message>
<xml_diff>
--- a/docs/Omid Reza Heidari.docx
+++ b/docs/Omid Reza Heidari.docx
@@ -1869,7 +1869,25 @@
           <w:sz w:val="20"/>
           <w:szCs w:val="20"/>
         </w:rPr>
-        <w:t>Provide course materials, such as Jupyter Notebooks, slides, and quizzes</w:t>
+        <w:t>Provid</w:t>
+      </w:r>
+      <w:r>
+        <w:rPr>
+          <w:rFonts w:asciiTheme="minorBidi" w:hAnsiTheme="minorBidi"/>
+          <w:color w:val="4C4D4F"/>
+          <w:sz w:val="20"/>
+          <w:szCs w:val="20"/>
+        </w:rPr>
+        <w:t>ing</w:t>
+      </w:r>
+      <w:r>
+        <w:rPr>
+          <w:rFonts w:asciiTheme="minorBidi" w:hAnsiTheme="minorBidi"/>
+          <w:color w:val="4C4D4F"/>
+          <w:sz w:val="20"/>
+          <w:szCs w:val="20"/>
+        </w:rPr>
+        <w:t xml:space="preserve"> course materials, such as Jupyter Notebooks, slides, and quizzes</w:t>
       </w:r>
       <w:r>
         <w:rPr>
@@ -1903,50 +1921,25 @@
           <w:sz w:val="20"/>
           <w:szCs w:val="20"/>
         </w:rPr>
-        <w:t>Prepare two types of homework, namely theoretical</w:t>
-      </w:r>
-      <w:r>
-        <w:rPr>
-          <w:rFonts w:asciiTheme="minorBidi" w:hAnsiTheme="minorBidi"/>
-          <w:color w:val="4C4D4F"/>
-          <w:sz w:val="20"/>
-          <w:szCs w:val="20"/>
-        </w:rPr>
-        <w:t xml:space="preserve"> </w:t>
-      </w:r>
-      <w:r>
-        <w:rPr>
-          <w:rFonts w:asciiTheme="minorBidi" w:hAnsiTheme="minorBidi"/>
-          <w:color w:val="4C4D4F"/>
-          <w:sz w:val="20"/>
-          <w:szCs w:val="20"/>
-        </w:rPr>
-        <w:t>and practical</w:t>
-      </w:r>
-    </w:p>
-    <w:p>
-      <w:pPr>
-        <w:pStyle w:val="ListParagraph"/>
-        <w:numPr>
-          <w:ilvl w:val="0"/>
-          <w:numId w:val="1"/>
-        </w:numPr>
-        <w:spacing w:line="276" w:lineRule="auto"/>
-        <w:rPr>
-          <w:rFonts w:asciiTheme="minorBidi" w:hAnsiTheme="minorBidi"/>
-          <w:color w:val="4C4D4F"/>
-          <w:sz w:val="20"/>
-          <w:szCs w:val="20"/>
-        </w:rPr>
-      </w:pPr>
-      <w:r>
-        <w:rPr>
-          <w:rFonts w:asciiTheme="minorBidi" w:hAnsiTheme="minorBidi"/>
-          <w:color w:val="4C4D4F"/>
-          <w:sz w:val="20"/>
-          <w:szCs w:val="20"/>
-        </w:rPr>
-        <w:t>Graded assignments and exams to provide tailored feedback based on course expectations and outcomes</w:t>
+        <w:t>Grad</w:t>
+      </w:r>
+      <w:r>
+        <w:rPr>
+          <w:rFonts w:asciiTheme="minorBidi" w:hAnsiTheme="minorBidi"/>
+          <w:color w:val="4C4D4F"/>
+          <w:sz w:val="20"/>
+          <w:szCs w:val="20"/>
+        </w:rPr>
+        <w:t>ing</w:t>
+      </w:r>
+      <w:r>
+        <w:rPr>
+          <w:rFonts w:asciiTheme="minorBidi" w:hAnsiTheme="minorBidi"/>
+          <w:color w:val="4C4D4F"/>
+          <w:sz w:val="20"/>
+          <w:szCs w:val="20"/>
+        </w:rPr>
+        <w:t xml:space="preserve"> assignments and exams to provide tailored feedback based on course expectations and outcomes</w:t>
       </w:r>
     </w:p>
     <w:p>
@@ -2171,7 +2164,25 @@
           <w:szCs w:val="20"/>
         </w:rPr>
         <w:lastRenderedPageBreak/>
-        <w:t>Prepare course assignments for the class in a practicum-based course to ensure practice-based learning prior to field placement</w:t>
+        <w:t>Prepare</w:t>
+      </w:r>
+      <w:r>
+        <w:rPr>
+          <w:rFonts w:asciiTheme="minorBidi" w:hAnsiTheme="minorBidi" w:cstheme="minorBidi"/>
+          <w:color w:val="4C4D4F"/>
+          <w:sz w:val="20"/>
+          <w:szCs w:val="20"/>
+        </w:rPr>
+        <w:t>d</w:t>
+      </w:r>
+      <w:r>
+        <w:rPr>
+          <w:rFonts w:asciiTheme="minorBidi" w:hAnsiTheme="minorBidi" w:cstheme="minorBidi"/>
+          <w:color w:val="4C4D4F"/>
+          <w:sz w:val="20"/>
+          <w:szCs w:val="20"/>
+        </w:rPr>
+        <w:t xml:space="preserve"> course assignments for the class in a practicum-based course to ensure practice-based learning prior to field placement</w:t>
       </w:r>
     </w:p>
     <w:p>

</xml_diff>

<commit_message>
Fix the style of the CV
</commit_message>
<xml_diff>
--- a/docs/Omid Reza Heidari.docx
+++ b/docs/Omid Reza Heidari.docx
@@ -6,7 +6,7 @@
       <w:pPr>
         <w:jc w:val="center"/>
         <w:rPr>
-          <w:rFonts w:ascii="Roboto" w:hAnsi="Roboto"/>
+          <w:rFonts w:asciiTheme="minorBidi" w:hAnsiTheme="minorBidi"/>
           <w:b/>
           <w:bCs/>
           <w:color w:val="4C4D4F"/>
@@ -16,7 +16,7 @@
       </w:pPr>
       <w:r>
         <w:rPr>
-          <w:rFonts w:ascii="Roboto" w:hAnsi="Roboto"/>
+          <w:rFonts w:asciiTheme="minorBidi" w:hAnsiTheme="minorBidi"/>
           <w:b/>
           <w:bCs/>
           <w:color w:val="4C4D4F"/>
@@ -30,7 +30,7 @@
       <w:pPr>
         <w:jc w:val="center"/>
         <w:rPr>
-          <w:rFonts w:ascii="Roboto" w:hAnsi="Roboto"/>
+          <w:rFonts w:asciiTheme="minorBidi" w:hAnsiTheme="minorBidi"/>
           <w:color w:val="4B4C4E"/>
         </w:rPr>
       </w:pPr>
@@ -38,7 +38,7 @@
         <w:r>
           <w:rPr>
             <w:rStyle w:val="Hyperlink"/>
-            <w:rFonts w:ascii="Roboto" w:hAnsi="Roboto"/>
+            <w:rFonts w:asciiTheme="minorBidi" w:hAnsiTheme="minorBidi"/>
             <w:color w:val="2F5496" w:themeColor="accent1" w:themeShade="BF"/>
             <w:u w:val="none"/>
           </w:rPr>
@@ -47,20 +47,20 @@
       </w:hyperlink>
       <w:r>
         <w:rPr>
-          <w:rFonts w:ascii="Roboto" w:hAnsi="Roboto"/>
+          <w:rFonts w:asciiTheme="minorBidi" w:hAnsiTheme="minorBidi"/>
         </w:rPr>
         <w:t xml:space="preserve"> </w:t>
       </w:r>
       <w:r>
         <w:rPr>
-          <w:rFonts w:ascii="Roboto" w:hAnsi="Roboto"/>
+          <w:rFonts w:asciiTheme="minorBidi" w:hAnsiTheme="minorBidi"/>
           <w:color w:val="4C4D4F"/>
         </w:rPr>
         <w:t>•</w:t>
       </w:r>
       <w:r>
         <w:rPr>
-          <w:rFonts w:ascii="Roboto" w:hAnsi="Roboto"/>
+          <w:rFonts w:asciiTheme="minorBidi" w:hAnsiTheme="minorBidi"/>
           <w:color w:val="4B4C4E"/>
         </w:rPr>
         <w:t xml:space="preserve"> </w:t>
@@ -69,7 +69,7 @@
         <w:r>
           <w:rPr>
             <w:rStyle w:val="Hyperlink"/>
-            <w:rFonts w:ascii="Roboto" w:hAnsi="Roboto"/>
+            <w:rFonts w:asciiTheme="minorBidi" w:hAnsiTheme="minorBidi"/>
             <w:color w:val="2F5496" w:themeColor="accent1" w:themeShade="BF"/>
             <w:u w:val="none"/>
           </w:rPr>
@@ -78,21 +78,21 @@
       </w:hyperlink>
       <w:r>
         <w:rPr>
-          <w:rFonts w:ascii="Roboto" w:hAnsi="Roboto"/>
+          <w:rFonts w:asciiTheme="minorBidi" w:hAnsiTheme="minorBidi"/>
           <w:color w:val="4B4C4E"/>
         </w:rPr>
         <w:t xml:space="preserve"> </w:t>
       </w:r>
       <w:r>
         <w:rPr>
-          <w:rFonts w:ascii="Roboto" w:hAnsi="Roboto"/>
+          <w:rFonts w:asciiTheme="minorBidi" w:hAnsiTheme="minorBidi"/>
           <w:color w:val="4C4D4F"/>
         </w:rPr>
         <w:t>•</w:t>
       </w:r>
       <w:r>
         <w:rPr>
-          <w:rFonts w:ascii="Roboto" w:hAnsi="Roboto"/>
+          <w:rFonts w:asciiTheme="minorBidi" w:hAnsiTheme="minorBidi"/>
           <w:color w:val="4B4C4E"/>
         </w:rPr>
         <w:t xml:space="preserve"> </w:t>
@@ -101,7 +101,7 @@
         <w:r>
           <w:rPr>
             <w:rStyle w:val="Hyperlink"/>
-            <w:rFonts w:ascii="Roboto" w:hAnsi="Roboto"/>
+            <w:rFonts w:asciiTheme="minorBidi" w:hAnsiTheme="minorBidi"/>
             <w:color w:val="2F5496" w:themeColor="accent1" w:themeShade="BF"/>
             <w:u w:val="none"/>
           </w:rPr>
@@ -110,21 +110,21 @@
       </w:hyperlink>
       <w:r>
         <w:rPr>
-          <w:rFonts w:ascii="Roboto" w:hAnsi="Roboto"/>
+          <w:rFonts w:asciiTheme="minorBidi" w:hAnsiTheme="minorBidi"/>
           <w:color w:val="4B4C4E"/>
         </w:rPr>
         <w:t xml:space="preserve"> </w:t>
       </w:r>
       <w:r>
         <w:rPr>
-          <w:rFonts w:ascii="Roboto" w:hAnsi="Roboto"/>
+          <w:rFonts w:asciiTheme="minorBidi" w:hAnsiTheme="minorBidi"/>
           <w:color w:val="4C4D4F"/>
         </w:rPr>
         <w:t>•</w:t>
       </w:r>
       <w:r>
         <w:rPr>
-          <w:rFonts w:ascii="Roboto" w:hAnsi="Roboto"/>
+          <w:rFonts w:asciiTheme="minorBidi" w:hAnsiTheme="minorBidi"/>
           <w:color w:val="4B4C4E"/>
         </w:rPr>
         <w:t xml:space="preserve"> </w:t>
@@ -133,7 +133,7 @@
         <w:r>
           <w:rPr>
             <w:rStyle w:val="Hyperlink"/>
-            <w:rFonts w:ascii="Roboto" w:hAnsi="Roboto"/>
+            <w:rFonts w:asciiTheme="minorBidi" w:hAnsiTheme="minorBidi"/>
             <w:color w:val="2F5496" w:themeColor="accent1" w:themeShade="BF"/>
             <w:u w:val="none"/>
           </w:rPr>
@@ -2648,16 +2648,7 @@
           <w:sz w:val="20"/>
           <w:szCs w:val="20"/>
         </w:rPr>
-        <w:t xml:space="preserve">. </w:t>
-      </w:r>
-      <w:r>
-        <w:rPr>
-          <w:rFonts w:asciiTheme="minorBidi" w:hAnsiTheme="minorBidi"/>
-          <w:color w:val="4C4D4F"/>
-          <w:sz w:val="20"/>
-          <w:szCs w:val="20"/>
-        </w:rPr>
-        <w:t>“</w:t>
+        <w:t>. “</w:t>
       </w:r>
       <w:r>
         <w:rPr>
@@ -4192,11 +4183,9 @@
           <w:tab w:val="left" w:pos="1996"/>
         </w:tabs>
         <w:rPr>
-          <w:rFonts w:ascii="Roboto" w:hAnsi="Roboto"/>
-          <w:b/>
-          <w:bCs/>
-          <w:sz w:val="28"/>
-          <w:szCs w:val="28"/>
+          <w:rFonts w:asciiTheme="minorBidi" w:hAnsiTheme="minorBidi"/>
+          <w:sz w:val="2"/>
+          <w:szCs w:val="2"/>
           <w:lang w:bidi="fa-IR"/>
         </w:rPr>
       </w:pPr>
@@ -4759,8 +4748,11 @@
     </w:sdtPr>
     <w:sdtEndPr>
       <w:rPr>
+        <w:rFonts w:asciiTheme="minorBidi" w:hAnsiTheme="minorBidi"/>
         <w:noProof/>
         <w:color w:val="4C4D4F"/>
+        <w:sz w:val="20"/>
+        <w:szCs w:val="20"/>
       </w:rPr>
     </w:sdtEndPr>
     <w:sdtContent>
@@ -4769,62 +4761,86 @@
           <w:pStyle w:val="Footer"/>
           <w:jc w:val="right"/>
           <w:rPr>
+            <w:rFonts w:asciiTheme="minorBidi" w:hAnsiTheme="minorBidi"/>
             <w:color w:val="4C4D4F"/>
+            <w:sz w:val="20"/>
+            <w:szCs w:val="20"/>
           </w:rPr>
         </w:pPr>
         <w:r>
           <w:rPr>
+            <w:rFonts w:asciiTheme="minorBidi" w:hAnsiTheme="minorBidi"/>
             <w:color w:val="4C4D4F"/>
+            <w:sz w:val="20"/>
+            <w:szCs w:val="20"/>
           </w:rPr>
           <w:t xml:space="preserve">Omid Reza Heidari </w:t>
         </w:r>
         <w:r>
           <w:rPr>
-            <w:rFonts w:ascii="Roboto" w:hAnsi="Roboto"/>
+            <w:rFonts w:asciiTheme="minorBidi" w:hAnsiTheme="minorBidi"/>
             <w:b/>
             <w:bCs/>
             <w:color w:val="4C4D4F"/>
-            <w:sz w:val="28"/>
-            <w:szCs w:val="28"/>
+            <w:sz w:val="20"/>
+            <w:szCs w:val="20"/>
           </w:rPr>
           <w:t xml:space="preserve">• </w:t>
         </w:r>
         <w:r>
           <w:rPr>
+            <w:rFonts w:asciiTheme="minorBidi" w:hAnsiTheme="minorBidi"/>
             <w:color w:val="4C4D4F"/>
+            <w:sz w:val="20"/>
+            <w:szCs w:val="20"/>
           </w:rPr>
           <w:fldChar w:fldCharType="begin"/>
         </w:r>
         <w:r>
           <w:rPr>
+            <w:rFonts w:asciiTheme="minorBidi" w:hAnsiTheme="minorBidi"/>
             <w:color w:val="4C4D4F"/>
+            <w:sz w:val="20"/>
+            <w:szCs w:val="20"/>
           </w:rPr>
           <w:instrText xml:space="preserve"> PAGE   \* MERGEFORMAT </w:instrText>
         </w:r>
         <w:r>
           <w:rPr>
+            <w:rFonts w:asciiTheme="minorBidi" w:hAnsiTheme="minorBidi"/>
             <w:color w:val="4C4D4F"/>
+            <w:sz w:val="20"/>
+            <w:szCs w:val="20"/>
           </w:rPr>
           <w:fldChar w:fldCharType="separate"/>
         </w:r>
         <w:r>
           <w:rPr>
+            <w:rFonts w:asciiTheme="minorBidi" w:hAnsiTheme="minorBidi"/>
             <w:noProof/>
             <w:color w:val="4C4D4F"/>
+            <w:sz w:val="20"/>
+            <w:szCs w:val="20"/>
           </w:rPr>
           <w:t>2</w:t>
         </w:r>
         <w:r>
           <w:rPr>
+            <w:rFonts w:asciiTheme="minorBidi" w:hAnsiTheme="minorBidi"/>
             <w:noProof/>
             <w:color w:val="4C4D4F"/>
+            <w:sz w:val="20"/>
+            <w:szCs w:val="20"/>
           </w:rPr>
           <w:fldChar w:fldCharType="end"/>
         </w:r>
         <w:r>
           <w:rPr>
+            <w:rFonts w:asciiTheme="minorBidi" w:hAnsiTheme="minorBidi"/>
             <w:noProof/>
             <w:color w:val="4C4D4F"/>
+            <w:sz w:val="20"/>
+            <w:szCs w:val="20"/>
           </w:rPr>
           <w:t xml:space="preserve"> of 3</w:t>
         </w:r>

</xml_diff>

<commit_message>
Up-to-date the CV file
</commit_message>
<xml_diff>
--- a/docs/Omid Reza Heidari.docx
+++ b/docs/Omid Reza Heidari.docx
@@ -2825,7 +2825,17 @@
           <w:szCs w:val="20"/>
           <w:lang w:bidi="fa-IR"/>
         </w:rPr>
-        <w:t xml:space="preserve"> How to Setting Up Data Center in Banks</w:t>
+        <w:t xml:space="preserve"> </w:t>
+      </w:r>
+      <w:r>
+        <w:rPr>
+          <w:rFonts w:asciiTheme="minorBidi" w:hAnsiTheme="minorBidi"/>
+          <w:color w:val="4C4D4F"/>
+          <w:sz w:val="20"/>
+          <w:szCs w:val="20"/>
+          <w:lang w:bidi="fa-IR"/>
+        </w:rPr>
+        <w:t>How to set up a data center</w:t>
       </w:r>
     </w:p>
     <w:p>
@@ -2863,7 +2873,7 @@
           <w:sz w:val="20"/>
           <w:szCs w:val="20"/>
         </w:rPr>
-        <w:t>During the apprenticeship, I learned about physical attributes, setting up, and maintaining data centers in banks.</w:t>
+        <w:t>Investigating the process of setting data centers up in organizations</w:t>
       </w:r>
     </w:p>
     <w:p>
@@ -3038,46 +3048,98 @@
           <w:tab w:val="left" w:pos="1996"/>
         </w:tabs>
         <w:spacing w:line="240" w:lineRule="auto"/>
-        <w:rPr>
-          <w:rFonts w:asciiTheme="minorBidi" w:hAnsiTheme="minorBidi"/>
-          <w:color w:val="4C4D4F"/>
-          <w:sz w:val="20"/>
-          <w:szCs w:val="20"/>
-          <w:lang w:bidi="fa-IR"/>
-        </w:rPr>
-      </w:pPr>
-      <w:r>
-        <w:rPr>
-          <w:rFonts w:asciiTheme="minorBidi" w:hAnsiTheme="minorBidi"/>
-          <w:b/>
-          <w:bCs/>
-          <w:color w:val="4C4D4F"/>
-          <w:sz w:val="20"/>
-          <w:szCs w:val="20"/>
-          <w:lang w:bidi="fa-IR"/>
-        </w:rPr>
-        <w:tab/>
-        <w:t xml:space="preserve">Description: </w:t>
-      </w:r>
-      <w:r>
-        <w:rPr>
-          <w:rFonts w:asciiTheme="minorBidi" w:hAnsiTheme="minorBidi"/>
-          <w:color w:val="4C4D4F"/>
-          <w:sz w:val="20"/>
-          <w:szCs w:val="20"/>
-          <w:lang w:bidi="fa-IR"/>
-        </w:rPr>
-        <w:t>Bachelor Final Project</w:t>
-      </w:r>
-      <w:r>
-        <w:rPr>
-          <w:rFonts w:asciiTheme="minorBidi" w:hAnsiTheme="minorBidi"/>
+        <w:ind w:left="1996"/>
+        <w:rPr>
+          <w:rFonts w:asciiTheme="minorBidi" w:hAnsiTheme="minorBidi"/>
+          <w:color w:val="4C4D4F"/>
+          <w:sz w:val="20"/>
+          <w:szCs w:val="20"/>
+          <w:lang w:bidi="fa-IR"/>
+        </w:rPr>
+      </w:pPr>
+      <w:r>
+        <w:rPr>
+          <w:rFonts w:asciiTheme="minorBidi" w:hAnsiTheme="minorBidi"/>
+          <w:b/>
+          <w:bCs/>
+          <w:color w:val="4C4D4F"/>
+          <w:sz w:val="20"/>
+          <w:szCs w:val="20"/>
+          <w:lang w:bidi="fa-IR"/>
+        </w:rPr>
+        <w:t>Description:</w:t>
+      </w:r>
+      <w:r>
+        <w:rPr>
+          <w:rFonts w:asciiTheme="minorBidi" w:hAnsiTheme="minorBidi"/>
+          <w:b/>
+          <w:bCs/>
           <w:color w:val="4C4D4F"/>
           <w:sz w:val="20"/>
           <w:szCs w:val="20"/>
           <w:lang w:bidi="fa-IR"/>
         </w:rPr>
         <w:t xml:space="preserve"> </w:t>
+      </w:r>
+      <w:r>
+        <w:rPr>
+          <w:rFonts w:asciiTheme="minorBidi" w:hAnsiTheme="minorBidi"/>
+          <w:color w:val="4C4D4F"/>
+          <w:sz w:val="20"/>
+          <w:szCs w:val="20"/>
+          <w:lang w:bidi="fa-IR"/>
+        </w:rPr>
+        <w:t xml:space="preserve">The project has been developed on Laravel and Nuxt.js. It also </w:t>
+      </w:r>
+      <w:r>
+        <w:rPr>
+          <w:rFonts w:asciiTheme="minorBidi" w:hAnsiTheme="minorBidi"/>
+          <w:color w:val="4C4D4F"/>
+          <w:sz w:val="20"/>
+          <w:szCs w:val="20"/>
+          <w:lang w:bidi="fa-IR"/>
+        </w:rPr>
+        <w:t xml:space="preserve">includes </w:t>
+      </w:r>
+      <w:r>
+        <w:rPr>
+          <w:rFonts w:asciiTheme="minorBidi" w:hAnsiTheme="minorBidi"/>
+          <w:color w:val="4C4D4F"/>
+          <w:sz w:val="20"/>
+          <w:szCs w:val="20"/>
+          <w:lang w:bidi="fa-IR"/>
+        </w:rPr>
+        <w:t>a</w:t>
+      </w:r>
+      <w:r>
+        <w:rPr>
+          <w:rFonts w:asciiTheme="minorBidi" w:hAnsiTheme="minorBidi"/>
+          <w:color w:val="4C4D4F"/>
+          <w:sz w:val="20"/>
+          <w:szCs w:val="20"/>
+          <w:lang w:bidi="fa-IR"/>
+        </w:rPr>
+        <w:t xml:space="preserve"> </w:t>
+      </w:r>
+      <w:r>
+        <w:rPr>
+          <w:rFonts w:asciiTheme="minorBidi" w:hAnsiTheme="minorBidi"/>
+          <w:color w:val="4C4D4F"/>
+          <w:sz w:val="20"/>
+          <w:szCs w:val="20"/>
+          <w:lang w:bidi="fa-IR"/>
+        </w:rPr>
+        <w:t>collaborative</w:t>
+      </w:r>
+      <w:r>
+        <w:rPr>
+          <w:rFonts w:asciiTheme="minorBidi" w:hAnsiTheme="minorBidi"/>
+          <w:color w:val="4C4D4F"/>
+          <w:sz w:val="20"/>
+          <w:szCs w:val="20"/>
+          <w:lang w:bidi="fa-IR"/>
+        </w:rPr>
+        <w:t xml:space="preserve"> recommender system.</w:t>
       </w:r>
     </w:p>
     <w:p>
@@ -3257,7 +3319,17 @@
           <w:szCs w:val="20"/>
           <w:lang w:bidi="fa-IR"/>
         </w:rPr>
-        <w:t>: Participated in developing API</w:t>
+        <w:t xml:space="preserve">: </w:t>
+      </w:r>
+      <w:r>
+        <w:rPr>
+          <w:rFonts w:asciiTheme="minorBidi" w:hAnsiTheme="minorBidi"/>
+          <w:color w:val="4C4D4F"/>
+          <w:sz w:val="20"/>
+          <w:szCs w:val="20"/>
+          <w:lang w:bidi="fa-IR"/>
+        </w:rPr>
+        <w:t>Participated in API developing and ameliorating some web pages</w:t>
       </w:r>
     </w:p>
     <w:p>
@@ -3430,37 +3502,7 @@
           <w:szCs w:val="20"/>
           <w:lang w:bidi="fa-IR"/>
         </w:rPr>
-        <w:t>An</w:t>
-      </w:r>
-      <w:r>
-        <w:rPr>
-          <w:rFonts w:asciiTheme="minorBidi" w:hAnsiTheme="minorBidi"/>
-          <w:color w:val="4C4D4F"/>
-          <w:sz w:val="20"/>
-          <w:szCs w:val="20"/>
-          <w:lang w:bidi="fa-IR"/>
-        </w:rPr>
-        <w:t xml:space="preserve"> open-source </w:t>
-      </w:r>
-      <w:r>
-        <w:rPr>
-          <w:rFonts w:asciiTheme="minorBidi" w:hAnsiTheme="minorBidi"/>
-          <w:color w:val="4C4D4F"/>
-          <w:sz w:val="20"/>
-          <w:szCs w:val="20"/>
-          <w:lang w:bidi="fa-IR"/>
-        </w:rPr>
-        <w:t>tool</w:t>
-      </w:r>
-      <w:r>
-        <w:rPr>
-          <w:rFonts w:asciiTheme="minorBidi" w:hAnsiTheme="minorBidi"/>
-          <w:color w:val="4C4D4F"/>
-          <w:sz w:val="20"/>
-          <w:szCs w:val="20"/>
-          <w:lang w:bidi="fa-IR"/>
-        </w:rPr>
-        <w:t xml:space="preserve"> that helps database administrators to manage Redis servers</w:t>
+        <w:t>An open-source tool that assists database administrators in managing Redis servers</w:t>
       </w:r>
     </w:p>
     <w:p>

</xml_diff>

<commit_message>
Update the date of TA experience
</commit_message>
<xml_diff>
--- a/docs/Omid Reza Heidari.docx
+++ b/docs/Omid Reza Heidari.docx
@@ -1792,7 +1792,17 @@
           <w:szCs w:val="20"/>
           <w:lang w:bidi="fa-IR"/>
         </w:rPr>
-        <w:t>Present</w:t>
+        <w:t>Jan 202</w:t>
+      </w:r>
+      <w:r>
+        <w:rPr>
+          <w:rFonts w:asciiTheme="minorBidi" w:hAnsiTheme="minorBidi"/>
+          <w:color w:val="4C4D4F"/>
+          <w:sz w:val="20"/>
+          <w:szCs w:val="20"/>
+          <w:lang w:bidi="fa-IR"/>
+        </w:rPr>
+        <w:t>3</w:t>
       </w:r>
       <w:r>
         <w:rPr>

</xml_diff>

<commit_message>
update some dates and statuses
</commit_message>
<xml_diff>
--- a/docs/Omid Reza Heidari.docx
+++ b/docs/Omid Reza Heidari.docx
@@ -1792,7 +1792,17 @@
           <w:szCs w:val="20"/>
           <w:lang w:bidi="fa-IR"/>
         </w:rPr>
-        <w:t>Jan 202</w:t>
+        <w:t>Feb</w:t>
+      </w:r>
+      <w:r>
+        <w:rPr>
+          <w:rFonts w:asciiTheme="minorBidi" w:hAnsiTheme="minorBidi"/>
+          <w:color w:val="4C4D4F"/>
+          <w:sz w:val="20"/>
+          <w:szCs w:val="20"/>
+          <w:lang w:bidi="fa-IR"/>
+        </w:rPr>
+        <w:t xml:space="preserve"> 202</w:t>
       </w:r>
       <w:r>
         <w:rPr>
@@ -2552,56 +2562,103 @@
       <w:r>
         <w:rPr>
           <w:rFonts w:asciiTheme="minorBidi" w:hAnsiTheme="minorBidi"/>
-          <w:color w:val="4C4D4F"/>
-          <w:sz w:val="20"/>
-          <w:szCs w:val="20"/>
-        </w:rPr>
-        <w:t>OR Heidari, FN Yousefi,</w:t>
-      </w:r>
-      <w:r>
-        <w:rPr>
-          <w:rFonts w:asciiTheme="minorBidi" w:hAnsiTheme="minorBidi"/>
-          <w:color w:val="4C4D4F"/>
-          <w:sz w:val="20"/>
-          <w:szCs w:val="20"/>
-        </w:rPr>
-        <w:t xml:space="preserve"> MA Nitsche,</w:t>
-      </w:r>
-      <w:r>
-        <w:rPr>
-          <w:rFonts w:asciiTheme="minorBidi" w:hAnsiTheme="minorBidi"/>
-          <w:color w:val="4C4D4F"/>
-          <w:sz w:val="20"/>
-          <w:szCs w:val="20"/>
-        </w:rPr>
-        <w:t xml:space="preserve"> M Dadashi</w:t>
-      </w:r>
-      <w:r>
-        <w:rPr>
-          <w:rFonts w:asciiTheme="minorBidi" w:hAnsiTheme="minorBidi"/>
-          <w:color w:val="4C4D4F"/>
-          <w:sz w:val="20"/>
-          <w:szCs w:val="20"/>
+          <w:color w:val="4B4C4E"/>
+          <w:sz w:val="20"/>
+          <w:szCs w:val="20"/>
+          <w:lang w:bidi="fa-IR"/>
+        </w:rPr>
+        <w:t>OR Heidari</w:t>
+      </w:r>
+      <w:r>
+        <w:rPr>
+          <w:rFonts w:asciiTheme="minorBidi" w:hAnsiTheme="minorBidi"/>
+          <w:color w:val="4B4C4E"/>
+          <w:sz w:val="20"/>
+          <w:szCs w:val="20"/>
+          <w:lang w:bidi="fa-IR"/>
+        </w:rPr>
+        <w:t xml:space="preserve">, M Dadashi, </w:t>
+      </w:r>
+      <w:r>
+        <w:rPr>
+          <w:rFonts w:asciiTheme="minorBidi" w:hAnsiTheme="minorBidi"/>
+          <w:color w:val="4B4C4E"/>
+          <w:sz w:val="20"/>
+          <w:szCs w:val="20"/>
+          <w:lang w:bidi="fa-IR"/>
+        </w:rPr>
+        <w:t>M Maghbooli</w:t>
+      </w:r>
+      <w:r>
+        <w:rPr>
+          <w:rFonts w:asciiTheme="minorBidi" w:hAnsiTheme="minorBidi"/>
+          <w:color w:val="4B4C4E"/>
+          <w:sz w:val="20"/>
+          <w:szCs w:val="20"/>
+          <w:lang w:bidi="fa-IR"/>
         </w:rPr>
         <w:t>,</w:t>
       </w:r>
       <w:r>
-        <w:rPr>
-          <w:rFonts w:asciiTheme="minorBidi" w:hAnsiTheme="minorBidi"/>
-          <w:color w:val="4C4D4F"/>
-          <w:sz w:val="20"/>
-          <w:szCs w:val="20"/>
-        </w:rPr>
-        <w:t xml:space="preserve"> “</w:t>
-      </w:r>
-      <w:r>
-        <w:rPr>
-          <w:rFonts w:asciiTheme="minorBidi" w:hAnsiTheme="minorBidi"/>
-          <w:color w:val="4C4D4F"/>
-          <w:sz w:val="20"/>
-          <w:szCs w:val="20"/>
-        </w:rPr>
-        <w:t>Effectiveness of tDCS over the DLPFC on reducing clinical symptoms, improving working memory, and aberrant EEG functional connectivity in resting-state schizophrenia patients</w:t>
+        <w:t xml:space="preserve"> </w:t>
+      </w:r>
+      <w:r>
+        <w:rPr>
+          <w:rFonts w:asciiTheme="minorBidi" w:hAnsiTheme="minorBidi"/>
+          <w:color w:val="4B4C4E"/>
+          <w:sz w:val="20"/>
+          <w:szCs w:val="20"/>
+          <w:lang w:bidi="fa-IR"/>
+        </w:rPr>
+        <w:t>M Soltani</w:t>
+      </w:r>
+      <w:r>
+        <w:rPr>
+          <w:rFonts w:asciiTheme="minorBidi" w:hAnsiTheme="minorBidi"/>
+          <w:color w:val="4B4C4E"/>
+          <w:sz w:val="20"/>
+          <w:szCs w:val="20"/>
+          <w:lang w:bidi="fa-IR"/>
+        </w:rPr>
+        <w:t xml:space="preserve">, A </w:t>
+      </w:r>
+      <w:r>
+        <w:rPr>
+          <w:rFonts w:asciiTheme="minorBidi" w:hAnsiTheme="minorBidi"/>
+          <w:color w:val="4B4C4E"/>
+          <w:sz w:val="20"/>
+          <w:szCs w:val="20"/>
+          <w:lang w:bidi="fa-IR"/>
+        </w:rPr>
+        <w:t>Zakerian Zadeh</w:t>
+      </w:r>
+      <w:r>
+        <w:rPr>
+          <w:rFonts w:asciiTheme="minorBidi" w:hAnsiTheme="minorBidi"/>
+          <w:color w:val="4B4C4E"/>
+          <w:sz w:val="20"/>
+          <w:szCs w:val="20"/>
+          <w:lang w:bidi="fa-IR"/>
+        </w:rPr>
+        <w:t xml:space="preserve">, </w:t>
+      </w:r>
+      <w:r>
+        <w:rPr>
+          <w:rFonts w:asciiTheme="minorBidi" w:hAnsiTheme="minorBidi"/>
+          <w:color w:val="4C4D4F"/>
+          <w:sz w:val="20"/>
+          <w:szCs w:val="20"/>
+        </w:rPr>
+        <w:t>“</w:t>
+      </w:r>
+      <w:r>
+        <w:rPr>
+          <w:rFonts w:asciiTheme="minorBidi" w:hAnsiTheme="minorBidi"/>
+          <w:color w:val="4C4D4F"/>
+          <w:sz w:val="20"/>
+          <w:szCs w:val="20"/>
+        </w:rPr>
+        <w:t>Assessment of structural connectivity and brain volumes after tDCS in stroke: a machine-learning method</w:t>
       </w:r>
       <w:r>
         <w:rPr>
@@ -2611,31 +2668,6 @@
           <w:szCs w:val="20"/>
         </w:rPr>
         <w:t>”</w:t>
-      </w:r>
-    </w:p>
-    <w:p>
-      <w:pPr>
-        <w:rPr>
-          <w:rFonts w:asciiTheme="minorBidi" w:hAnsiTheme="minorBidi"/>
-          <w:b/>
-          <w:bCs/>
-          <w:color w:val="4B4C4E"/>
-          <w:sz w:val="20"/>
-          <w:szCs w:val="20"/>
-          <w:lang w:bidi="fa-IR"/>
-        </w:rPr>
-      </w:pPr>
-      <w:r>
-        <w:rPr>
-          <w:rFonts w:asciiTheme="minorBidi" w:hAnsiTheme="minorBidi"/>
-          <w:b/>
-          <w:bCs/>
-          <w:color w:val="4B4C4E"/>
-          <w:sz w:val="20"/>
-          <w:szCs w:val="20"/>
-          <w:lang w:bidi="fa-IR"/>
-        </w:rPr>
-        <w:t>Works in progress</w:t>
       </w:r>
     </w:p>
     <w:p>
@@ -2658,30 +2690,56 @@
       <w:r>
         <w:rPr>
           <w:rFonts w:asciiTheme="minorBidi" w:hAnsiTheme="minorBidi"/>
-          <w:color w:val="4B4C4E"/>
-          <w:sz w:val="20"/>
-          <w:szCs w:val="20"/>
-          <w:lang w:bidi="fa-IR"/>
-        </w:rPr>
-        <w:t xml:space="preserve">OR Heidari, M Dadashi, </w:t>
-      </w:r>
-      <w:r>
-        <w:rPr>
-          <w:rFonts w:asciiTheme="minorBidi" w:hAnsiTheme="minorBidi"/>
-          <w:color w:val="4C4D4F"/>
-          <w:sz w:val="20"/>
-          <w:szCs w:val="20"/>
-        </w:rPr>
-        <w:t>“</w:t>
-      </w:r>
-      <w:r>
-        <w:rPr>
-          <w:rFonts w:asciiTheme="minorBidi" w:hAnsiTheme="minorBidi"/>
-          <w:color w:val="4C4D4F"/>
-          <w:sz w:val="20"/>
-          <w:szCs w:val="20"/>
-        </w:rPr>
-        <w:t>Assessment of structural connectivity and brain volumes after tDCS in stroke: a machine-learning method</w:t>
+          <w:color w:val="4C4D4F"/>
+          <w:sz w:val="20"/>
+          <w:szCs w:val="20"/>
+        </w:rPr>
+        <w:t>OR Heidari, FN Yousefi,</w:t>
+      </w:r>
+      <w:r>
+        <w:rPr>
+          <w:rFonts w:asciiTheme="minorBidi" w:hAnsiTheme="minorBidi"/>
+          <w:color w:val="4C4D4F"/>
+          <w:sz w:val="20"/>
+          <w:szCs w:val="20"/>
+        </w:rPr>
+        <w:t xml:space="preserve"> MA Nitsche,</w:t>
+      </w:r>
+      <w:r>
+        <w:rPr>
+          <w:rFonts w:asciiTheme="minorBidi" w:hAnsiTheme="minorBidi"/>
+          <w:color w:val="4C4D4F"/>
+          <w:sz w:val="20"/>
+          <w:szCs w:val="20"/>
+        </w:rPr>
+        <w:t xml:space="preserve"> M Dadashi</w:t>
+      </w:r>
+      <w:r>
+        <w:rPr>
+          <w:rFonts w:asciiTheme="minorBidi" w:hAnsiTheme="minorBidi"/>
+          <w:color w:val="4C4D4F"/>
+          <w:sz w:val="20"/>
+          <w:szCs w:val="20"/>
+        </w:rPr>
+        <w:t>,</w:t>
+      </w:r>
+      <w:r>
+        <w:rPr>
+          <w:rFonts w:asciiTheme="minorBidi" w:hAnsiTheme="minorBidi"/>
+          <w:color w:val="4C4D4F"/>
+          <w:sz w:val="20"/>
+          <w:szCs w:val="20"/>
+        </w:rPr>
+        <w:t xml:space="preserve"> “</w:t>
+      </w:r>
+      <w:r>
+        <w:rPr>
+          <w:rFonts w:asciiTheme="minorBidi" w:hAnsiTheme="minorBidi"/>
+          <w:color w:val="4C4D4F"/>
+          <w:sz w:val="20"/>
+          <w:szCs w:val="20"/>
+        </w:rPr>
+        <w:t>Effectiveness of tDCS over the DLPFC on reducing clinical symptoms, improving working memory, and aberrant EEG functional connectivity in resting-state schizophrenia patients</w:t>
       </w:r>
       <w:r>
         <w:rPr>
@@ -3591,7 +3649,6 @@
           <w:color w:val="4C4D4F"/>
           <w:sz w:val="20"/>
           <w:szCs w:val="20"/>
-          <w:lang w:bidi="fa-IR"/>
         </w:rPr>
       </w:pPr>
       <w:r>
@@ -3902,6 +3959,21 @@
         </w:rPr>
         <w:t xml:space="preserve"> Basics of Wireless Networks (17)</w:t>
       </w:r>
+    </w:p>
+    <w:p>
+      <w:pPr>
+        <w:tabs>
+          <w:tab w:val="left" w:pos="5280"/>
+        </w:tabs>
+        <w:spacing w:line="276" w:lineRule="auto"/>
+        <w:rPr>
+          <w:rFonts w:asciiTheme="minorBidi" w:hAnsiTheme="minorBidi"/>
+          <w:color w:val="4C4D4F"/>
+          <w:sz w:val="2"/>
+          <w:szCs w:val="2"/>
+          <w:lang w:bidi="fa-IR"/>
+        </w:rPr>
+      </w:pPr>
     </w:p>
     <w:p>
       <w:pPr>

</xml_diff>

<commit_message>
update the end date of the current role
</commit_message>
<xml_diff>
--- a/docs/Omid Reza Heidari.docx
+++ b/docs/Omid Reza Heidari.docx
@@ -1048,17 +1048,27 @@
           <w:szCs w:val="20"/>
           <w:lang w:bidi="fa-IR"/>
         </w:rPr>
-        <w:t xml:space="preserve">- </w:t>
-      </w:r>
-      <w:r>
-        <w:rPr>
-          <w:rFonts w:asciiTheme="minorBidi" w:hAnsiTheme="minorBidi"/>
-          <w:color w:val="4C4D4F"/>
-          <w:sz w:val="20"/>
-          <w:szCs w:val="20"/>
-          <w:lang w:bidi="fa-IR"/>
-        </w:rPr>
-        <w:t>Present</w:t>
+        <w:t>–</w:t>
+      </w:r>
+      <w:r>
+        <w:rPr>
+          <w:rFonts w:asciiTheme="minorBidi" w:hAnsiTheme="minorBidi"/>
+          <w:color w:val="4C4D4F"/>
+          <w:sz w:val="20"/>
+          <w:szCs w:val="20"/>
+          <w:lang w:bidi="fa-IR"/>
+        </w:rPr>
+        <w:t xml:space="preserve"> </w:t>
+      </w:r>
+      <w:r>
+        <w:rPr>
+          <w:rFonts w:asciiTheme="minorBidi" w:hAnsiTheme="minorBidi"/>
+          <w:color w:val="4C4D4F"/>
+          <w:sz w:val="20"/>
+          <w:szCs w:val="20"/>
+          <w:lang w:bidi="fa-IR"/>
+        </w:rPr>
+        <w:t>Feb 2023</w:t>
       </w:r>
       <w:r>
         <w:rPr>

</xml_diff>